<commit_message>
Added 2 New Tests + Began Writing Test Section Of Report
- Added test invalidInputCheck which tests how CardGame deals with invalid and valid card pack inputs

- Added test playerDiscardDenominationCheck which checks that a player doesn't discard their preferred card type
</commit_message>
<xml_diff>
--- a/report.docx
+++ b/report.docx
@@ -96,7 +96,23 @@
           <w:sz w:val="22"/>
           <w:szCs w:val="22"/>
         </w:rPr>
-        <w:t xml:space="preserve">e.g. why we chose synchronize over </w:t>
+        <w:t xml:space="preserve">e.g. why we chose </w:t>
+      </w:r>
+      <w:proofErr w:type="gramStart"/>
+      <w:r>
+        <w:rPr>
+          <w:sz w:val="22"/>
+          <w:szCs w:val="22"/>
+        </w:rPr>
+        <w:t>synchronize</w:t>
+      </w:r>
+      <w:proofErr w:type="gramEnd"/>
+      <w:r>
+        <w:rPr>
+          <w:sz w:val="22"/>
+          <w:szCs w:val="22"/>
+        </w:rPr>
+        <w:t xml:space="preserve"> over </w:t>
       </w:r>
       <w:r>
         <w:rPr>
@@ -119,12 +135,14 @@
         <w:rPr>
           <w:sz w:val="28"/>
           <w:szCs w:val="28"/>
+          <w:u w:val="single"/>
         </w:rPr>
       </w:pPr>
       <w:r>
         <w:rPr>
           <w:sz w:val="28"/>
           <w:szCs w:val="28"/>
+          <w:u w:val="single"/>
         </w:rPr>
         <w:t xml:space="preserve">Design </w:t>
       </w:r>
@@ -132,6 +150,7 @@
         <w:rPr>
           <w:sz w:val="28"/>
           <w:szCs w:val="28"/>
+          <w:u w:val="single"/>
         </w:rPr>
         <w:t>and Limitations of the Testing Suite</w:t>
       </w:r>
@@ -139,23 +158,25 @@
     <w:p>
       <w:pPr>
         <w:rPr>
-          <w:sz w:val="22"/>
-          <w:szCs w:val="22"/>
-        </w:rPr>
-      </w:pPr>
-      <w:r>
-        <w:rPr>
-          <w:sz w:val="22"/>
-          <w:szCs w:val="22"/>
-        </w:rPr>
-        <w:t>[Testing</w:t>
-      </w:r>
-      <w:r>
-        <w:rPr>
-          <w:sz w:val="22"/>
-          <w:szCs w:val="22"/>
-        </w:rPr>
-        <w:t xml:space="preserve"> (J</w:t>
+          <w:b/>
+          <w:bCs/>
+          <w:sz w:val="22"/>
+          <w:szCs w:val="22"/>
+        </w:rPr>
+      </w:pPr>
+      <w:r>
+        <w:rPr>
+          <w:sz w:val="22"/>
+          <w:szCs w:val="22"/>
+        </w:rPr>
+        <w:t xml:space="preserve">The testing suite uses </w:t>
+      </w:r>
+      <w:r>
+        <w:rPr>
+          <w:sz w:val="22"/>
+          <w:szCs w:val="22"/>
+        </w:rPr>
+        <w:t>J</w:t>
       </w:r>
       <w:r>
         <w:rPr>
@@ -176,14 +197,531 @@
           <w:sz w:val="22"/>
           <w:szCs w:val="22"/>
         </w:rPr>
-        <w:t xml:space="preserve"> 4.3.2)</w:t>
-      </w:r>
-      <w:r>
-        <w:rPr>
-          <w:sz w:val="22"/>
-          <w:szCs w:val="22"/>
-        </w:rPr>
-        <w:t>]</w:t>
+        <w:t xml:space="preserve"> 4.</w:t>
+      </w:r>
+      <w:r>
+        <w:rPr>
+          <w:sz w:val="22"/>
+          <w:szCs w:val="22"/>
+        </w:rPr>
+        <w:t>1</w:t>
+      </w:r>
+      <w:r>
+        <w:rPr>
+          <w:sz w:val="22"/>
+          <w:szCs w:val="22"/>
+        </w:rPr>
+        <w:t>3.2</w:t>
+      </w:r>
+      <w:r>
+        <w:rPr>
+          <w:sz w:val="22"/>
+          <w:szCs w:val="22"/>
+        </w:rPr>
+        <w:br/>
+      </w:r>
+      <w:r>
+        <w:rPr>
+          <w:sz w:val="22"/>
+          <w:szCs w:val="22"/>
+        </w:rPr>
+        <w:br/>
+      </w:r>
+      <w:r>
+        <w:rPr>
+          <w:b/>
+          <w:bCs/>
+          <w:sz w:val="22"/>
+          <w:szCs w:val="22"/>
+        </w:rPr>
+        <w:t>Test Design</w:t>
+      </w:r>
+    </w:p>
+    <w:p>
+      <w:pPr>
+        <w:rPr>
+          <w:sz w:val="22"/>
+          <w:szCs w:val="22"/>
+        </w:rPr>
+      </w:pPr>
+      <w:r>
+        <w:rPr>
+          <w:sz w:val="22"/>
+          <w:szCs w:val="22"/>
+        </w:rPr>
+        <w:t>T</w:t>
+      </w:r>
+      <w:r>
+        <w:rPr>
+          <w:sz w:val="22"/>
+          <w:szCs w:val="22"/>
+        </w:rPr>
+        <w:t xml:space="preserve">he tests are designed to cover a </w:t>
+      </w:r>
+    </w:p>
+    <w:p>
+      <w:pPr>
+        <w:rPr>
+          <w:sz w:val="22"/>
+          <w:szCs w:val="22"/>
+        </w:rPr>
+      </w:pPr>
+    </w:p>
+    <w:p>
+      <w:pPr>
+        <w:rPr>
+          <w:sz w:val="22"/>
+          <w:szCs w:val="22"/>
+        </w:rPr>
+      </w:pPr>
+      <w:r>
+        <w:rPr>
+          <w:sz w:val="22"/>
+          <w:szCs w:val="22"/>
+        </w:rPr>
+        <w:t>Input Tests</w:t>
+      </w:r>
+      <w:r>
+        <w:rPr>
+          <w:sz w:val="22"/>
+          <w:szCs w:val="22"/>
+        </w:rPr>
+        <w:t>:</w:t>
+      </w:r>
+    </w:p>
+    <w:p>
+      <w:pPr>
+        <w:rPr>
+          <w:i/>
+          <w:iCs/>
+          <w:sz w:val="22"/>
+          <w:szCs w:val="22"/>
+        </w:rPr>
+      </w:pPr>
+      <w:r>
+        <w:rPr>
+          <w:i/>
+          <w:iCs/>
+          <w:sz w:val="22"/>
+          <w:szCs w:val="22"/>
+        </w:rPr>
+        <w:t>invalidInputCheck</w:t>
+      </w:r>
+    </w:p>
+    <w:p>
+      <w:pPr>
+        <w:rPr>
+          <w:i/>
+          <w:iCs/>
+          <w:sz w:val="22"/>
+          <w:szCs w:val="22"/>
+        </w:rPr>
+      </w:pPr>
+    </w:p>
+    <w:p>
+      <w:pPr>
+        <w:rPr>
+          <w:sz w:val="22"/>
+          <w:szCs w:val="22"/>
+        </w:rPr>
+      </w:pPr>
+      <w:r>
+        <w:rPr>
+          <w:sz w:val="22"/>
+          <w:szCs w:val="22"/>
+        </w:rPr>
+        <w:t>Player Unit Tests</w:t>
+      </w:r>
+    </w:p>
+    <w:p>
+      <w:pPr>
+        <w:rPr>
+          <w:i/>
+          <w:iCs/>
+          <w:sz w:val="22"/>
+          <w:szCs w:val="22"/>
+        </w:rPr>
+      </w:pPr>
+      <w:r>
+        <w:rPr>
+          <w:i/>
+          <w:iCs/>
+          <w:sz w:val="22"/>
+          <w:szCs w:val="22"/>
+        </w:rPr>
+        <w:t>playerInitialisedCheck</w:t>
+      </w:r>
+      <w:r>
+        <w:rPr>
+          <w:i/>
+          <w:iCs/>
+          <w:sz w:val="22"/>
+          <w:szCs w:val="22"/>
+        </w:rPr>
+        <w:t xml:space="preserve">, </w:t>
+      </w:r>
+      <w:r>
+        <w:rPr>
+          <w:i/>
+          <w:iCs/>
+          <w:sz w:val="22"/>
+          <w:szCs w:val="22"/>
+        </w:rPr>
+        <w:t>playerStartingHandsCheck</w:t>
+      </w:r>
+    </w:p>
+    <w:p>
+      <w:pPr>
+        <w:rPr>
+          <w:i/>
+          <w:iCs/>
+          <w:sz w:val="22"/>
+          <w:szCs w:val="22"/>
+        </w:rPr>
+      </w:pPr>
+    </w:p>
+    <w:p>
+      <w:pPr>
+        <w:rPr>
+          <w:sz w:val="22"/>
+          <w:szCs w:val="22"/>
+        </w:rPr>
+      </w:pPr>
+      <w:proofErr w:type="spellStart"/>
+      <w:r>
+        <w:rPr>
+          <w:sz w:val="22"/>
+          <w:szCs w:val="22"/>
+        </w:rPr>
+        <w:t>CardDeck</w:t>
+      </w:r>
+      <w:proofErr w:type="spellEnd"/>
+      <w:r>
+        <w:rPr>
+          <w:sz w:val="22"/>
+          <w:szCs w:val="22"/>
+        </w:rPr>
+        <w:t xml:space="preserve"> Unit Tests</w:t>
+      </w:r>
+    </w:p>
+    <w:p>
+      <w:pPr>
+        <w:rPr>
+          <w:i/>
+          <w:iCs/>
+          <w:sz w:val="22"/>
+          <w:szCs w:val="22"/>
+        </w:rPr>
+      </w:pPr>
+      <w:r>
+        <w:rPr>
+          <w:i/>
+          <w:iCs/>
+          <w:sz w:val="22"/>
+          <w:szCs w:val="22"/>
+        </w:rPr>
+        <w:t>deckInitialisedCheck</w:t>
+      </w:r>
+      <w:r>
+        <w:rPr>
+          <w:i/>
+          <w:iCs/>
+          <w:sz w:val="22"/>
+          <w:szCs w:val="22"/>
+        </w:rPr>
+        <w:t xml:space="preserve">, </w:t>
+      </w:r>
+      <w:r>
+        <w:rPr>
+          <w:i/>
+          <w:iCs/>
+          <w:sz w:val="22"/>
+          <w:szCs w:val="22"/>
+        </w:rPr>
+        <w:t>deckStartingCardsCheck</w:t>
+      </w:r>
+      <w:r>
+        <w:rPr>
+          <w:i/>
+          <w:iCs/>
+          <w:sz w:val="22"/>
+          <w:szCs w:val="22"/>
+        </w:rPr>
+        <w:t xml:space="preserve">, </w:t>
+      </w:r>
+      <w:r>
+        <w:rPr>
+          <w:i/>
+          <w:iCs/>
+          <w:sz w:val="22"/>
+          <w:szCs w:val="22"/>
+        </w:rPr>
+        <w:t>cardDeckDrawCardCheck</w:t>
+      </w:r>
+      <w:r>
+        <w:rPr>
+          <w:i/>
+          <w:iCs/>
+          <w:sz w:val="22"/>
+          <w:szCs w:val="22"/>
+        </w:rPr>
+        <w:t xml:space="preserve">, </w:t>
+      </w:r>
+      <w:r>
+        <w:rPr>
+          <w:i/>
+          <w:iCs/>
+          <w:sz w:val="22"/>
+          <w:szCs w:val="22"/>
+        </w:rPr>
+        <w:t>cardDeckDiscardCardCheck</w:t>
+      </w:r>
+      <w:r>
+        <w:rPr>
+          <w:i/>
+          <w:iCs/>
+          <w:sz w:val="22"/>
+          <w:szCs w:val="22"/>
+        </w:rPr>
+        <w:t xml:space="preserve">, </w:t>
+      </w:r>
+      <w:r>
+        <w:rPr>
+          <w:i/>
+          <w:iCs/>
+          <w:sz w:val="22"/>
+          <w:szCs w:val="22"/>
+        </w:rPr>
+        <w:t>cardDeckFIFOOrderingCheck</w:t>
+      </w:r>
+    </w:p>
+    <w:p>
+      <w:pPr>
+        <w:rPr>
+          <w:sz w:val="22"/>
+          <w:szCs w:val="22"/>
+        </w:rPr>
+      </w:pPr>
+    </w:p>
+    <w:p>
+      <w:pPr>
+        <w:rPr>
+          <w:i/>
+          <w:iCs/>
+          <w:sz w:val="22"/>
+          <w:szCs w:val="22"/>
+        </w:rPr>
+      </w:pPr>
+      <w:r>
+        <w:rPr>
+          <w:i/>
+          <w:iCs/>
+          <w:sz w:val="22"/>
+          <w:szCs w:val="22"/>
+        </w:rPr>
+        <w:t>System</w:t>
+      </w:r>
+      <w:r>
+        <w:rPr>
+          <w:i/>
+          <w:iCs/>
+          <w:sz w:val="22"/>
+          <w:szCs w:val="22"/>
+        </w:rPr>
+        <w:t xml:space="preserve"> and Integration</w:t>
+      </w:r>
+      <w:r>
+        <w:rPr>
+          <w:i/>
+          <w:iCs/>
+          <w:sz w:val="22"/>
+          <w:szCs w:val="22"/>
+        </w:rPr>
+        <w:t xml:space="preserve"> Test</w:t>
+      </w:r>
+      <w:r>
+        <w:rPr>
+          <w:i/>
+          <w:iCs/>
+          <w:sz w:val="22"/>
+          <w:szCs w:val="22"/>
+        </w:rPr>
+        <w:t>s</w:t>
+      </w:r>
+    </w:p>
+    <w:p>
+      <w:pPr>
+        <w:rPr>
+          <w:i/>
+          <w:iCs/>
+          <w:sz w:val="22"/>
+          <w:szCs w:val="22"/>
+        </w:rPr>
+      </w:pPr>
+      <w:r>
+        <w:rPr>
+          <w:i/>
+          <w:iCs/>
+          <w:sz w:val="22"/>
+          <w:szCs w:val="22"/>
+        </w:rPr>
+        <w:t>winningPlayerEndingHandCheck</w:t>
+      </w:r>
+      <w:r>
+        <w:rPr>
+          <w:i/>
+          <w:iCs/>
+          <w:sz w:val="22"/>
+          <w:szCs w:val="22"/>
+        </w:rPr>
+        <w:t xml:space="preserve">, </w:t>
+      </w:r>
+      <w:r>
+        <w:rPr>
+          <w:i/>
+          <w:iCs/>
+          <w:sz w:val="22"/>
+          <w:szCs w:val="22"/>
+        </w:rPr>
+        <w:t>cardStabilityCheck</w:t>
+      </w:r>
+      <w:r>
+        <w:rPr>
+          <w:i/>
+          <w:iCs/>
+          <w:sz w:val="22"/>
+          <w:szCs w:val="22"/>
+        </w:rPr>
+        <w:t xml:space="preserve">, </w:t>
+      </w:r>
+      <w:r>
+        <w:rPr>
+          <w:i/>
+          <w:iCs/>
+          <w:sz w:val="22"/>
+          <w:szCs w:val="22"/>
+        </w:rPr>
+        <w:t>playerThreadsTerminatedCheck</w:t>
+      </w:r>
+      <w:r>
+        <w:rPr>
+          <w:i/>
+          <w:iCs/>
+          <w:sz w:val="22"/>
+          <w:szCs w:val="22"/>
+        </w:rPr>
+        <w:t xml:space="preserve">, </w:t>
+      </w:r>
+      <w:r>
+        <w:rPr>
+          <w:i/>
+          <w:iCs/>
+          <w:sz w:val="22"/>
+          <w:szCs w:val="22"/>
+        </w:rPr>
+        <w:t>playerOutputFileContentsCheck</w:t>
+      </w:r>
+      <w:r>
+        <w:rPr>
+          <w:i/>
+          <w:iCs/>
+          <w:sz w:val="22"/>
+          <w:szCs w:val="22"/>
+        </w:rPr>
+        <w:t xml:space="preserve">, </w:t>
+      </w:r>
+      <w:r>
+        <w:rPr>
+          <w:i/>
+          <w:iCs/>
+          <w:sz w:val="22"/>
+          <w:szCs w:val="22"/>
+        </w:rPr>
+        <w:t>playerDiscardDenominationCheck</w:t>
+      </w:r>
+    </w:p>
+    <w:p>
+      <w:pPr>
+        <w:rPr>
+          <w:sz w:val="22"/>
+          <w:szCs w:val="22"/>
+        </w:rPr>
+      </w:pPr>
+    </w:p>
+    <w:p>
+      <w:pPr>
+        <w:rPr>
+          <w:b/>
+          <w:bCs/>
+          <w:sz w:val="22"/>
+          <w:szCs w:val="22"/>
+        </w:rPr>
+      </w:pPr>
+      <w:r>
+        <w:rPr>
+          <w:b/>
+          <w:bCs/>
+          <w:sz w:val="22"/>
+          <w:szCs w:val="22"/>
+        </w:rPr>
+        <w:t>T</w:t>
+      </w:r>
+      <w:r>
+        <w:rPr>
+          <w:b/>
+          <w:bCs/>
+          <w:sz w:val="22"/>
+          <w:szCs w:val="22"/>
+        </w:rPr>
+        <w:t>esting</w:t>
+      </w:r>
+      <w:r>
+        <w:rPr>
+          <w:b/>
+          <w:bCs/>
+          <w:sz w:val="22"/>
+          <w:szCs w:val="22"/>
+        </w:rPr>
+        <w:t xml:space="preserve"> Limitations</w:t>
+      </w:r>
+    </w:p>
+    <w:p>
+      <w:pPr>
+        <w:rPr>
+          <w:sz w:val="22"/>
+          <w:szCs w:val="22"/>
+        </w:rPr>
+      </w:pPr>
+      <w:r>
+        <w:rPr>
+          <w:sz w:val="22"/>
+          <w:szCs w:val="22"/>
+        </w:rPr>
+        <w:t>The</w:t>
+      </w:r>
+    </w:p>
+    <w:p>
+      <w:pPr>
+        <w:rPr>
+          <w:sz w:val="22"/>
+          <w:szCs w:val="22"/>
+        </w:rPr>
+      </w:pPr>
+    </w:p>
+    <w:p>
+      <w:pPr>
+        <w:rPr>
+          <w:sz w:val="22"/>
+          <w:szCs w:val="22"/>
+        </w:rPr>
+      </w:pPr>
+      <w:r>
+        <w:rPr>
+          <w:sz w:val="22"/>
+          <w:szCs w:val="22"/>
+        </w:rPr>
+        <w:lastRenderedPageBreak/>
+        <w:t>Tests of entire game time out after 5 seconds</w:t>
       </w:r>
     </w:p>
     <w:p>
@@ -199,12 +737,14 @@
         <w:rPr>
           <w:sz w:val="28"/>
           <w:szCs w:val="28"/>
+          <w:u w:val="single"/>
         </w:rPr>
       </w:pPr>
       <w:r>
         <w:rPr>
           <w:sz w:val="28"/>
           <w:szCs w:val="28"/>
+          <w:u w:val="single"/>
         </w:rPr>
         <w:t>De</w:t>
       </w:r>
@@ -212,6 +752,7 @@
         <w:rPr>
           <w:sz w:val="28"/>
           <w:szCs w:val="28"/>
+          <w:u w:val="single"/>
         </w:rPr>
         <w:t>velopment</w:t>
       </w:r>
@@ -219,6 +760,7 @@
         <w:rPr>
           <w:sz w:val="28"/>
           <w:szCs w:val="28"/>
+          <w:u w:val="single"/>
         </w:rPr>
         <w:t xml:space="preserve"> Process and Pair-Programming</w:t>
       </w:r>
@@ -226,6 +768,7 @@
         <w:rPr>
           <w:sz w:val="28"/>
           <w:szCs w:val="28"/>
+          <w:u w:val="single"/>
         </w:rPr>
         <w:t xml:space="preserve"> Record</w:t>
       </w:r>
@@ -242,14 +785,7 @@
           <w:sz w:val="22"/>
           <w:szCs w:val="22"/>
         </w:rPr>
-        <w:t>[</w:t>
-      </w:r>
-      <w:r>
-        <w:rPr>
-          <w:sz w:val="22"/>
-          <w:szCs w:val="22"/>
-        </w:rPr>
-        <w:t>Text]</w:t>
+        <w:t>[Text]</w:t>
       </w:r>
     </w:p>
     <w:p>
@@ -268,6 +804,126 @@
     </w:sectPr>
   </w:body>
 </w:document>
+</file>
+
+<file path=word/numbering.xml><?xml version="1.0" encoding="utf-8"?>
+<w:numbering xmlns:wpc="http://schemas.microsoft.com/office/word/2010/wordprocessingCanvas" xmlns:cx="http://schemas.microsoft.com/office/drawing/2014/chartex" xmlns:cx1="http://schemas.microsoft.com/office/drawing/2015/9/8/chartex" xmlns:cx2="http://schemas.microsoft.com/office/drawing/2015/10/21/chartex" xmlns:cx3="http://schemas.microsoft.com/office/drawing/2016/5/9/chartex" xmlns:cx4="http://schemas.microsoft.com/office/drawing/2016/5/10/chartex" xmlns:cx5="http://schemas.microsoft.com/office/drawing/2016/5/11/chartex" xmlns:cx6="http://schemas.microsoft.com/office/drawing/2016/5/12/chartex" xmlns:cx7="http://schemas.microsoft.com/office/drawing/2016/5/13/chartex" xmlns:cx8="http://schemas.microsoft.com/office/drawing/2016/5/14/chartex" xmlns:mc="http://schemas.openxmlformats.org/markup-compatibility/2006" xmlns:aink="http://schemas.microsoft.com/office/drawing/2016/ink" xmlns:am3d="http://schemas.microsoft.com/office/drawing/2017/model3d" xmlns:o="urn:schemas-microsoft-com:office:office" xmlns:oel="http://schemas.microsoft.com/office/2019/extlst" xmlns:r="http://schemas.openxmlformats.org/officeDocument/2006/relationships" xmlns:m="http://schemas.openxmlformats.org/officeDocument/2006/math" xmlns:v="urn:schemas-microsoft-com:vml" xmlns:wp14="http://schemas.microsoft.com/office/word/2010/wordprocessingDrawing" xmlns:wp="http://schemas.openxmlformats.org/drawingml/2006/wordprocessingDrawing" xmlns:w10="urn:schemas-microsoft-com:office:word" xmlns:w="http://schemas.openxmlformats.org/wordprocessingml/2006/main" xmlns:w14="http://schemas.microsoft.com/office/word/2010/wordml" xmlns:w15="http://schemas.microsoft.com/office/word/2012/wordml" xmlns:w16cex="http://schemas.microsoft.com/office/word/2018/wordml/cex" xmlns:w16cid="http://schemas.microsoft.com/office/word/2016/wordml/cid" xmlns:w16="http://schemas.microsoft.com/office/word/2018/wordml" xmlns:w16du="http://schemas.microsoft.com/office/word/2023/wordml/word16du" xmlns:w16sdtdh="http://schemas.microsoft.com/office/word/2020/wordml/sdtdatahash" xmlns:w16sdtfl="http://schemas.microsoft.com/office/word/2024/wordml/sdtformatlock" xmlns:w16se="http://schemas.microsoft.com/office/word/2015/wordml/symex" xmlns:wpg="http://schemas.microsoft.com/office/word/2010/wordprocessingGroup" xmlns:wpi="http://schemas.microsoft.com/office/word/2010/wordprocessingInk" xmlns:wne="http://schemas.microsoft.com/office/word/2006/wordml" xmlns:wps="http://schemas.microsoft.com/office/word/2010/wordprocessingShape" mc:Ignorable="w14 w15 w16se w16cid w16 w16cex w16sdtdh w16sdtfl w16du wp14">
+  <w:abstractNum w:abstractNumId="0" w15:restartNumberingAfterBreak="0">
+    <w:nsid w:val="021C21C8"/>
+    <w:multiLevelType w:val="hybridMultilevel"/>
+    <w:tmpl w:val="10F63492"/>
+    <w:lvl w:ilvl="0" w:tplc="5246DBDC">
+      <w:numFmt w:val="bullet"/>
+      <w:lvlText w:val="-"/>
+      <w:lvlJc w:val="left"/>
+      <w:pPr>
+        <w:ind w:left="720" w:hanging="360"/>
+      </w:pPr>
+      <w:rPr>
+        <w:rFonts w:ascii="Aptos" w:eastAsiaTheme="minorEastAsia" w:hAnsi="Aptos" w:cstheme="minorBidi" w:hint="default"/>
+      </w:rPr>
+    </w:lvl>
+    <w:lvl w:ilvl="1" w:tplc="08090003">
+      <w:start w:val="1"/>
+      <w:numFmt w:val="bullet"/>
+      <w:lvlText w:val="o"/>
+      <w:lvlJc w:val="left"/>
+      <w:pPr>
+        <w:ind w:left="1440" w:hanging="360"/>
+      </w:pPr>
+      <w:rPr>
+        <w:rFonts w:ascii="Courier New" w:hAnsi="Courier New" w:cs="Courier New" w:hint="default"/>
+      </w:rPr>
+    </w:lvl>
+    <w:lvl w:ilvl="2" w:tplc="08090005" w:tentative="1">
+      <w:start w:val="1"/>
+      <w:numFmt w:val="bullet"/>
+      <w:lvlText w:val=""/>
+      <w:lvlJc w:val="left"/>
+      <w:pPr>
+        <w:ind w:left="2160" w:hanging="360"/>
+      </w:pPr>
+      <w:rPr>
+        <w:rFonts w:ascii="Wingdings" w:hAnsi="Wingdings" w:hint="default"/>
+      </w:rPr>
+    </w:lvl>
+    <w:lvl w:ilvl="3" w:tplc="08090001" w:tentative="1">
+      <w:start w:val="1"/>
+      <w:numFmt w:val="bullet"/>
+      <w:lvlText w:val=""/>
+      <w:lvlJc w:val="left"/>
+      <w:pPr>
+        <w:ind w:left="2880" w:hanging="360"/>
+      </w:pPr>
+      <w:rPr>
+        <w:rFonts w:ascii="Symbol" w:hAnsi="Symbol" w:hint="default"/>
+      </w:rPr>
+    </w:lvl>
+    <w:lvl w:ilvl="4" w:tplc="08090003" w:tentative="1">
+      <w:start w:val="1"/>
+      <w:numFmt w:val="bullet"/>
+      <w:lvlText w:val="o"/>
+      <w:lvlJc w:val="left"/>
+      <w:pPr>
+        <w:ind w:left="3600" w:hanging="360"/>
+      </w:pPr>
+      <w:rPr>
+        <w:rFonts w:ascii="Courier New" w:hAnsi="Courier New" w:cs="Courier New" w:hint="default"/>
+      </w:rPr>
+    </w:lvl>
+    <w:lvl w:ilvl="5" w:tplc="08090005" w:tentative="1">
+      <w:start w:val="1"/>
+      <w:numFmt w:val="bullet"/>
+      <w:lvlText w:val=""/>
+      <w:lvlJc w:val="left"/>
+      <w:pPr>
+        <w:ind w:left="4320" w:hanging="360"/>
+      </w:pPr>
+      <w:rPr>
+        <w:rFonts w:ascii="Wingdings" w:hAnsi="Wingdings" w:hint="default"/>
+      </w:rPr>
+    </w:lvl>
+    <w:lvl w:ilvl="6" w:tplc="08090001" w:tentative="1">
+      <w:start w:val="1"/>
+      <w:numFmt w:val="bullet"/>
+      <w:lvlText w:val=""/>
+      <w:lvlJc w:val="left"/>
+      <w:pPr>
+        <w:ind w:left="5040" w:hanging="360"/>
+      </w:pPr>
+      <w:rPr>
+        <w:rFonts w:ascii="Symbol" w:hAnsi="Symbol" w:hint="default"/>
+      </w:rPr>
+    </w:lvl>
+    <w:lvl w:ilvl="7" w:tplc="08090003" w:tentative="1">
+      <w:start w:val="1"/>
+      <w:numFmt w:val="bullet"/>
+      <w:lvlText w:val="o"/>
+      <w:lvlJc w:val="left"/>
+      <w:pPr>
+        <w:ind w:left="5760" w:hanging="360"/>
+      </w:pPr>
+      <w:rPr>
+        <w:rFonts w:ascii="Courier New" w:hAnsi="Courier New" w:cs="Courier New" w:hint="default"/>
+      </w:rPr>
+    </w:lvl>
+    <w:lvl w:ilvl="8" w:tplc="08090005" w:tentative="1">
+      <w:start w:val="1"/>
+      <w:numFmt w:val="bullet"/>
+      <w:lvlText w:val=""/>
+      <w:lvlJc w:val="left"/>
+      <w:pPr>
+        <w:ind w:left="6480" w:hanging="360"/>
+      </w:pPr>
+      <w:rPr>
+        <w:rFonts w:ascii="Wingdings" w:hAnsi="Wingdings" w:hint="default"/>
+      </w:rPr>
+    </w:lvl>
+  </w:abstractNum>
+  <w:num w:numId="1" w16cid:durableId="86998392">
+    <w:abstractNumId w:val="0"/>
+  </w:num>
+</w:numbering>
 </file>
 
 <file path=word/styles.xml><?xml version="1.0" encoding="utf-8"?>
@@ -873,7 +1529,6 @@
   <w:style w:type="character" w:default="1" w:styleId="DefaultParagraphFont">
     <w:name w:val="Default Paragraph Font"/>
     <w:uiPriority w:val="1"/>
-    <w:semiHidden/>
     <w:unhideWhenUsed/>
   </w:style>
   <w:style w:type="table" w:default="1" w:styleId="TableNormal">

</xml_diff>

<commit_message>
Updated Test Names + Added More To Report Document
- Updated some test names to make them clearer about what they are testing

- Added more to the testing section of the report document
</commit_message>
<xml_diff>
--- a/report.docx
+++ b/report.docx
@@ -96,23 +96,7 @@
           <w:sz w:val="22"/>
           <w:szCs w:val="22"/>
         </w:rPr>
-        <w:t xml:space="preserve">e.g. why we chose </w:t>
-      </w:r>
-      <w:proofErr w:type="gramStart"/>
-      <w:r>
-        <w:rPr>
-          <w:sz w:val="22"/>
-          <w:szCs w:val="22"/>
-        </w:rPr>
-        <w:t>synchronize</w:t>
-      </w:r>
-      <w:proofErr w:type="gramEnd"/>
-      <w:r>
-        <w:rPr>
-          <w:sz w:val="22"/>
-          <w:szCs w:val="22"/>
-        </w:rPr>
-        <w:t xml:space="preserve"> over </w:t>
+        <w:t xml:space="preserve">e.g. why we chose synchronize over </w:t>
       </w:r>
       <w:r>
         <w:rPr>
@@ -197,21 +181,21 @@
           <w:sz w:val="22"/>
           <w:szCs w:val="22"/>
         </w:rPr>
-        <w:t xml:space="preserve"> 4.</w:t>
-      </w:r>
-      <w:r>
-        <w:rPr>
-          <w:sz w:val="22"/>
-          <w:szCs w:val="22"/>
-        </w:rPr>
-        <w:t>1</w:t>
-      </w:r>
-      <w:r>
-        <w:rPr>
-          <w:sz w:val="22"/>
-          <w:szCs w:val="22"/>
-        </w:rPr>
-        <w:t>3.2</w:t>
+        <w:t xml:space="preserve"> </w:t>
+      </w:r>
+      <w:r>
+        <w:rPr>
+          <w:sz w:val="22"/>
+          <w:szCs w:val="22"/>
+        </w:rPr>
+        <w:t xml:space="preserve">5 (Version </w:t>
+      </w:r>
+      <w:r>
+        <w:rPr>
+          <w:sz w:val="22"/>
+          <w:szCs w:val="22"/>
+        </w:rPr>
+        <w:t>6.1.3)</w:t>
       </w:r>
       <w:r>
         <w:rPr>
@@ -256,48 +240,97 @@
           <w:sz w:val="22"/>
           <w:szCs w:val="22"/>
         </w:rPr>
-        <w:t xml:space="preserve">he tests are designed to cover a </w:t>
-      </w:r>
-    </w:p>
-    <w:p>
-      <w:pPr>
-        <w:rPr>
-          <w:sz w:val="22"/>
-          <w:szCs w:val="22"/>
-        </w:rPr>
-      </w:pPr>
-    </w:p>
-    <w:p>
-      <w:pPr>
-        <w:rPr>
-          <w:sz w:val="22"/>
-          <w:szCs w:val="22"/>
-        </w:rPr>
-      </w:pPr>
-      <w:r>
-        <w:rPr>
+        <w:t xml:space="preserve">he tests are designed to cover </w:t>
+      </w:r>
+      <w:r>
+        <w:rPr>
+          <w:sz w:val="22"/>
+          <w:szCs w:val="22"/>
+        </w:rPr>
+        <w:t xml:space="preserve">a range of different </w:t>
+      </w:r>
+      <w:r>
+        <w:rPr>
+          <w:sz w:val="22"/>
+          <w:szCs w:val="22"/>
+        </w:rPr>
+        <w:t xml:space="preserve">expected </w:t>
+      </w:r>
+      <w:r>
+        <w:rPr>
+          <w:sz w:val="22"/>
+          <w:szCs w:val="22"/>
+        </w:rPr>
+        <w:t xml:space="preserve">scenarios as well as </w:t>
+      </w:r>
+      <w:r>
+        <w:rPr>
+          <w:sz w:val="22"/>
+          <w:szCs w:val="22"/>
+        </w:rPr>
+        <w:t>how different functions deal with invalid input [rewrite]</w:t>
+      </w:r>
+    </w:p>
+    <w:p>
+      <w:pPr>
+        <w:rPr>
+          <w:sz w:val="22"/>
+          <w:szCs w:val="22"/>
+        </w:rPr>
+      </w:pPr>
+    </w:p>
+    <w:p>
+      <w:pPr>
+        <w:rPr>
+          <w:b/>
+          <w:bCs/>
+          <w:sz w:val="22"/>
+          <w:szCs w:val="22"/>
+        </w:rPr>
+      </w:pPr>
+      <w:r>
+        <w:rPr>
+          <w:b/>
+          <w:bCs/>
+          <w:sz w:val="22"/>
+          <w:szCs w:val="22"/>
+        </w:rPr>
+        <w:t xml:space="preserve">CardGame Class </w:t>
+      </w:r>
+      <w:r>
+        <w:rPr>
+          <w:b/>
+          <w:bCs/>
           <w:sz w:val="22"/>
           <w:szCs w:val="22"/>
         </w:rPr>
         <w:t>Input Tests</w:t>
       </w:r>
-      <w:r>
-        <w:rPr>
-          <w:sz w:val="22"/>
-          <w:szCs w:val="22"/>
-        </w:rPr>
-        <w:t>:</w:t>
-      </w:r>
-    </w:p>
-    <w:p>
-      <w:pPr>
+    </w:p>
+    <w:p>
+      <w:pPr>
+        <w:rPr>
+          <w:sz w:val="22"/>
+          <w:szCs w:val="22"/>
+        </w:rPr>
+      </w:pPr>
+      <w:r>
+        <w:rPr>
+          <w:sz w:val="22"/>
+          <w:szCs w:val="22"/>
+        </w:rPr>
+        <w:t xml:space="preserve">The </w:t>
+      </w:r>
+      <w:r>
         <w:rPr>
           <w:i/>
           <w:iCs/>
           <w:sz w:val="22"/>
           <w:szCs w:val="22"/>
-        </w:rPr>
-      </w:pPr>
+          <w:u w:val="single"/>
+        </w:rPr>
+        <w:t>testCardGameReadPack</w:t>
+      </w:r>
       <w:r>
         <w:rPr>
           <w:i/>
@@ -305,51 +338,117 @@
           <w:sz w:val="22"/>
           <w:szCs w:val="22"/>
         </w:rPr>
-        <w:t>invalidInputCheck</w:t>
-      </w:r>
-    </w:p>
-    <w:p>
-      <w:pPr>
+        <w:t xml:space="preserve"> </w:t>
+      </w:r>
+      <w:r>
+        <w:rPr>
+          <w:sz w:val="22"/>
+          <w:szCs w:val="22"/>
+        </w:rPr>
+        <w:t>t</w:t>
+      </w:r>
+      <w:r>
+        <w:rPr>
+          <w:sz w:val="22"/>
+          <w:szCs w:val="22"/>
+        </w:rPr>
+        <w:t>est is designed to check</w:t>
+      </w:r>
+    </w:p>
+    <w:p>
+      <w:pPr>
+        <w:rPr>
+          <w:sz w:val="22"/>
+          <w:szCs w:val="22"/>
+        </w:rPr>
+      </w:pPr>
+    </w:p>
+    <w:p>
+      <w:pPr>
+        <w:rPr>
+          <w:b/>
+          <w:bCs/>
+          <w:sz w:val="22"/>
+          <w:szCs w:val="22"/>
+        </w:rPr>
+      </w:pPr>
+      <w:r>
+        <w:rPr>
+          <w:b/>
+          <w:bCs/>
+          <w:sz w:val="22"/>
+          <w:szCs w:val="22"/>
+        </w:rPr>
+        <w:t>Player</w:t>
+      </w:r>
+      <w:r>
+        <w:rPr>
+          <w:b/>
+          <w:bCs/>
+          <w:sz w:val="22"/>
+          <w:szCs w:val="22"/>
+        </w:rPr>
+        <w:t xml:space="preserve"> Class</w:t>
+      </w:r>
+      <w:r>
+        <w:rPr>
+          <w:b/>
+          <w:bCs/>
+          <w:sz w:val="22"/>
+          <w:szCs w:val="22"/>
+        </w:rPr>
+        <w:t xml:space="preserve"> Unit Tests</w:t>
+      </w:r>
+    </w:p>
+    <w:p>
+      <w:pPr>
+        <w:rPr>
+          <w:sz w:val="22"/>
+          <w:szCs w:val="22"/>
+        </w:rPr>
+      </w:pPr>
+      <w:r>
+        <w:rPr>
+          <w:sz w:val="22"/>
+          <w:szCs w:val="22"/>
+        </w:rPr>
+        <w:t xml:space="preserve">The tests for the functionality of the Player class are </w:t>
+      </w:r>
+      <w:r>
         <w:rPr>
           <w:i/>
           <w:iCs/>
           <w:sz w:val="22"/>
           <w:szCs w:val="22"/>
-        </w:rPr>
-      </w:pPr>
-    </w:p>
-    <w:p>
-      <w:pPr>
-        <w:rPr>
-          <w:sz w:val="22"/>
-          <w:szCs w:val="22"/>
-        </w:rPr>
-      </w:pPr>
-      <w:r>
-        <w:rPr>
-          <w:sz w:val="22"/>
-          <w:szCs w:val="22"/>
-        </w:rPr>
-        <w:t>Player Unit Tests</w:t>
-      </w:r>
-    </w:p>
-    <w:p>
-      <w:pPr>
+          <w:u w:val="single"/>
+        </w:rPr>
+        <w:t>playerInitialisedCheck</w:t>
+      </w:r>
+      <w:r>
         <w:rPr>
           <w:i/>
           <w:iCs/>
           <w:sz w:val="22"/>
           <w:szCs w:val="22"/>
         </w:rPr>
-      </w:pPr>
+        <w:t xml:space="preserve"> </w:t>
+      </w:r>
+      <w:r>
+        <w:rPr>
+          <w:sz w:val="22"/>
+          <w:szCs w:val="22"/>
+        </w:rPr>
+        <w:t xml:space="preserve">and </w:t>
+      </w:r>
       <w:r>
         <w:rPr>
           <w:i/>
           <w:iCs/>
           <w:sz w:val="22"/>
           <w:szCs w:val="22"/>
-        </w:rPr>
-        <w:t>playerInitialisedCheck</w:t>
+          <w:u w:val="single"/>
+        </w:rPr>
+        <w:t>testDistributeCardsPlayerHands</w:t>
       </w:r>
       <w:r>
         <w:rPr>
@@ -358,61 +457,112 @@
           <w:sz w:val="22"/>
           <w:szCs w:val="22"/>
         </w:rPr>
-        <w:t xml:space="preserve">, </w:t>
+        <w:t xml:space="preserve"> </w:t>
+      </w:r>
+      <w:r>
+        <w:rPr>
+          <w:sz w:val="22"/>
+          <w:szCs w:val="22"/>
+        </w:rPr>
+        <w:t>which</w:t>
+      </w:r>
+      <w:r>
+        <w:rPr>
+          <w:sz w:val="22"/>
+          <w:szCs w:val="22"/>
+        </w:rPr>
+        <w:t xml:space="preserve"> are both designed</w:t>
+      </w:r>
+    </w:p>
+    <w:p>
+      <w:pPr>
+        <w:rPr>
+          <w:sz w:val="22"/>
+          <w:szCs w:val="22"/>
+        </w:rPr>
+      </w:pPr>
+    </w:p>
+    <w:p>
+      <w:pPr>
+        <w:rPr>
+          <w:b/>
+          <w:bCs/>
+          <w:sz w:val="22"/>
+          <w:szCs w:val="22"/>
+        </w:rPr>
+      </w:pPr>
+      <w:r>
+        <w:rPr>
+          <w:b/>
+          <w:bCs/>
+          <w:sz w:val="22"/>
+          <w:szCs w:val="22"/>
+        </w:rPr>
+        <w:t>CardDeck</w:t>
+      </w:r>
+      <w:r>
+        <w:rPr>
+          <w:b/>
+          <w:bCs/>
+          <w:sz w:val="22"/>
+          <w:szCs w:val="22"/>
+        </w:rPr>
+        <w:t xml:space="preserve"> Class</w:t>
+      </w:r>
+      <w:r>
+        <w:rPr>
+          <w:b/>
+          <w:bCs/>
+          <w:sz w:val="22"/>
+          <w:szCs w:val="22"/>
+        </w:rPr>
+        <w:t xml:space="preserve"> Unit Tests</w:t>
+      </w:r>
+    </w:p>
+    <w:p>
+      <w:pPr>
+        <w:rPr>
+          <w:sz w:val="22"/>
+          <w:szCs w:val="22"/>
+        </w:rPr>
+      </w:pPr>
+      <w:r>
+        <w:rPr>
+          <w:sz w:val="22"/>
+          <w:szCs w:val="22"/>
+        </w:rPr>
+        <w:t xml:space="preserve">The tests for the behaviour of the CardDeck class are </w:t>
       </w:r>
       <w:r>
         <w:rPr>
           <w:i/>
           <w:iCs/>
-          <w:sz w:val="22"/>
-          <w:szCs w:val="22"/>
-        </w:rPr>
-        <w:t>playerStartingHandsCheck</w:t>
-      </w:r>
-    </w:p>
-    <w:p>
-      <w:pPr>
+          <w:color w:val="000000" w:themeColor="text1"/>
+          <w:sz w:val="22"/>
+          <w:szCs w:val="22"/>
+          <w:u w:val="single"/>
+        </w:rPr>
+        <w:t>deckInitialisedCheck</w:t>
+      </w:r>
+      <w:r>
         <w:rPr>
           <w:i/>
           <w:iCs/>
           <w:sz w:val="22"/>
           <w:szCs w:val="22"/>
         </w:rPr>
-      </w:pPr>
-    </w:p>
-    <w:p>
-      <w:pPr>
-        <w:rPr>
-          <w:sz w:val="22"/>
-          <w:szCs w:val="22"/>
-        </w:rPr>
-      </w:pPr>
-      <w:proofErr w:type="spellStart"/>
-      <w:r>
-        <w:rPr>
-          <w:sz w:val="22"/>
-          <w:szCs w:val="22"/>
-        </w:rPr>
-        <w:t>CardDeck</w:t>
-      </w:r>
-      <w:proofErr w:type="spellEnd"/>
-      <w:r>
-        <w:rPr>
-          <w:sz w:val="22"/>
-          <w:szCs w:val="22"/>
-        </w:rPr>
-        <w:t xml:space="preserve"> Unit Tests</w:t>
-      </w:r>
-    </w:p>
-    <w:p>
-      <w:pPr>
+        <w:t xml:space="preserve">, </w:t>
+      </w:r>
+      <w:r>
         <w:rPr>
           <w:i/>
           <w:iCs/>
           <w:sz w:val="22"/>
           <w:szCs w:val="22"/>
-        </w:rPr>
-      </w:pPr>
+          <w:u w:val="single"/>
+        </w:rPr>
+        <w:t>testDistributeCardsDeckContents</w:t>
+      </w:r>
       <w:r>
         <w:rPr>
           <w:i/>
@@ -420,7 +570,7 @@
           <w:sz w:val="22"/>
           <w:szCs w:val="22"/>
         </w:rPr>
-        <w:t>deckInitialisedCheck</w:t>
+        <w:t xml:space="preserve">, </w:t>
       </w:r>
       <w:r>
         <w:rPr>
@@ -428,8 +578,9 @@
           <w:iCs/>
           <w:sz w:val="22"/>
           <w:szCs w:val="22"/>
-        </w:rPr>
-        <w:t xml:space="preserve">, </w:t>
+          <w:u w:val="single"/>
+        </w:rPr>
+        <w:t>testCardDeckDrawCard</w:t>
       </w:r>
       <w:r>
         <w:rPr>
@@ -438,7 +589,7 @@
           <w:sz w:val="22"/>
           <w:szCs w:val="22"/>
         </w:rPr>
-        <w:t>deckStartingCardsCheck</w:t>
+        <w:t xml:space="preserve">, </w:t>
       </w:r>
       <w:r>
         <w:rPr>
@@ -446,8 +597,9 @@
           <w:iCs/>
           <w:sz w:val="22"/>
           <w:szCs w:val="22"/>
-        </w:rPr>
-        <w:t xml:space="preserve">, </w:t>
+          <w:u w:val="single"/>
+        </w:rPr>
+        <w:t>testCardDeckAddCard</w:t>
       </w:r>
       <w:r>
         <w:rPr>
@@ -456,7 +608,7 @@
           <w:sz w:val="22"/>
           <w:szCs w:val="22"/>
         </w:rPr>
-        <w:t>cardDeckDrawCardCheck</w:t>
+        <w:t xml:space="preserve">, </w:t>
       </w:r>
       <w:r>
         <w:rPr>
@@ -464,8 +616,92 @@
           <w:iCs/>
           <w:sz w:val="22"/>
           <w:szCs w:val="22"/>
-        </w:rPr>
-        <w:t xml:space="preserve">, </w:t>
+          <w:u w:val="single"/>
+        </w:rPr>
+        <w:t>cardDeckFIFOOrderingCheck</w:t>
+      </w:r>
+      <w:r>
+        <w:rPr>
+          <w:sz w:val="22"/>
+          <w:szCs w:val="22"/>
+        </w:rPr>
+        <w:t xml:space="preserve"> which</w:t>
+      </w:r>
+      <w:r>
+        <w:rPr>
+          <w:sz w:val="22"/>
+          <w:szCs w:val="22"/>
+        </w:rPr>
+        <w:t xml:space="preserve"> are designed around</w:t>
+      </w:r>
+    </w:p>
+    <w:p>
+      <w:pPr>
+        <w:rPr>
+          <w:sz w:val="22"/>
+          <w:szCs w:val="22"/>
+        </w:rPr>
+      </w:pPr>
+    </w:p>
+    <w:p>
+      <w:pPr>
+        <w:rPr>
+          <w:b/>
+          <w:bCs/>
+          <w:sz w:val="22"/>
+          <w:szCs w:val="22"/>
+        </w:rPr>
+      </w:pPr>
+      <w:r>
+        <w:rPr>
+          <w:b/>
+          <w:bCs/>
+          <w:sz w:val="22"/>
+          <w:szCs w:val="22"/>
+        </w:rPr>
+        <w:t>System</w:t>
+      </w:r>
+      <w:r>
+        <w:rPr>
+          <w:b/>
+          <w:bCs/>
+          <w:sz w:val="22"/>
+          <w:szCs w:val="22"/>
+        </w:rPr>
+        <w:t xml:space="preserve"> and Integration</w:t>
+      </w:r>
+      <w:r>
+        <w:rPr>
+          <w:b/>
+          <w:bCs/>
+          <w:sz w:val="22"/>
+          <w:szCs w:val="22"/>
+        </w:rPr>
+        <w:t xml:space="preserve"> Test</w:t>
+      </w:r>
+      <w:r>
+        <w:rPr>
+          <w:b/>
+          <w:bCs/>
+          <w:sz w:val="22"/>
+          <w:szCs w:val="22"/>
+        </w:rPr>
+        <w:t>s</w:t>
+      </w:r>
+    </w:p>
+    <w:p>
+      <w:pPr>
+        <w:rPr>
+          <w:sz w:val="22"/>
+          <w:szCs w:val="22"/>
+        </w:rPr>
+      </w:pPr>
+      <w:r>
+        <w:rPr>
+          <w:sz w:val="22"/>
+          <w:szCs w:val="22"/>
+        </w:rPr>
+        <w:t xml:space="preserve">The system wide tests are </w:t>
       </w:r>
       <w:r>
         <w:rPr>
@@ -473,8 +709,9 @@
           <w:iCs/>
           <w:sz w:val="22"/>
           <w:szCs w:val="22"/>
-        </w:rPr>
-        <w:t>cardDeckDiscardCardCheck</w:t>
+          <w:u w:val="single"/>
+        </w:rPr>
+        <w:t>winningPlayerEndingHandCheck</w:t>
       </w:r>
       <w:r>
         <w:rPr>
@@ -491,35 +728,28 @@
           <w:iCs/>
           <w:sz w:val="22"/>
           <w:szCs w:val="22"/>
-        </w:rPr>
-        <w:t>cardDeckFIFOOrderingCheck</w:t>
-      </w:r>
-    </w:p>
-    <w:p>
-      <w:pPr>
-        <w:rPr>
-          <w:sz w:val="22"/>
-          <w:szCs w:val="22"/>
-        </w:rPr>
-      </w:pPr>
-    </w:p>
-    <w:p>
-      <w:pPr>
+          <w:u w:val="single"/>
+        </w:rPr>
+        <w:t>cardStabilityCheck</w:t>
+      </w:r>
+      <w:r>
         <w:rPr>
           <w:i/>
           <w:iCs/>
           <w:sz w:val="22"/>
           <w:szCs w:val="22"/>
         </w:rPr>
-      </w:pPr>
+        <w:t xml:space="preserve">, </w:t>
+      </w:r>
       <w:r>
         <w:rPr>
           <w:i/>
           <w:iCs/>
           <w:sz w:val="22"/>
           <w:szCs w:val="22"/>
-        </w:rPr>
-        <w:t>System</w:t>
+          <w:u w:val="single"/>
+        </w:rPr>
+        <w:t>playerThreadsTerminatedCheck</w:t>
       </w:r>
       <w:r>
         <w:rPr>
@@ -528,7 +758,7 @@
           <w:sz w:val="22"/>
           <w:szCs w:val="22"/>
         </w:rPr>
-        <w:t xml:space="preserve"> and Integration</w:t>
+        <w:t xml:space="preserve">, </w:t>
       </w:r>
       <w:r>
         <w:rPr>
@@ -536,8 +766,16 @@
           <w:iCs/>
           <w:sz w:val="22"/>
           <w:szCs w:val="22"/>
-        </w:rPr>
-        <w:t xml:space="preserve"> Test</w:t>
+          <w:u w:val="single"/>
+        </w:rPr>
+        <w:t>playerOutputFileContentsCheck</w:t>
+      </w:r>
+      <w:r>
+        <w:rPr>
+          <w:sz w:val="22"/>
+          <w:szCs w:val="22"/>
+        </w:rPr>
+        <w:t xml:space="preserve"> and </w:t>
       </w:r>
       <w:r>
         <w:rPr>
@@ -545,99 +783,23 @@
           <w:iCs/>
           <w:sz w:val="22"/>
           <w:szCs w:val="22"/>
-        </w:rPr>
-        <w:t>s</w:t>
-      </w:r>
-    </w:p>
-    <w:p>
-      <w:pPr>
-        <w:rPr>
-          <w:i/>
-          <w:iCs/>
-          <w:sz w:val="22"/>
-          <w:szCs w:val="22"/>
-        </w:rPr>
-      </w:pPr>
-      <w:r>
-        <w:rPr>
-          <w:i/>
-          <w:iCs/>
-          <w:sz w:val="22"/>
-          <w:szCs w:val="22"/>
-        </w:rPr>
-        <w:t>winningPlayerEndingHandCheck</w:t>
-      </w:r>
-      <w:r>
-        <w:rPr>
-          <w:i/>
-          <w:iCs/>
-          <w:sz w:val="22"/>
-          <w:szCs w:val="22"/>
-        </w:rPr>
-        <w:t xml:space="preserve">, </w:t>
-      </w:r>
-      <w:r>
-        <w:rPr>
-          <w:i/>
-          <w:iCs/>
-          <w:sz w:val="22"/>
-          <w:szCs w:val="22"/>
-        </w:rPr>
-        <w:t>cardStabilityCheck</w:t>
-      </w:r>
-      <w:r>
-        <w:rPr>
-          <w:i/>
-          <w:iCs/>
-          <w:sz w:val="22"/>
-          <w:szCs w:val="22"/>
-        </w:rPr>
-        <w:t xml:space="preserve">, </w:t>
-      </w:r>
-      <w:r>
-        <w:rPr>
-          <w:i/>
-          <w:iCs/>
-          <w:sz w:val="22"/>
-          <w:szCs w:val="22"/>
-        </w:rPr>
-        <w:t>playerThreadsTerminatedCheck</w:t>
-      </w:r>
-      <w:r>
-        <w:rPr>
-          <w:i/>
-          <w:iCs/>
-          <w:sz w:val="22"/>
-          <w:szCs w:val="22"/>
-        </w:rPr>
-        <w:t xml:space="preserve">, </w:t>
-      </w:r>
-      <w:r>
-        <w:rPr>
-          <w:i/>
-          <w:iCs/>
-          <w:sz w:val="22"/>
-          <w:szCs w:val="22"/>
-        </w:rPr>
-        <w:t>playerOutputFileContentsCheck</w:t>
-      </w:r>
-      <w:r>
-        <w:rPr>
-          <w:i/>
-          <w:iCs/>
-          <w:sz w:val="22"/>
-          <w:szCs w:val="22"/>
-        </w:rPr>
-        <w:t xml:space="preserve">, </w:t>
-      </w:r>
-      <w:r>
-        <w:rPr>
-          <w:i/>
-          <w:iCs/>
-          <w:sz w:val="22"/>
-          <w:szCs w:val="22"/>
+          <w:u w:val="single"/>
         </w:rPr>
         <w:t>playerDiscardDenominationCheck</w:t>
+      </w:r>
+      <w:r>
+        <w:rPr>
+          <w:sz w:val="22"/>
+          <w:szCs w:val="22"/>
+        </w:rPr>
+        <w:t xml:space="preserve"> which</w:t>
+      </w:r>
+      <w:r>
+        <w:rPr>
+          <w:sz w:val="22"/>
+          <w:szCs w:val="22"/>
+        </w:rPr>
+        <w:t xml:space="preserve"> are all designed around</w:t>
       </w:r>
     </w:p>
     <w:p>
@@ -697,6 +859,7 @@
           <w:sz w:val="22"/>
           <w:szCs w:val="22"/>
         </w:rPr>
+        <w:lastRenderedPageBreak/>
         <w:t>The</w:t>
       </w:r>
     </w:p>
@@ -720,7 +883,6 @@
           <w:sz w:val="22"/>
           <w:szCs w:val="22"/>
         </w:rPr>
-        <w:lastRenderedPageBreak/>
         <w:t>Tests of entire game time out after 5 seconds</w:t>
       </w:r>
     </w:p>
@@ -786,6 +948,134 @@
           <w:szCs w:val="22"/>
         </w:rPr>
         <w:t>[Text]</w:t>
+      </w:r>
+    </w:p>
+    <w:p>
+      <w:pPr>
+        <w:rPr>
+          <w:sz w:val="22"/>
+          <w:szCs w:val="22"/>
+        </w:rPr>
+      </w:pPr>
+    </w:p>
+    <w:p>
+      <w:pPr>
+        <w:rPr>
+          <w:sz w:val="22"/>
+          <w:szCs w:val="22"/>
+        </w:rPr>
+      </w:pPr>
+      <w:r>
+        <w:rPr>
+          <w:b/>
+          <w:bCs/>
+          <w:sz w:val="22"/>
+          <w:szCs w:val="22"/>
+        </w:rPr>
+        <w:t>Pair Programming Sessions</w:t>
+      </w:r>
+    </w:p>
+    <w:p>
+      <w:pPr>
+        <w:rPr>
+          <w:sz w:val="22"/>
+          <w:szCs w:val="22"/>
+        </w:rPr>
+      </w:pPr>
+      <w:r>
+        <w:rPr>
+          <w:sz w:val="22"/>
+          <w:szCs w:val="22"/>
+        </w:rPr>
+        <w:t>[Date] [Time]</w:t>
+      </w:r>
+      <w:r>
+        <w:rPr>
+          <w:sz w:val="22"/>
+          <w:szCs w:val="22"/>
+        </w:rPr>
+        <w:t xml:space="preserve"> [Duration]</w:t>
+      </w:r>
+    </w:p>
+    <w:p>
+      <w:pPr>
+        <w:rPr>
+          <w:sz w:val="22"/>
+          <w:szCs w:val="22"/>
+        </w:rPr>
+      </w:pPr>
+    </w:p>
+    <w:p>
+      <w:pPr>
+        <w:rPr>
+          <w:sz w:val="22"/>
+          <w:szCs w:val="22"/>
+        </w:rPr>
+      </w:pPr>
+      <w:r>
+        <w:rPr>
+          <w:sz w:val="22"/>
+          <w:szCs w:val="22"/>
+        </w:rPr>
+        <w:t>[</w:t>
+      </w:r>
+      <w:r>
+        <w:rPr>
+          <w:sz w:val="22"/>
+          <w:szCs w:val="22"/>
+        </w:rPr>
+        <w:t>Driver vs navigator roles</w:t>
+      </w:r>
+      <w:r>
+        <w:rPr>
+          <w:sz w:val="22"/>
+          <w:szCs w:val="22"/>
+        </w:rPr>
+        <w:t>]</w:t>
+      </w:r>
+    </w:p>
+    <w:p>
+      <w:pPr>
+        <w:rPr>
+          <w:sz w:val="22"/>
+          <w:szCs w:val="22"/>
+        </w:rPr>
+      </w:pPr>
+    </w:p>
+    <w:p>
+      <w:pPr>
+        <w:rPr>
+          <w:sz w:val="22"/>
+          <w:szCs w:val="22"/>
+        </w:rPr>
+      </w:pPr>
+      <w:r>
+        <w:rPr>
+          <w:sz w:val="22"/>
+          <w:szCs w:val="22"/>
+        </w:rPr>
+        <w:t>[3-5 significant commits</w:t>
+      </w:r>
+      <w:r>
+        <w:rPr>
+          <w:sz w:val="22"/>
+          <w:szCs w:val="22"/>
+        </w:rPr>
+        <w:t xml:space="preserve"> – commit identifier / date</w:t>
+      </w:r>
+      <w:r>
+        <w:rPr>
+          <w:sz w:val="22"/>
+          <w:szCs w:val="22"/>
+        </w:rPr>
+        <w:t xml:space="preserve"> + brief description of what changed</w:t>
+      </w:r>
+      <w:r>
+        <w:rPr>
+          <w:sz w:val="22"/>
+          <w:szCs w:val="22"/>
+        </w:rPr>
+        <w:t>]</w:t>
       </w:r>
     </w:p>
     <w:p>

</xml_diff>

<commit_message>
Finished Writing The Development Process and Pair-Programming Record Section Of The Report
</commit_message>
<xml_diff>
--- a/report.docx
+++ b/report.docx
@@ -533,6 +533,7 @@
         </w:rPr>
         <w:t xml:space="preserve">The tests for the behaviour of the CardDeck class are </w:t>
       </w:r>
+      <w:proofErr w:type="spellStart"/>
       <w:r>
         <w:rPr>
           <w:i/>
@@ -544,6 +545,7 @@
         </w:rPr>
         <w:t>deckInitialisedCheck</w:t>
       </w:r>
+      <w:proofErr w:type="spellEnd"/>
       <w:r>
         <w:rPr>
           <w:i/>
@@ -553,6 +555,7 @@
         </w:rPr>
         <w:t xml:space="preserve">, </w:t>
       </w:r>
+      <w:proofErr w:type="spellStart"/>
       <w:r>
         <w:rPr>
           <w:i/>
@@ -563,6 +566,7 @@
         </w:rPr>
         <w:t>testDistributeCardsDeckContents</w:t>
       </w:r>
+      <w:proofErr w:type="spellEnd"/>
       <w:r>
         <w:rPr>
           <w:i/>
@@ -572,6 +576,7 @@
         </w:rPr>
         <w:t xml:space="preserve">, </w:t>
       </w:r>
+      <w:proofErr w:type="spellStart"/>
       <w:r>
         <w:rPr>
           <w:i/>
@@ -582,6 +587,7 @@
         </w:rPr>
         <w:t>testCardDeckDrawCard</w:t>
       </w:r>
+      <w:proofErr w:type="spellEnd"/>
       <w:r>
         <w:rPr>
           <w:i/>
@@ -591,6 +597,7 @@
         </w:rPr>
         <w:t xml:space="preserve">, </w:t>
       </w:r>
+      <w:proofErr w:type="spellStart"/>
       <w:r>
         <w:rPr>
           <w:i/>
@@ -601,6 +608,7 @@
         </w:rPr>
         <w:t>testCardDeckAddCard</w:t>
       </w:r>
+      <w:proofErr w:type="spellEnd"/>
       <w:r>
         <w:rPr>
           <w:i/>
@@ -610,6 +618,7 @@
         </w:rPr>
         <w:t xml:space="preserve">, </w:t>
       </w:r>
+      <w:proofErr w:type="spellStart"/>
       <w:r>
         <w:rPr>
           <w:i/>
@@ -620,6 +629,7 @@
         </w:rPr>
         <w:t>cardDeckFIFOOrderingCheck</w:t>
       </w:r>
+      <w:proofErr w:type="spellEnd"/>
       <w:r>
         <w:rPr>
           <w:sz w:val="22"/>
@@ -703,6 +713,7 @@
         </w:rPr>
         <w:t xml:space="preserve">The system wide tests are </w:t>
       </w:r>
+      <w:proofErr w:type="spellStart"/>
       <w:r>
         <w:rPr>
           <w:i/>
@@ -713,6 +724,7 @@
         </w:rPr>
         <w:t>winningPlayerEndingHandCheck</w:t>
       </w:r>
+      <w:proofErr w:type="spellEnd"/>
       <w:r>
         <w:rPr>
           <w:i/>
@@ -722,6 +734,7 @@
         </w:rPr>
         <w:t xml:space="preserve">, </w:t>
       </w:r>
+      <w:proofErr w:type="spellStart"/>
       <w:r>
         <w:rPr>
           <w:i/>
@@ -732,6 +745,7 @@
         </w:rPr>
         <w:t>cardStabilityCheck</w:t>
       </w:r>
+      <w:proofErr w:type="spellEnd"/>
       <w:r>
         <w:rPr>
           <w:i/>
@@ -741,6 +755,7 @@
         </w:rPr>
         <w:t xml:space="preserve">, </w:t>
       </w:r>
+      <w:proofErr w:type="spellStart"/>
       <w:r>
         <w:rPr>
           <w:i/>
@@ -751,6 +766,7 @@
         </w:rPr>
         <w:t>playerThreadsTerminatedCheck</w:t>
       </w:r>
+      <w:proofErr w:type="spellEnd"/>
       <w:r>
         <w:rPr>
           <w:i/>
@@ -760,6 +776,7 @@
         </w:rPr>
         <w:t xml:space="preserve">, </w:t>
       </w:r>
+      <w:proofErr w:type="spellStart"/>
       <w:r>
         <w:rPr>
           <w:i/>
@@ -770,6 +787,7 @@
         </w:rPr>
         <w:t>playerOutputFileContentsCheck</w:t>
       </w:r>
+      <w:proofErr w:type="spellEnd"/>
       <w:r>
         <w:rPr>
           <w:sz w:val="22"/>
@@ -777,6 +795,7 @@
         </w:rPr>
         <w:t xml:space="preserve"> and </w:t>
       </w:r>
+      <w:proofErr w:type="spellStart"/>
       <w:r>
         <w:rPr>
           <w:i/>
@@ -787,6 +806,7 @@
         </w:rPr>
         <w:t>playerDiscardDenominationCheck</w:t>
       </w:r>
+      <w:proofErr w:type="spellEnd"/>
       <w:r>
         <w:rPr>
           <w:sz w:val="22"/>
@@ -893,6 +913,21 @@
           <w:szCs w:val="22"/>
         </w:rPr>
       </w:pPr>
+      <w:r>
+        <w:rPr>
+          <w:sz w:val="22"/>
+          <w:szCs w:val="22"/>
+        </w:rPr>
+        <w:br w:type="page"/>
+      </w:r>
+    </w:p>
+    <w:p>
+      <w:pPr>
+        <w:rPr>
+          <w:sz w:val="22"/>
+          <w:szCs w:val="22"/>
+        </w:rPr>
+      </w:pPr>
     </w:p>
     <w:p>
       <w:pPr>
@@ -942,21 +977,6 @@
           <w:szCs w:val="22"/>
         </w:rPr>
       </w:pPr>
-      <w:r>
-        <w:rPr>
-          <w:sz w:val="22"/>
-          <w:szCs w:val="22"/>
-        </w:rPr>
-        <w:t>[Text]</w:t>
-      </w:r>
-    </w:p>
-    <w:p>
-      <w:pPr>
-        <w:rPr>
-          <w:sz w:val="22"/>
-          <w:szCs w:val="22"/>
-        </w:rPr>
-      </w:pPr>
     </w:p>
     <w:p>
       <w:pPr>
@@ -980,102 +1000,1250 @@
         <w:rPr>
           <w:sz w:val="22"/>
           <w:szCs w:val="22"/>
-        </w:rPr>
-      </w:pPr>
-      <w:r>
-        <w:rPr>
-          <w:sz w:val="22"/>
-          <w:szCs w:val="22"/>
-        </w:rPr>
-        <w:t>[Date] [Time]</w:t>
-      </w:r>
-      <w:r>
-        <w:rPr>
-          <w:sz w:val="22"/>
-          <w:szCs w:val="22"/>
-        </w:rPr>
-        <w:t xml:space="preserve"> [Duration]</w:t>
-      </w:r>
-    </w:p>
-    <w:p>
-      <w:pPr>
-        <w:rPr>
-          <w:sz w:val="22"/>
-          <w:szCs w:val="22"/>
-        </w:rPr>
-      </w:pPr>
-    </w:p>
-    <w:p>
-      <w:pPr>
-        <w:rPr>
-          <w:sz w:val="22"/>
-          <w:szCs w:val="22"/>
-        </w:rPr>
-      </w:pPr>
-      <w:r>
-        <w:rPr>
-          <w:sz w:val="22"/>
-          <w:szCs w:val="22"/>
-        </w:rPr>
-        <w:t>[</w:t>
-      </w:r>
-      <w:r>
-        <w:rPr>
-          <w:sz w:val="22"/>
-          <w:szCs w:val="22"/>
-        </w:rPr>
-        <w:t>Driver vs navigator roles</w:t>
-      </w:r>
-      <w:r>
-        <w:rPr>
-          <w:sz w:val="22"/>
-          <w:szCs w:val="22"/>
-        </w:rPr>
-        <w:t>]</w:t>
-      </w:r>
-    </w:p>
-    <w:p>
-      <w:pPr>
-        <w:rPr>
-          <w:sz w:val="22"/>
-          <w:szCs w:val="22"/>
-        </w:rPr>
-      </w:pPr>
-    </w:p>
-    <w:p>
-      <w:pPr>
-        <w:rPr>
-          <w:sz w:val="22"/>
-          <w:szCs w:val="22"/>
-        </w:rPr>
-      </w:pPr>
-      <w:r>
-        <w:rPr>
-          <w:sz w:val="22"/>
-          <w:szCs w:val="22"/>
-        </w:rPr>
-        <w:t>[3-5 significant commits</w:t>
-      </w:r>
-      <w:r>
-        <w:rPr>
-          <w:sz w:val="22"/>
-          <w:szCs w:val="22"/>
-        </w:rPr>
-        <w:t xml:space="preserve"> – commit identifier / date</w:t>
-      </w:r>
-      <w:r>
-        <w:rPr>
-          <w:sz w:val="22"/>
-          <w:szCs w:val="22"/>
-        </w:rPr>
-        <w:t xml:space="preserve"> + brief description of what changed</w:t>
-      </w:r>
-      <w:r>
-        <w:rPr>
-          <w:sz w:val="22"/>
-          <w:szCs w:val="22"/>
-        </w:rPr>
-        <w:t>]</w:t>
+          <w:u w:val="single"/>
+        </w:rPr>
+      </w:pPr>
+      <w:r>
+        <w:rPr>
+          <w:sz w:val="22"/>
+          <w:szCs w:val="22"/>
+          <w:u w:val="single"/>
+        </w:rPr>
+        <w:t>29</w:t>
+      </w:r>
+      <w:r>
+        <w:rPr>
+          <w:sz w:val="22"/>
+          <w:szCs w:val="22"/>
+          <w:u w:val="single"/>
+        </w:rPr>
+        <w:t>/</w:t>
+      </w:r>
+      <w:r>
+        <w:rPr>
+          <w:sz w:val="22"/>
+          <w:szCs w:val="22"/>
+          <w:u w:val="single"/>
+        </w:rPr>
+        <w:t>9</w:t>
+      </w:r>
+      <w:r>
+        <w:rPr>
+          <w:sz w:val="22"/>
+          <w:szCs w:val="22"/>
+          <w:u w:val="single"/>
+        </w:rPr>
+        <w:t>/</w:t>
+      </w:r>
+      <w:r>
+        <w:rPr>
+          <w:sz w:val="22"/>
+          <w:szCs w:val="22"/>
+          <w:u w:val="single"/>
+        </w:rPr>
+        <w:t>26 at 2:35 for 1 hour</w:t>
+      </w:r>
+      <w:r>
+        <w:rPr>
+          <w:sz w:val="22"/>
+          <w:szCs w:val="22"/>
+          <w:u w:val="single"/>
+        </w:rPr>
+        <w:t xml:space="preserve"> - </w:t>
+      </w:r>
+      <w:r>
+        <w:rPr>
+          <w:sz w:val="22"/>
+          <w:szCs w:val="22"/>
+          <w:u w:val="single"/>
+        </w:rPr>
+        <w:t>D</w:t>
+      </w:r>
+      <w:r>
+        <w:rPr>
+          <w:sz w:val="22"/>
+          <w:szCs w:val="22"/>
+          <w:u w:val="single"/>
+        </w:rPr>
+        <w:t xml:space="preserve">river: </w:t>
+      </w:r>
+      <w:r>
+        <w:rPr>
+          <w:sz w:val="22"/>
+          <w:szCs w:val="22"/>
+          <w:u w:val="single"/>
+        </w:rPr>
+        <w:t>Oliver</w:t>
+      </w:r>
+      <w:r>
+        <w:rPr>
+          <w:sz w:val="22"/>
+          <w:szCs w:val="22"/>
+          <w:u w:val="single"/>
+        </w:rPr>
+        <w:t>, Navigator</w:t>
+      </w:r>
+      <w:r>
+        <w:rPr>
+          <w:sz w:val="22"/>
+          <w:szCs w:val="22"/>
+          <w:u w:val="single"/>
+        </w:rPr>
+        <w:t xml:space="preserve">: </w:t>
+      </w:r>
+      <w:r>
+        <w:rPr>
+          <w:sz w:val="22"/>
+          <w:szCs w:val="22"/>
+          <w:u w:val="single"/>
+        </w:rPr>
+        <w:t>V</w:t>
+      </w:r>
+      <w:r>
+        <w:rPr>
+          <w:sz w:val="22"/>
+          <w:szCs w:val="22"/>
+          <w:u w:val="single"/>
+        </w:rPr>
+        <w:t>la</w:t>
+      </w:r>
+      <w:r>
+        <w:rPr>
+          <w:sz w:val="22"/>
+          <w:szCs w:val="22"/>
+          <w:u w:val="single"/>
+        </w:rPr>
+        <w:t>dimir</w:t>
+      </w:r>
+    </w:p>
+    <w:p>
+      <w:pPr>
+        <w:pStyle w:val="ListParagraph"/>
+        <w:numPr>
+          <w:ilvl w:val="0"/>
+          <w:numId w:val="6"/>
+        </w:numPr>
+        <w:rPr>
+          <w:sz w:val="22"/>
+          <w:szCs w:val="22"/>
+        </w:rPr>
+      </w:pPr>
+      <w:r>
+        <w:rPr>
+          <w:sz w:val="22"/>
+          <w:szCs w:val="22"/>
+        </w:rPr>
+        <w:t xml:space="preserve">Began initial </w:t>
+      </w:r>
+      <w:r>
+        <w:rPr>
+          <w:sz w:val="22"/>
+          <w:szCs w:val="22"/>
+        </w:rPr>
+        <w:t>planning for the CardGame, CardDeck, Card and Player classes</w:t>
+      </w:r>
+      <w:r>
+        <w:rPr>
+          <w:sz w:val="22"/>
+          <w:szCs w:val="22"/>
+        </w:rPr>
+        <w:t xml:space="preserve"> and</w:t>
+      </w:r>
+      <w:r>
+        <w:rPr>
+          <w:sz w:val="22"/>
+          <w:szCs w:val="22"/>
+        </w:rPr>
+        <w:t xml:space="preserve"> got a single player thread working</w:t>
+      </w:r>
+      <w:r>
+        <w:rPr>
+          <w:sz w:val="22"/>
+          <w:szCs w:val="22"/>
+        </w:rPr>
+        <w:t xml:space="preserve"> without any functionality</w:t>
+      </w:r>
+      <w:r>
+        <w:rPr>
+          <w:sz w:val="22"/>
+          <w:szCs w:val="22"/>
+        </w:rPr>
+        <w:t>.</w:t>
+      </w:r>
+    </w:p>
+    <w:p>
+      <w:pPr>
+        <w:pStyle w:val="ListParagraph"/>
+        <w:numPr>
+          <w:ilvl w:val="0"/>
+          <w:numId w:val="6"/>
+        </w:numPr>
+        <w:rPr>
+          <w:sz w:val="22"/>
+          <w:szCs w:val="22"/>
+        </w:rPr>
+      </w:pPr>
+      <w:r>
+        <w:rPr>
+          <w:sz w:val="22"/>
+          <w:szCs w:val="22"/>
+        </w:rPr>
+        <w:t xml:space="preserve">Planned </w:t>
+      </w:r>
+      <w:r>
+        <w:rPr>
+          <w:sz w:val="22"/>
+          <w:szCs w:val="22"/>
+        </w:rPr>
+        <w:t xml:space="preserve">and created methods for checking if a player has won, writing </w:t>
+      </w:r>
+      <w:r>
+        <w:rPr>
+          <w:sz w:val="22"/>
+          <w:szCs w:val="22"/>
+        </w:rPr>
+        <w:t>logs to</w:t>
+      </w:r>
+      <w:r>
+        <w:rPr>
+          <w:sz w:val="22"/>
+          <w:szCs w:val="22"/>
+        </w:rPr>
+        <w:t xml:space="preserve"> a text file</w:t>
+      </w:r>
+      <w:r>
+        <w:rPr>
+          <w:sz w:val="22"/>
+          <w:szCs w:val="22"/>
+        </w:rPr>
+        <w:t xml:space="preserve"> and reading card packs</w:t>
+      </w:r>
+    </w:p>
+    <w:p>
+      <w:pPr>
+        <w:rPr>
+          <w:sz w:val="22"/>
+          <w:szCs w:val="22"/>
+        </w:rPr>
+      </w:pPr>
+    </w:p>
+    <w:p>
+      <w:pPr>
+        <w:rPr>
+          <w:sz w:val="22"/>
+          <w:szCs w:val="22"/>
+          <w:u w:val="single"/>
+        </w:rPr>
+      </w:pPr>
+      <w:r>
+        <w:rPr>
+          <w:sz w:val="22"/>
+          <w:szCs w:val="22"/>
+          <w:u w:val="single"/>
+        </w:rPr>
+        <w:t>6</w:t>
+      </w:r>
+      <w:r>
+        <w:rPr>
+          <w:sz w:val="22"/>
+          <w:szCs w:val="22"/>
+          <w:u w:val="single"/>
+        </w:rPr>
+        <w:t>/10/26 at 2:35 for 1 hour</w:t>
+      </w:r>
+      <w:r>
+        <w:rPr>
+          <w:sz w:val="22"/>
+          <w:szCs w:val="22"/>
+          <w:u w:val="single"/>
+        </w:rPr>
+        <w:t xml:space="preserve"> - D</w:t>
+      </w:r>
+      <w:r>
+        <w:rPr>
+          <w:sz w:val="22"/>
+          <w:szCs w:val="22"/>
+          <w:u w:val="single"/>
+        </w:rPr>
+        <w:t>river: V</w:t>
+      </w:r>
+      <w:r>
+        <w:rPr>
+          <w:sz w:val="22"/>
+          <w:szCs w:val="22"/>
+          <w:u w:val="single"/>
+        </w:rPr>
+        <w:t>l</w:t>
+      </w:r>
+      <w:r>
+        <w:rPr>
+          <w:sz w:val="22"/>
+          <w:szCs w:val="22"/>
+          <w:u w:val="single"/>
+        </w:rPr>
+        <w:t>adimir</w:t>
+      </w:r>
+      <w:r>
+        <w:rPr>
+          <w:sz w:val="22"/>
+          <w:szCs w:val="22"/>
+          <w:u w:val="single"/>
+        </w:rPr>
+        <w:t>, Navigator: Oliver</w:t>
+      </w:r>
+    </w:p>
+    <w:p>
+      <w:pPr>
+        <w:pStyle w:val="ListParagraph"/>
+        <w:numPr>
+          <w:ilvl w:val="0"/>
+          <w:numId w:val="5"/>
+        </w:numPr>
+        <w:rPr>
+          <w:sz w:val="22"/>
+          <w:szCs w:val="22"/>
+        </w:rPr>
+      </w:pPr>
+      <w:r>
+        <w:rPr>
+          <w:sz w:val="22"/>
+          <w:szCs w:val="22"/>
+        </w:rPr>
+        <w:t>Debugged and corrected</w:t>
+      </w:r>
+      <w:r>
+        <w:rPr>
+          <w:sz w:val="22"/>
+          <w:szCs w:val="22"/>
+        </w:rPr>
+        <w:t xml:space="preserve"> an issue where the cards</w:t>
+      </w:r>
+      <w:r>
+        <w:rPr>
+          <w:sz w:val="22"/>
+          <w:szCs w:val="22"/>
+        </w:rPr>
+        <w:t xml:space="preserve"> were not being distributed in a round robin fashion</w:t>
+      </w:r>
+    </w:p>
+    <w:p>
+      <w:pPr>
+        <w:pStyle w:val="ListParagraph"/>
+        <w:numPr>
+          <w:ilvl w:val="0"/>
+          <w:numId w:val="5"/>
+        </w:numPr>
+        <w:rPr>
+          <w:sz w:val="22"/>
+          <w:szCs w:val="22"/>
+        </w:rPr>
+      </w:pPr>
+      <w:r>
+        <w:rPr>
+          <w:sz w:val="22"/>
+          <w:szCs w:val="22"/>
+        </w:rPr>
+        <w:t>I</w:t>
+      </w:r>
+      <w:r>
+        <w:rPr>
+          <w:sz w:val="22"/>
+          <w:szCs w:val="22"/>
+        </w:rPr>
+        <w:t xml:space="preserve">mplemented </w:t>
+      </w:r>
+      <w:r>
+        <w:rPr>
+          <w:sz w:val="22"/>
+          <w:szCs w:val="22"/>
+        </w:rPr>
+        <w:t>a way for the winning player to stop the game and announce their victory</w:t>
+      </w:r>
+      <w:r>
+        <w:rPr>
+          <w:sz w:val="22"/>
+          <w:szCs w:val="22"/>
+        </w:rPr>
+        <w:t>.</w:t>
+      </w:r>
+    </w:p>
+    <w:p>
+      <w:pPr>
+        <w:pStyle w:val="ListParagraph"/>
+        <w:numPr>
+          <w:ilvl w:val="0"/>
+          <w:numId w:val="5"/>
+        </w:numPr>
+        <w:rPr>
+          <w:sz w:val="22"/>
+          <w:szCs w:val="22"/>
+        </w:rPr>
+      </w:pPr>
+      <w:r>
+        <w:rPr>
+          <w:sz w:val="22"/>
+          <w:szCs w:val="22"/>
+        </w:rPr>
+        <w:t>D</w:t>
+      </w:r>
+      <w:r>
+        <w:rPr>
+          <w:sz w:val="22"/>
+          <w:szCs w:val="22"/>
+        </w:rPr>
+        <w:t xml:space="preserve">iscussed, planned and </w:t>
+      </w:r>
+      <w:r>
+        <w:rPr>
+          <w:sz w:val="22"/>
+          <w:szCs w:val="22"/>
+        </w:rPr>
+        <w:t>added basic JUnit 5 functionality ready for tests to be written</w:t>
+      </w:r>
+      <w:r>
+        <w:rPr>
+          <w:sz w:val="22"/>
+          <w:szCs w:val="22"/>
+        </w:rPr>
+        <w:t>.</w:t>
+      </w:r>
+    </w:p>
+    <w:p>
+      <w:pPr>
+        <w:pStyle w:val="ListParagraph"/>
+        <w:numPr>
+          <w:ilvl w:val="0"/>
+          <w:numId w:val="5"/>
+        </w:numPr>
+        <w:rPr>
+          <w:sz w:val="22"/>
+          <w:szCs w:val="22"/>
+        </w:rPr>
+      </w:pPr>
+      <w:r>
+        <w:rPr>
+          <w:sz w:val="22"/>
+          <w:szCs w:val="22"/>
+        </w:rPr>
+        <w:t xml:space="preserve">Added tests </w:t>
+      </w:r>
+      <w:r>
+        <w:rPr>
+          <w:sz w:val="22"/>
+          <w:szCs w:val="22"/>
+        </w:rPr>
+        <w:t xml:space="preserve">for checking whether the correct card is drawn and discarded </w:t>
+      </w:r>
+      <w:r>
+        <w:rPr>
+          <w:sz w:val="22"/>
+          <w:szCs w:val="22"/>
+        </w:rPr>
+        <w:t>from a</w:t>
+      </w:r>
+      <w:r>
+        <w:rPr>
+          <w:sz w:val="22"/>
+          <w:szCs w:val="22"/>
+        </w:rPr>
+        <w:t xml:space="preserve"> CardDeck</w:t>
+      </w:r>
+      <w:r>
+        <w:rPr>
+          <w:sz w:val="22"/>
+          <w:szCs w:val="22"/>
+        </w:rPr>
+        <w:t xml:space="preserve"> instance</w:t>
+      </w:r>
+      <w:r>
+        <w:rPr>
+          <w:sz w:val="22"/>
+          <w:szCs w:val="22"/>
+        </w:rPr>
+        <w:t xml:space="preserve"> as well as deck and player initialisation and winning hand checks</w:t>
+      </w:r>
+    </w:p>
+    <w:p>
+      <w:pPr>
+        <w:rPr>
+          <w:sz w:val="22"/>
+          <w:szCs w:val="22"/>
+        </w:rPr>
+      </w:pPr>
+    </w:p>
+    <w:p>
+      <w:pPr>
+        <w:rPr>
+          <w:sz w:val="22"/>
+          <w:szCs w:val="22"/>
+          <w:u w:val="single"/>
+        </w:rPr>
+      </w:pPr>
+      <w:r>
+        <w:rPr>
+          <w:sz w:val="22"/>
+          <w:szCs w:val="22"/>
+          <w:u w:val="single"/>
+        </w:rPr>
+        <w:t>13</w:t>
+      </w:r>
+      <w:r>
+        <w:rPr>
+          <w:sz w:val="22"/>
+          <w:szCs w:val="22"/>
+          <w:u w:val="single"/>
+        </w:rPr>
+        <w:t>/10/26 at 2:35 for 1 hour</w:t>
+      </w:r>
+      <w:r>
+        <w:rPr>
+          <w:sz w:val="22"/>
+          <w:szCs w:val="22"/>
+          <w:u w:val="single"/>
+        </w:rPr>
+        <w:t xml:space="preserve"> - D</w:t>
+      </w:r>
+      <w:r>
+        <w:rPr>
+          <w:sz w:val="22"/>
+          <w:szCs w:val="22"/>
+          <w:u w:val="single"/>
+        </w:rPr>
+        <w:t>river: V</w:t>
+      </w:r>
+      <w:r>
+        <w:rPr>
+          <w:sz w:val="22"/>
+          <w:szCs w:val="22"/>
+          <w:u w:val="single"/>
+        </w:rPr>
+        <w:t>l</w:t>
+      </w:r>
+      <w:r>
+        <w:rPr>
+          <w:sz w:val="22"/>
+          <w:szCs w:val="22"/>
+          <w:u w:val="single"/>
+        </w:rPr>
+        <w:t>adimir</w:t>
+      </w:r>
+      <w:r>
+        <w:rPr>
+          <w:sz w:val="22"/>
+          <w:szCs w:val="22"/>
+          <w:u w:val="single"/>
+        </w:rPr>
+        <w:t>, Navigator: Oliver</w:t>
+      </w:r>
+    </w:p>
+    <w:p>
+      <w:pPr>
+        <w:pStyle w:val="ListParagraph"/>
+        <w:numPr>
+          <w:ilvl w:val="0"/>
+          <w:numId w:val="4"/>
+        </w:numPr>
+        <w:rPr>
+          <w:sz w:val="22"/>
+          <w:szCs w:val="22"/>
+        </w:rPr>
+      </w:pPr>
+      <w:r>
+        <w:rPr>
+          <w:sz w:val="22"/>
+          <w:szCs w:val="22"/>
+        </w:rPr>
+        <w:t xml:space="preserve">Removed old </w:t>
+      </w:r>
+      <w:r>
+        <w:rPr>
+          <w:sz w:val="22"/>
+          <w:szCs w:val="22"/>
+        </w:rPr>
+        <w:t xml:space="preserve">console logging and began and implemented the </w:t>
+      </w:r>
+      <w:r>
+        <w:rPr>
+          <w:sz w:val="22"/>
+          <w:szCs w:val="22"/>
+        </w:rPr>
+        <w:t xml:space="preserve">text file logging </w:t>
+      </w:r>
+      <w:r>
+        <w:rPr>
+          <w:sz w:val="22"/>
+          <w:szCs w:val="22"/>
+        </w:rPr>
+        <w:t>making sure each text file contents matched the requirements in the specification</w:t>
+      </w:r>
+      <w:r>
+        <w:rPr>
+          <w:sz w:val="22"/>
+          <w:szCs w:val="22"/>
+        </w:rPr>
+        <w:t xml:space="preserve"> whilst also making logical sense in terms of the rules of the game.</w:t>
+      </w:r>
+    </w:p>
+    <w:p>
+      <w:pPr>
+        <w:pStyle w:val="ListParagraph"/>
+        <w:numPr>
+          <w:ilvl w:val="0"/>
+          <w:numId w:val="4"/>
+        </w:numPr>
+        <w:rPr>
+          <w:sz w:val="22"/>
+          <w:szCs w:val="22"/>
+        </w:rPr>
+      </w:pPr>
+      <w:r>
+        <w:rPr>
+          <w:sz w:val="22"/>
+          <w:szCs w:val="22"/>
+        </w:rPr>
+        <w:t>Added more tests</w:t>
+      </w:r>
+      <w:r>
+        <w:rPr>
+          <w:sz w:val="22"/>
+          <w:szCs w:val="22"/>
+        </w:rPr>
+        <w:t xml:space="preserve"> for</w:t>
+      </w:r>
+      <w:r>
+        <w:rPr>
+          <w:sz w:val="22"/>
+          <w:szCs w:val="22"/>
+        </w:rPr>
+        <w:t xml:space="preserve"> </w:t>
+      </w:r>
+      <w:r>
+        <w:rPr>
+          <w:sz w:val="22"/>
+          <w:szCs w:val="22"/>
+        </w:rPr>
+        <w:t>checking</w:t>
+      </w:r>
+      <w:r>
+        <w:rPr>
+          <w:sz w:val="22"/>
+          <w:szCs w:val="22"/>
+        </w:rPr>
+        <w:t xml:space="preserve"> </w:t>
+      </w:r>
+      <w:r>
+        <w:rPr>
+          <w:sz w:val="22"/>
+          <w:szCs w:val="22"/>
+        </w:rPr>
+        <w:t xml:space="preserve">the output logs for </w:t>
+      </w:r>
+      <w:r>
+        <w:rPr>
+          <w:sz w:val="22"/>
+          <w:szCs w:val="22"/>
+        </w:rPr>
+        <w:t>improper card discards</w:t>
+      </w:r>
+      <w:r>
+        <w:rPr>
+          <w:sz w:val="22"/>
+          <w:szCs w:val="22"/>
+        </w:rPr>
+        <w:t xml:space="preserve"> and </w:t>
+      </w:r>
+      <w:r>
+        <w:rPr>
+          <w:sz w:val="22"/>
+          <w:szCs w:val="22"/>
+        </w:rPr>
+        <w:t xml:space="preserve">correct </w:t>
+      </w:r>
+      <w:r>
+        <w:rPr>
+          <w:sz w:val="22"/>
+          <w:szCs w:val="22"/>
+        </w:rPr>
+        <w:t>final hands</w:t>
+      </w:r>
+      <w:r>
+        <w:rPr>
+          <w:sz w:val="22"/>
+          <w:szCs w:val="22"/>
+        </w:rPr>
+        <w:t xml:space="preserve"> and </w:t>
+      </w:r>
+      <w:r>
+        <w:rPr>
+          <w:sz w:val="22"/>
+          <w:szCs w:val="22"/>
+        </w:rPr>
+        <w:t>invalid card pack input</w:t>
+      </w:r>
+      <w:r>
+        <w:rPr>
+          <w:sz w:val="22"/>
+          <w:szCs w:val="22"/>
+        </w:rPr>
+        <w:t xml:space="preserve"> behaviour.</w:t>
+      </w:r>
+    </w:p>
+    <w:p>
+      <w:pPr>
+        <w:rPr>
+          <w:sz w:val="22"/>
+          <w:szCs w:val="22"/>
+        </w:rPr>
+      </w:pPr>
+    </w:p>
+    <w:p>
+      <w:pPr>
+        <w:rPr>
+          <w:b/>
+          <w:bCs/>
+          <w:sz w:val="22"/>
+          <w:szCs w:val="22"/>
+        </w:rPr>
+      </w:pPr>
+      <w:r>
+        <w:rPr>
+          <w:b/>
+          <w:bCs/>
+          <w:sz w:val="22"/>
+          <w:szCs w:val="22"/>
+        </w:rPr>
+        <w:t>Significant Version</w:t>
+      </w:r>
+      <w:r>
+        <w:rPr>
+          <w:b/>
+          <w:bCs/>
+          <w:sz w:val="22"/>
+          <w:szCs w:val="22"/>
+        </w:rPr>
+        <w:t>-</w:t>
+      </w:r>
+      <w:r>
+        <w:rPr>
+          <w:b/>
+          <w:bCs/>
+          <w:sz w:val="22"/>
+          <w:szCs w:val="22"/>
+        </w:rPr>
+        <w:t>Control Commits</w:t>
+      </w:r>
+    </w:p>
+    <w:p>
+      <w:pPr>
+        <w:pStyle w:val="ListParagraph"/>
+        <w:numPr>
+          <w:ilvl w:val="0"/>
+          <w:numId w:val="2"/>
+        </w:numPr>
+        <w:rPr>
+          <w:sz w:val="22"/>
+          <w:szCs w:val="22"/>
+        </w:rPr>
+      </w:pPr>
+      <w:r>
+        <w:rPr>
+          <w:b/>
+          <w:bCs/>
+          <w:sz w:val="22"/>
+          <w:szCs w:val="22"/>
+        </w:rPr>
+        <w:t xml:space="preserve">Commit </w:t>
+      </w:r>
+      <w:r>
+        <w:rPr>
+          <w:b/>
+          <w:bCs/>
+          <w:sz w:val="22"/>
+          <w:szCs w:val="22"/>
+        </w:rPr>
+        <w:t>ID:</w:t>
+      </w:r>
+      <w:r>
+        <w:rPr>
+          <w:sz w:val="22"/>
+          <w:szCs w:val="22"/>
+        </w:rPr>
+        <w:t xml:space="preserve"> </w:t>
+      </w:r>
+      <w:r>
+        <w:rPr>
+          <w:i/>
+          <w:iCs/>
+          <w:sz w:val="22"/>
+          <w:szCs w:val="22"/>
+        </w:rPr>
+        <w:t>0295a4e</w:t>
+      </w:r>
+      <w:r>
+        <w:rPr>
+          <w:sz w:val="22"/>
+          <w:szCs w:val="22"/>
+        </w:rPr>
+        <w:t xml:space="preserve"> (</w:t>
+      </w:r>
+      <w:r>
+        <w:rPr>
+          <w:sz w:val="22"/>
+          <w:szCs w:val="22"/>
+        </w:rPr>
+        <w:t>2/10/26</w:t>
+      </w:r>
+      <w:r>
+        <w:rPr>
+          <w:sz w:val="22"/>
+          <w:szCs w:val="22"/>
+        </w:rPr>
+        <w:t>)</w:t>
+      </w:r>
+      <w:r>
+        <w:rPr>
+          <w:sz w:val="22"/>
+          <w:szCs w:val="22"/>
+        </w:rPr>
+        <w:t>: Added foundations of Player class turn logic and CardDeck</w:t>
+      </w:r>
+      <w:r>
+        <w:rPr>
+          <w:sz w:val="22"/>
+          <w:szCs w:val="22"/>
+        </w:rPr>
+        <w:t xml:space="preserve"> pickup and discard card logic</w:t>
+      </w:r>
+    </w:p>
+    <w:p>
+      <w:pPr>
+        <w:pStyle w:val="ListParagraph"/>
+        <w:numPr>
+          <w:ilvl w:val="0"/>
+          <w:numId w:val="2"/>
+        </w:numPr>
+        <w:rPr>
+          <w:sz w:val="22"/>
+          <w:szCs w:val="22"/>
+        </w:rPr>
+      </w:pPr>
+      <w:r>
+        <w:rPr>
+          <w:b/>
+          <w:bCs/>
+          <w:sz w:val="22"/>
+          <w:szCs w:val="22"/>
+        </w:rPr>
+        <w:t xml:space="preserve">Commit </w:t>
+      </w:r>
+      <w:r>
+        <w:rPr>
+          <w:b/>
+          <w:bCs/>
+          <w:sz w:val="22"/>
+          <w:szCs w:val="22"/>
+        </w:rPr>
+        <w:t>ID:</w:t>
+      </w:r>
+      <w:r>
+        <w:rPr>
+          <w:sz w:val="22"/>
+          <w:szCs w:val="22"/>
+        </w:rPr>
+        <w:t xml:space="preserve"> </w:t>
+      </w:r>
+      <w:r>
+        <w:rPr>
+          <w:i/>
+          <w:iCs/>
+          <w:sz w:val="22"/>
+          <w:szCs w:val="22"/>
+        </w:rPr>
+        <w:t>005b133</w:t>
+      </w:r>
+      <w:r>
+        <w:rPr>
+          <w:i/>
+          <w:iCs/>
+          <w:sz w:val="22"/>
+          <w:szCs w:val="22"/>
+        </w:rPr>
+        <w:t xml:space="preserve"> </w:t>
+      </w:r>
+      <w:r>
+        <w:rPr>
+          <w:sz w:val="22"/>
+          <w:szCs w:val="22"/>
+        </w:rPr>
+        <w:t>(</w:t>
+      </w:r>
+      <w:r>
+        <w:rPr>
+          <w:sz w:val="22"/>
+          <w:szCs w:val="22"/>
+        </w:rPr>
+        <w:t>4</w:t>
+      </w:r>
+      <w:r>
+        <w:rPr>
+          <w:sz w:val="22"/>
+          <w:szCs w:val="22"/>
+        </w:rPr>
+        <w:t xml:space="preserve">/10/26): </w:t>
+      </w:r>
+      <w:r>
+        <w:rPr>
+          <w:sz w:val="22"/>
+          <w:szCs w:val="22"/>
+        </w:rPr>
+        <w:t>Implemented the start of game player and card pack location</w:t>
+      </w:r>
+      <w:r>
+        <w:rPr>
+          <w:sz w:val="22"/>
+          <w:szCs w:val="22"/>
+        </w:rPr>
+        <w:t xml:space="preserve"> and reading logic and improved the thread safety of </w:t>
+      </w:r>
+      <w:r>
+        <w:rPr>
+          <w:sz w:val="22"/>
+          <w:szCs w:val="22"/>
+        </w:rPr>
+        <w:t xml:space="preserve">the </w:t>
+      </w:r>
+      <w:r>
+        <w:rPr>
+          <w:i/>
+          <w:iCs/>
+          <w:sz w:val="22"/>
+          <w:szCs w:val="22"/>
+        </w:rPr>
+        <w:t>drawCard</w:t>
+      </w:r>
+      <w:r>
+        <w:rPr>
+          <w:sz w:val="22"/>
+          <w:szCs w:val="22"/>
+        </w:rPr>
+        <w:t xml:space="preserve"> and </w:t>
+      </w:r>
+      <w:r>
+        <w:rPr>
+          <w:i/>
+          <w:iCs/>
+          <w:sz w:val="22"/>
+          <w:szCs w:val="22"/>
+        </w:rPr>
+        <w:t>addCard</w:t>
+      </w:r>
+      <w:r>
+        <w:rPr>
+          <w:sz w:val="22"/>
+          <w:szCs w:val="22"/>
+        </w:rPr>
+        <w:t xml:space="preserve"> </w:t>
+      </w:r>
+      <w:r>
+        <w:rPr>
+          <w:sz w:val="22"/>
+          <w:szCs w:val="22"/>
+        </w:rPr>
+        <w:t>functions</w:t>
+      </w:r>
+    </w:p>
+    <w:p>
+      <w:pPr>
+        <w:pStyle w:val="ListParagraph"/>
+        <w:numPr>
+          <w:ilvl w:val="0"/>
+          <w:numId w:val="2"/>
+        </w:numPr>
+        <w:rPr>
+          <w:sz w:val="22"/>
+          <w:szCs w:val="22"/>
+        </w:rPr>
+      </w:pPr>
+      <w:r>
+        <w:rPr>
+          <w:b/>
+          <w:bCs/>
+          <w:sz w:val="22"/>
+          <w:szCs w:val="22"/>
+        </w:rPr>
+        <w:t xml:space="preserve">Commit </w:t>
+      </w:r>
+      <w:r>
+        <w:rPr>
+          <w:b/>
+          <w:bCs/>
+          <w:sz w:val="22"/>
+          <w:szCs w:val="22"/>
+        </w:rPr>
+        <w:t>ID:</w:t>
+      </w:r>
+      <w:r>
+        <w:rPr>
+          <w:sz w:val="22"/>
+          <w:szCs w:val="22"/>
+        </w:rPr>
+        <w:t xml:space="preserve"> </w:t>
+      </w:r>
+      <w:r>
+        <w:rPr>
+          <w:i/>
+          <w:iCs/>
+          <w:sz w:val="22"/>
+          <w:szCs w:val="22"/>
+        </w:rPr>
+        <w:t>d911cfe</w:t>
+      </w:r>
+      <w:r>
+        <w:rPr>
+          <w:i/>
+          <w:iCs/>
+          <w:sz w:val="22"/>
+          <w:szCs w:val="22"/>
+        </w:rPr>
+        <w:t xml:space="preserve"> </w:t>
+      </w:r>
+      <w:r>
+        <w:rPr>
+          <w:sz w:val="22"/>
+          <w:szCs w:val="22"/>
+        </w:rPr>
+        <w:t>(</w:t>
+      </w:r>
+      <w:r>
+        <w:rPr>
+          <w:sz w:val="22"/>
+          <w:szCs w:val="22"/>
+        </w:rPr>
+        <w:t>6</w:t>
+      </w:r>
+      <w:r>
+        <w:rPr>
+          <w:sz w:val="22"/>
+          <w:szCs w:val="22"/>
+        </w:rPr>
+        <w:t xml:space="preserve">/10/26): </w:t>
+      </w:r>
+      <w:r>
+        <w:rPr>
+          <w:sz w:val="22"/>
+          <w:szCs w:val="22"/>
+        </w:rPr>
+        <w:t>Got JUnit 5 working with the project</w:t>
+      </w:r>
+      <w:r>
+        <w:rPr>
+          <w:sz w:val="22"/>
+          <w:szCs w:val="22"/>
+        </w:rPr>
+        <w:t xml:space="preserve"> after </w:t>
+      </w:r>
+      <w:r>
+        <w:rPr>
+          <w:sz w:val="22"/>
+          <w:szCs w:val="22"/>
+        </w:rPr>
+        <w:t>restructuring</w:t>
+      </w:r>
+      <w:r>
+        <w:rPr>
+          <w:sz w:val="22"/>
+          <w:szCs w:val="22"/>
+        </w:rPr>
+        <w:t xml:space="preserve"> the layout</w:t>
+      </w:r>
+      <w:r>
+        <w:rPr>
+          <w:sz w:val="22"/>
+          <w:szCs w:val="22"/>
+        </w:rPr>
+        <w:t xml:space="preserve"> and added </w:t>
+      </w:r>
+      <w:r>
+        <w:rPr>
+          <w:sz w:val="22"/>
+          <w:szCs w:val="22"/>
+        </w:rPr>
+        <w:t>first player hand and card deck</w:t>
+      </w:r>
+      <w:r>
+        <w:rPr>
+          <w:sz w:val="22"/>
+          <w:szCs w:val="22"/>
+        </w:rPr>
+        <w:t xml:space="preserve"> contents</w:t>
+      </w:r>
+      <w:r>
+        <w:rPr>
+          <w:sz w:val="22"/>
+          <w:szCs w:val="22"/>
+        </w:rPr>
+        <w:t xml:space="preserve"> tests</w:t>
+      </w:r>
+    </w:p>
+    <w:p>
+      <w:pPr>
+        <w:pStyle w:val="ListParagraph"/>
+        <w:numPr>
+          <w:ilvl w:val="0"/>
+          <w:numId w:val="2"/>
+        </w:numPr>
+        <w:rPr>
+          <w:sz w:val="22"/>
+          <w:szCs w:val="22"/>
+        </w:rPr>
+      </w:pPr>
+      <w:r>
+        <w:rPr>
+          <w:b/>
+          <w:bCs/>
+          <w:sz w:val="22"/>
+          <w:szCs w:val="22"/>
+        </w:rPr>
+        <w:t xml:space="preserve">Commit </w:t>
+      </w:r>
+      <w:r>
+        <w:rPr>
+          <w:b/>
+          <w:bCs/>
+          <w:sz w:val="22"/>
+          <w:szCs w:val="22"/>
+        </w:rPr>
+        <w:t>ID:</w:t>
+      </w:r>
+      <w:r>
+        <w:rPr>
+          <w:sz w:val="22"/>
+          <w:szCs w:val="22"/>
+        </w:rPr>
+        <w:t xml:space="preserve"> </w:t>
+      </w:r>
+      <w:r>
+        <w:rPr>
+          <w:i/>
+          <w:iCs/>
+          <w:sz w:val="22"/>
+          <w:szCs w:val="22"/>
+        </w:rPr>
+        <w:t>0b1f470</w:t>
+      </w:r>
+      <w:r>
+        <w:rPr>
+          <w:i/>
+          <w:iCs/>
+          <w:sz w:val="22"/>
+          <w:szCs w:val="22"/>
+        </w:rPr>
+        <w:t xml:space="preserve"> </w:t>
+      </w:r>
+      <w:r>
+        <w:rPr>
+          <w:sz w:val="22"/>
+          <w:szCs w:val="22"/>
+        </w:rPr>
+        <w:t>(</w:t>
+      </w:r>
+      <w:r>
+        <w:rPr>
+          <w:sz w:val="22"/>
+          <w:szCs w:val="22"/>
+        </w:rPr>
+        <w:t>11</w:t>
+      </w:r>
+      <w:r>
+        <w:rPr>
+          <w:sz w:val="22"/>
+          <w:szCs w:val="22"/>
+        </w:rPr>
+        <w:t>/10/26):</w:t>
+      </w:r>
+      <w:r>
+        <w:rPr>
+          <w:sz w:val="22"/>
+          <w:szCs w:val="22"/>
+        </w:rPr>
+        <w:t xml:space="preserve"> I</w:t>
+      </w:r>
+      <w:r>
+        <w:rPr>
+          <w:sz w:val="22"/>
+          <w:szCs w:val="22"/>
+        </w:rPr>
+        <w:t xml:space="preserve">mplemented </w:t>
+      </w:r>
+      <w:r>
+        <w:rPr>
+          <w:sz w:val="22"/>
+          <w:szCs w:val="22"/>
+        </w:rPr>
+        <w:t xml:space="preserve">the </w:t>
+      </w:r>
+      <w:r>
+        <w:rPr>
+          <w:sz w:val="22"/>
+          <w:szCs w:val="22"/>
+        </w:rPr>
+        <w:t>foundations for the</w:t>
+      </w:r>
+      <w:r>
+        <w:rPr>
+          <w:sz w:val="22"/>
+          <w:szCs w:val="22"/>
+        </w:rPr>
+        <w:t xml:space="preserve"> </w:t>
+      </w:r>
+      <w:r>
+        <w:rPr>
+          <w:sz w:val="22"/>
+          <w:szCs w:val="22"/>
+        </w:rPr>
+        <w:t xml:space="preserve">logging </w:t>
+      </w:r>
+      <w:r>
+        <w:rPr>
+          <w:sz w:val="22"/>
+          <w:szCs w:val="22"/>
+        </w:rPr>
+        <w:t>for the Player</w:t>
+      </w:r>
+      <w:r>
+        <w:rPr>
+          <w:sz w:val="22"/>
+          <w:szCs w:val="22"/>
+        </w:rPr>
+        <w:t xml:space="preserve"> and </w:t>
+      </w:r>
+      <w:r>
+        <w:rPr>
+          <w:sz w:val="22"/>
+          <w:szCs w:val="22"/>
+        </w:rPr>
+        <w:t>CardDeck</w:t>
+      </w:r>
+      <w:r>
+        <w:rPr>
+          <w:sz w:val="22"/>
+          <w:szCs w:val="22"/>
+        </w:rPr>
+        <w:t xml:space="preserve"> classes</w:t>
+      </w:r>
+      <w:r>
+        <w:rPr>
+          <w:sz w:val="22"/>
+          <w:szCs w:val="22"/>
+        </w:rPr>
+        <w:t xml:space="preserve"> and debugged</w:t>
+      </w:r>
+      <w:r>
+        <w:rPr>
+          <w:sz w:val="22"/>
+          <w:szCs w:val="22"/>
+        </w:rPr>
+        <w:t xml:space="preserve"> an issue with the file writer overwriting old logs</w:t>
       </w:r>
     </w:p>
     <w:p>
@@ -1210,8 +2378,583 @@
       </w:rPr>
     </w:lvl>
   </w:abstractNum>
+  <w:abstractNum w:abstractNumId="1" w15:restartNumberingAfterBreak="0">
+    <w:nsid w:val="152F65AB"/>
+    <w:multiLevelType w:val="hybridMultilevel"/>
+    <w:tmpl w:val="9B629020"/>
+    <w:lvl w:ilvl="0" w:tplc="5768820C">
+      <w:numFmt w:val="bullet"/>
+      <w:lvlText w:val="-"/>
+      <w:lvlJc w:val="left"/>
+      <w:pPr>
+        <w:ind w:left="720" w:hanging="360"/>
+      </w:pPr>
+      <w:rPr>
+        <w:rFonts w:ascii="Aptos" w:eastAsiaTheme="minorEastAsia" w:hAnsi="Aptos" w:cstheme="minorBidi" w:hint="default"/>
+      </w:rPr>
+    </w:lvl>
+    <w:lvl w:ilvl="1" w:tplc="08090003" w:tentative="1">
+      <w:start w:val="1"/>
+      <w:numFmt w:val="bullet"/>
+      <w:lvlText w:val="o"/>
+      <w:lvlJc w:val="left"/>
+      <w:pPr>
+        <w:ind w:left="1440" w:hanging="360"/>
+      </w:pPr>
+      <w:rPr>
+        <w:rFonts w:ascii="Courier New" w:hAnsi="Courier New" w:cs="Courier New" w:hint="default"/>
+      </w:rPr>
+    </w:lvl>
+    <w:lvl w:ilvl="2" w:tplc="08090005" w:tentative="1">
+      <w:start w:val="1"/>
+      <w:numFmt w:val="bullet"/>
+      <w:lvlText w:val=""/>
+      <w:lvlJc w:val="left"/>
+      <w:pPr>
+        <w:ind w:left="2160" w:hanging="360"/>
+      </w:pPr>
+      <w:rPr>
+        <w:rFonts w:ascii="Wingdings" w:hAnsi="Wingdings" w:hint="default"/>
+      </w:rPr>
+    </w:lvl>
+    <w:lvl w:ilvl="3" w:tplc="08090001" w:tentative="1">
+      <w:start w:val="1"/>
+      <w:numFmt w:val="bullet"/>
+      <w:lvlText w:val=""/>
+      <w:lvlJc w:val="left"/>
+      <w:pPr>
+        <w:ind w:left="2880" w:hanging="360"/>
+      </w:pPr>
+      <w:rPr>
+        <w:rFonts w:ascii="Symbol" w:hAnsi="Symbol" w:hint="default"/>
+      </w:rPr>
+    </w:lvl>
+    <w:lvl w:ilvl="4" w:tplc="08090003" w:tentative="1">
+      <w:start w:val="1"/>
+      <w:numFmt w:val="bullet"/>
+      <w:lvlText w:val="o"/>
+      <w:lvlJc w:val="left"/>
+      <w:pPr>
+        <w:ind w:left="3600" w:hanging="360"/>
+      </w:pPr>
+      <w:rPr>
+        <w:rFonts w:ascii="Courier New" w:hAnsi="Courier New" w:cs="Courier New" w:hint="default"/>
+      </w:rPr>
+    </w:lvl>
+    <w:lvl w:ilvl="5" w:tplc="08090005" w:tentative="1">
+      <w:start w:val="1"/>
+      <w:numFmt w:val="bullet"/>
+      <w:lvlText w:val=""/>
+      <w:lvlJc w:val="left"/>
+      <w:pPr>
+        <w:ind w:left="4320" w:hanging="360"/>
+      </w:pPr>
+      <w:rPr>
+        <w:rFonts w:ascii="Wingdings" w:hAnsi="Wingdings" w:hint="default"/>
+      </w:rPr>
+    </w:lvl>
+    <w:lvl w:ilvl="6" w:tplc="08090001" w:tentative="1">
+      <w:start w:val="1"/>
+      <w:numFmt w:val="bullet"/>
+      <w:lvlText w:val=""/>
+      <w:lvlJc w:val="left"/>
+      <w:pPr>
+        <w:ind w:left="5040" w:hanging="360"/>
+      </w:pPr>
+      <w:rPr>
+        <w:rFonts w:ascii="Symbol" w:hAnsi="Symbol" w:hint="default"/>
+      </w:rPr>
+    </w:lvl>
+    <w:lvl w:ilvl="7" w:tplc="08090003" w:tentative="1">
+      <w:start w:val="1"/>
+      <w:numFmt w:val="bullet"/>
+      <w:lvlText w:val="o"/>
+      <w:lvlJc w:val="left"/>
+      <w:pPr>
+        <w:ind w:left="5760" w:hanging="360"/>
+      </w:pPr>
+      <w:rPr>
+        <w:rFonts w:ascii="Courier New" w:hAnsi="Courier New" w:cs="Courier New" w:hint="default"/>
+      </w:rPr>
+    </w:lvl>
+    <w:lvl w:ilvl="8" w:tplc="08090005" w:tentative="1">
+      <w:start w:val="1"/>
+      <w:numFmt w:val="bullet"/>
+      <w:lvlText w:val=""/>
+      <w:lvlJc w:val="left"/>
+      <w:pPr>
+        <w:ind w:left="6480" w:hanging="360"/>
+      </w:pPr>
+      <w:rPr>
+        <w:rFonts w:ascii="Wingdings" w:hAnsi="Wingdings" w:hint="default"/>
+      </w:rPr>
+    </w:lvl>
+  </w:abstractNum>
+  <w:abstractNum w:abstractNumId="2" w15:restartNumberingAfterBreak="0">
+    <w:nsid w:val="1BE837AE"/>
+    <w:multiLevelType w:val="hybridMultilevel"/>
+    <w:tmpl w:val="1DF477FC"/>
+    <w:lvl w:ilvl="0" w:tplc="37E49608">
+      <w:numFmt w:val="bullet"/>
+      <w:lvlText w:val="-"/>
+      <w:lvlJc w:val="left"/>
+      <w:pPr>
+        <w:ind w:left="720" w:hanging="360"/>
+      </w:pPr>
+      <w:rPr>
+        <w:rFonts w:ascii="Aptos" w:eastAsiaTheme="minorEastAsia" w:hAnsi="Aptos" w:cstheme="minorBidi" w:hint="default"/>
+      </w:rPr>
+    </w:lvl>
+    <w:lvl w:ilvl="1" w:tplc="08090003" w:tentative="1">
+      <w:start w:val="1"/>
+      <w:numFmt w:val="bullet"/>
+      <w:lvlText w:val="o"/>
+      <w:lvlJc w:val="left"/>
+      <w:pPr>
+        <w:ind w:left="1440" w:hanging="360"/>
+      </w:pPr>
+      <w:rPr>
+        <w:rFonts w:ascii="Courier New" w:hAnsi="Courier New" w:cs="Courier New" w:hint="default"/>
+      </w:rPr>
+    </w:lvl>
+    <w:lvl w:ilvl="2" w:tplc="08090005" w:tentative="1">
+      <w:start w:val="1"/>
+      <w:numFmt w:val="bullet"/>
+      <w:lvlText w:val=""/>
+      <w:lvlJc w:val="left"/>
+      <w:pPr>
+        <w:ind w:left="2160" w:hanging="360"/>
+      </w:pPr>
+      <w:rPr>
+        <w:rFonts w:ascii="Wingdings" w:hAnsi="Wingdings" w:hint="default"/>
+      </w:rPr>
+    </w:lvl>
+    <w:lvl w:ilvl="3" w:tplc="08090001" w:tentative="1">
+      <w:start w:val="1"/>
+      <w:numFmt w:val="bullet"/>
+      <w:lvlText w:val=""/>
+      <w:lvlJc w:val="left"/>
+      <w:pPr>
+        <w:ind w:left="2880" w:hanging="360"/>
+      </w:pPr>
+      <w:rPr>
+        <w:rFonts w:ascii="Symbol" w:hAnsi="Symbol" w:hint="default"/>
+      </w:rPr>
+    </w:lvl>
+    <w:lvl w:ilvl="4" w:tplc="08090003" w:tentative="1">
+      <w:start w:val="1"/>
+      <w:numFmt w:val="bullet"/>
+      <w:lvlText w:val="o"/>
+      <w:lvlJc w:val="left"/>
+      <w:pPr>
+        <w:ind w:left="3600" w:hanging="360"/>
+      </w:pPr>
+      <w:rPr>
+        <w:rFonts w:ascii="Courier New" w:hAnsi="Courier New" w:cs="Courier New" w:hint="default"/>
+      </w:rPr>
+    </w:lvl>
+    <w:lvl w:ilvl="5" w:tplc="08090005" w:tentative="1">
+      <w:start w:val="1"/>
+      <w:numFmt w:val="bullet"/>
+      <w:lvlText w:val=""/>
+      <w:lvlJc w:val="left"/>
+      <w:pPr>
+        <w:ind w:left="4320" w:hanging="360"/>
+      </w:pPr>
+      <w:rPr>
+        <w:rFonts w:ascii="Wingdings" w:hAnsi="Wingdings" w:hint="default"/>
+      </w:rPr>
+    </w:lvl>
+    <w:lvl w:ilvl="6" w:tplc="08090001" w:tentative="1">
+      <w:start w:val="1"/>
+      <w:numFmt w:val="bullet"/>
+      <w:lvlText w:val=""/>
+      <w:lvlJc w:val="left"/>
+      <w:pPr>
+        <w:ind w:left="5040" w:hanging="360"/>
+      </w:pPr>
+      <w:rPr>
+        <w:rFonts w:ascii="Symbol" w:hAnsi="Symbol" w:hint="default"/>
+      </w:rPr>
+    </w:lvl>
+    <w:lvl w:ilvl="7" w:tplc="08090003" w:tentative="1">
+      <w:start w:val="1"/>
+      <w:numFmt w:val="bullet"/>
+      <w:lvlText w:val="o"/>
+      <w:lvlJc w:val="left"/>
+      <w:pPr>
+        <w:ind w:left="5760" w:hanging="360"/>
+      </w:pPr>
+      <w:rPr>
+        <w:rFonts w:ascii="Courier New" w:hAnsi="Courier New" w:cs="Courier New" w:hint="default"/>
+      </w:rPr>
+    </w:lvl>
+    <w:lvl w:ilvl="8" w:tplc="08090005" w:tentative="1">
+      <w:start w:val="1"/>
+      <w:numFmt w:val="bullet"/>
+      <w:lvlText w:val=""/>
+      <w:lvlJc w:val="left"/>
+      <w:pPr>
+        <w:ind w:left="6480" w:hanging="360"/>
+      </w:pPr>
+      <w:rPr>
+        <w:rFonts w:ascii="Wingdings" w:hAnsi="Wingdings" w:hint="default"/>
+      </w:rPr>
+    </w:lvl>
+  </w:abstractNum>
+  <w:abstractNum w:abstractNumId="3" w15:restartNumberingAfterBreak="0">
+    <w:nsid w:val="1F727D91"/>
+    <w:multiLevelType w:val="hybridMultilevel"/>
+    <w:tmpl w:val="DCBC980E"/>
+    <w:lvl w:ilvl="0" w:tplc="C544517E">
+      <w:numFmt w:val="bullet"/>
+      <w:lvlText w:val="-"/>
+      <w:lvlJc w:val="left"/>
+      <w:pPr>
+        <w:ind w:left="720" w:hanging="360"/>
+      </w:pPr>
+      <w:rPr>
+        <w:rFonts w:ascii="Aptos" w:eastAsiaTheme="minorEastAsia" w:hAnsi="Aptos" w:cstheme="minorBidi" w:hint="default"/>
+      </w:rPr>
+    </w:lvl>
+    <w:lvl w:ilvl="1" w:tplc="08090003" w:tentative="1">
+      <w:start w:val="1"/>
+      <w:numFmt w:val="bullet"/>
+      <w:lvlText w:val="o"/>
+      <w:lvlJc w:val="left"/>
+      <w:pPr>
+        <w:ind w:left="1440" w:hanging="360"/>
+      </w:pPr>
+      <w:rPr>
+        <w:rFonts w:ascii="Courier New" w:hAnsi="Courier New" w:cs="Courier New" w:hint="default"/>
+      </w:rPr>
+    </w:lvl>
+    <w:lvl w:ilvl="2" w:tplc="08090005" w:tentative="1">
+      <w:start w:val="1"/>
+      <w:numFmt w:val="bullet"/>
+      <w:lvlText w:val=""/>
+      <w:lvlJc w:val="left"/>
+      <w:pPr>
+        <w:ind w:left="2160" w:hanging="360"/>
+      </w:pPr>
+      <w:rPr>
+        <w:rFonts w:ascii="Wingdings" w:hAnsi="Wingdings" w:hint="default"/>
+      </w:rPr>
+    </w:lvl>
+    <w:lvl w:ilvl="3" w:tplc="08090001" w:tentative="1">
+      <w:start w:val="1"/>
+      <w:numFmt w:val="bullet"/>
+      <w:lvlText w:val=""/>
+      <w:lvlJc w:val="left"/>
+      <w:pPr>
+        <w:ind w:left="2880" w:hanging="360"/>
+      </w:pPr>
+      <w:rPr>
+        <w:rFonts w:ascii="Symbol" w:hAnsi="Symbol" w:hint="default"/>
+      </w:rPr>
+    </w:lvl>
+    <w:lvl w:ilvl="4" w:tplc="08090003" w:tentative="1">
+      <w:start w:val="1"/>
+      <w:numFmt w:val="bullet"/>
+      <w:lvlText w:val="o"/>
+      <w:lvlJc w:val="left"/>
+      <w:pPr>
+        <w:ind w:left="3600" w:hanging="360"/>
+      </w:pPr>
+      <w:rPr>
+        <w:rFonts w:ascii="Courier New" w:hAnsi="Courier New" w:cs="Courier New" w:hint="default"/>
+      </w:rPr>
+    </w:lvl>
+    <w:lvl w:ilvl="5" w:tplc="08090005" w:tentative="1">
+      <w:start w:val="1"/>
+      <w:numFmt w:val="bullet"/>
+      <w:lvlText w:val=""/>
+      <w:lvlJc w:val="left"/>
+      <w:pPr>
+        <w:ind w:left="4320" w:hanging="360"/>
+      </w:pPr>
+      <w:rPr>
+        <w:rFonts w:ascii="Wingdings" w:hAnsi="Wingdings" w:hint="default"/>
+      </w:rPr>
+    </w:lvl>
+    <w:lvl w:ilvl="6" w:tplc="08090001" w:tentative="1">
+      <w:start w:val="1"/>
+      <w:numFmt w:val="bullet"/>
+      <w:lvlText w:val=""/>
+      <w:lvlJc w:val="left"/>
+      <w:pPr>
+        <w:ind w:left="5040" w:hanging="360"/>
+      </w:pPr>
+      <w:rPr>
+        <w:rFonts w:ascii="Symbol" w:hAnsi="Symbol" w:hint="default"/>
+      </w:rPr>
+    </w:lvl>
+    <w:lvl w:ilvl="7" w:tplc="08090003" w:tentative="1">
+      <w:start w:val="1"/>
+      <w:numFmt w:val="bullet"/>
+      <w:lvlText w:val="o"/>
+      <w:lvlJc w:val="left"/>
+      <w:pPr>
+        <w:ind w:left="5760" w:hanging="360"/>
+      </w:pPr>
+      <w:rPr>
+        <w:rFonts w:ascii="Courier New" w:hAnsi="Courier New" w:cs="Courier New" w:hint="default"/>
+      </w:rPr>
+    </w:lvl>
+    <w:lvl w:ilvl="8" w:tplc="08090005" w:tentative="1">
+      <w:start w:val="1"/>
+      <w:numFmt w:val="bullet"/>
+      <w:lvlText w:val=""/>
+      <w:lvlJc w:val="left"/>
+      <w:pPr>
+        <w:ind w:left="6480" w:hanging="360"/>
+      </w:pPr>
+      <w:rPr>
+        <w:rFonts w:ascii="Wingdings" w:hAnsi="Wingdings" w:hint="default"/>
+      </w:rPr>
+    </w:lvl>
+  </w:abstractNum>
+  <w:abstractNum w:abstractNumId="4" w15:restartNumberingAfterBreak="0">
+    <w:nsid w:val="20093B26"/>
+    <w:multiLevelType w:val="hybridMultilevel"/>
+    <w:tmpl w:val="FB5C8ADE"/>
+    <w:lvl w:ilvl="0" w:tplc="9CFAA5D8">
+      <w:numFmt w:val="bullet"/>
+      <w:lvlText w:val="-"/>
+      <w:lvlJc w:val="left"/>
+      <w:pPr>
+        <w:ind w:left="720" w:hanging="360"/>
+      </w:pPr>
+      <w:rPr>
+        <w:rFonts w:ascii="Aptos" w:eastAsiaTheme="minorEastAsia" w:hAnsi="Aptos" w:cstheme="minorBidi" w:hint="default"/>
+      </w:rPr>
+    </w:lvl>
+    <w:lvl w:ilvl="1" w:tplc="08090003" w:tentative="1">
+      <w:start w:val="1"/>
+      <w:numFmt w:val="bullet"/>
+      <w:lvlText w:val="o"/>
+      <w:lvlJc w:val="left"/>
+      <w:pPr>
+        <w:ind w:left="1440" w:hanging="360"/>
+      </w:pPr>
+      <w:rPr>
+        <w:rFonts w:ascii="Courier New" w:hAnsi="Courier New" w:cs="Courier New" w:hint="default"/>
+      </w:rPr>
+    </w:lvl>
+    <w:lvl w:ilvl="2" w:tplc="08090005" w:tentative="1">
+      <w:start w:val="1"/>
+      <w:numFmt w:val="bullet"/>
+      <w:lvlText w:val=""/>
+      <w:lvlJc w:val="left"/>
+      <w:pPr>
+        <w:ind w:left="2160" w:hanging="360"/>
+      </w:pPr>
+      <w:rPr>
+        <w:rFonts w:ascii="Wingdings" w:hAnsi="Wingdings" w:hint="default"/>
+      </w:rPr>
+    </w:lvl>
+    <w:lvl w:ilvl="3" w:tplc="08090001" w:tentative="1">
+      <w:start w:val="1"/>
+      <w:numFmt w:val="bullet"/>
+      <w:lvlText w:val=""/>
+      <w:lvlJc w:val="left"/>
+      <w:pPr>
+        <w:ind w:left="2880" w:hanging="360"/>
+      </w:pPr>
+      <w:rPr>
+        <w:rFonts w:ascii="Symbol" w:hAnsi="Symbol" w:hint="default"/>
+      </w:rPr>
+    </w:lvl>
+    <w:lvl w:ilvl="4" w:tplc="08090003" w:tentative="1">
+      <w:start w:val="1"/>
+      <w:numFmt w:val="bullet"/>
+      <w:lvlText w:val="o"/>
+      <w:lvlJc w:val="left"/>
+      <w:pPr>
+        <w:ind w:left="3600" w:hanging="360"/>
+      </w:pPr>
+      <w:rPr>
+        <w:rFonts w:ascii="Courier New" w:hAnsi="Courier New" w:cs="Courier New" w:hint="default"/>
+      </w:rPr>
+    </w:lvl>
+    <w:lvl w:ilvl="5" w:tplc="08090005" w:tentative="1">
+      <w:start w:val="1"/>
+      <w:numFmt w:val="bullet"/>
+      <w:lvlText w:val=""/>
+      <w:lvlJc w:val="left"/>
+      <w:pPr>
+        <w:ind w:left="4320" w:hanging="360"/>
+      </w:pPr>
+      <w:rPr>
+        <w:rFonts w:ascii="Wingdings" w:hAnsi="Wingdings" w:hint="default"/>
+      </w:rPr>
+    </w:lvl>
+    <w:lvl w:ilvl="6" w:tplc="08090001" w:tentative="1">
+      <w:start w:val="1"/>
+      <w:numFmt w:val="bullet"/>
+      <w:lvlText w:val=""/>
+      <w:lvlJc w:val="left"/>
+      <w:pPr>
+        <w:ind w:left="5040" w:hanging="360"/>
+      </w:pPr>
+      <w:rPr>
+        <w:rFonts w:ascii="Symbol" w:hAnsi="Symbol" w:hint="default"/>
+      </w:rPr>
+    </w:lvl>
+    <w:lvl w:ilvl="7" w:tplc="08090003" w:tentative="1">
+      <w:start w:val="1"/>
+      <w:numFmt w:val="bullet"/>
+      <w:lvlText w:val="o"/>
+      <w:lvlJc w:val="left"/>
+      <w:pPr>
+        <w:ind w:left="5760" w:hanging="360"/>
+      </w:pPr>
+      <w:rPr>
+        <w:rFonts w:ascii="Courier New" w:hAnsi="Courier New" w:cs="Courier New" w:hint="default"/>
+      </w:rPr>
+    </w:lvl>
+    <w:lvl w:ilvl="8" w:tplc="08090005" w:tentative="1">
+      <w:start w:val="1"/>
+      <w:numFmt w:val="bullet"/>
+      <w:lvlText w:val=""/>
+      <w:lvlJc w:val="left"/>
+      <w:pPr>
+        <w:ind w:left="6480" w:hanging="360"/>
+      </w:pPr>
+      <w:rPr>
+        <w:rFonts w:ascii="Wingdings" w:hAnsi="Wingdings" w:hint="default"/>
+      </w:rPr>
+    </w:lvl>
+  </w:abstractNum>
+  <w:abstractNum w:abstractNumId="5" w15:restartNumberingAfterBreak="0">
+    <w:nsid w:val="6355007F"/>
+    <w:multiLevelType w:val="hybridMultilevel"/>
+    <w:tmpl w:val="A1C468A2"/>
+    <w:lvl w:ilvl="0" w:tplc="F9EA3668">
+      <w:numFmt w:val="bullet"/>
+      <w:lvlText w:val="-"/>
+      <w:lvlJc w:val="left"/>
+      <w:pPr>
+        <w:ind w:left="720" w:hanging="360"/>
+      </w:pPr>
+      <w:rPr>
+        <w:rFonts w:ascii="Aptos" w:eastAsiaTheme="minorEastAsia" w:hAnsi="Aptos" w:cstheme="minorBidi" w:hint="default"/>
+      </w:rPr>
+    </w:lvl>
+    <w:lvl w:ilvl="1" w:tplc="08090003" w:tentative="1">
+      <w:start w:val="1"/>
+      <w:numFmt w:val="bullet"/>
+      <w:lvlText w:val="o"/>
+      <w:lvlJc w:val="left"/>
+      <w:pPr>
+        <w:ind w:left="1440" w:hanging="360"/>
+      </w:pPr>
+      <w:rPr>
+        <w:rFonts w:ascii="Courier New" w:hAnsi="Courier New" w:cs="Courier New" w:hint="default"/>
+      </w:rPr>
+    </w:lvl>
+    <w:lvl w:ilvl="2" w:tplc="08090005" w:tentative="1">
+      <w:start w:val="1"/>
+      <w:numFmt w:val="bullet"/>
+      <w:lvlText w:val=""/>
+      <w:lvlJc w:val="left"/>
+      <w:pPr>
+        <w:ind w:left="2160" w:hanging="360"/>
+      </w:pPr>
+      <w:rPr>
+        <w:rFonts w:ascii="Wingdings" w:hAnsi="Wingdings" w:hint="default"/>
+      </w:rPr>
+    </w:lvl>
+    <w:lvl w:ilvl="3" w:tplc="08090001" w:tentative="1">
+      <w:start w:val="1"/>
+      <w:numFmt w:val="bullet"/>
+      <w:lvlText w:val=""/>
+      <w:lvlJc w:val="left"/>
+      <w:pPr>
+        <w:ind w:left="2880" w:hanging="360"/>
+      </w:pPr>
+      <w:rPr>
+        <w:rFonts w:ascii="Symbol" w:hAnsi="Symbol" w:hint="default"/>
+      </w:rPr>
+    </w:lvl>
+    <w:lvl w:ilvl="4" w:tplc="08090003" w:tentative="1">
+      <w:start w:val="1"/>
+      <w:numFmt w:val="bullet"/>
+      <w:lvlText w:val="o"/>
+      <w:lvlJc w:val="left"/>
+      <w:pPr>
+        <w:ind w:left="3600" w:hanging="360"/>
+      </w:pPr>
+      <w:rPr>
+        <w:rFonts w:ascii="Courier New" w:hAnsi="Courier New" w:cs="Courier New" w:hint="default"/>
+      </w:rPr>
+    </w:lvl>
+    <w:lvl w:ilvl="5" w:tplc="08090005" w:tentative="1">
+      <w:start w:val="1"/>
+      <w:numFmt w:val="bullet"/>
+      <w:lvlText w:val=""/>
+      <w:lvlJc w:val="left"/>
+      <w:pPr>
+        <w:ind w:left="4320" w:hanging="360"/>
+      </w:pPr>
+      <w:rPr>
+        <w:rFonts w:ascii="Wingdings" w:hAnsi="Wingdings" w:hint="default"/>
+      </w:rPr>
+    </w:lvl>
+    <w:lvl w:ilvl="6" w:tplc="08090001" w:tentative="1">
+      <w:start w:val="1"/>
+      <w:numFmt w:val="bullet"/>
+      <w:lvlText w:val=""/>
+      <w:lvlJc w:val="left"/>
+      <w:pPr>
+        <w:ind w:left="5040" w:hanging="360"/>
+      </w:pPr>
+      <w:rPr>
+        <w:rFonts w:ascii="Symbol" w:hAnsi="Symbol" w:hint="default"/>
+      </w:rPr>
+    </w:lvl>
+    <w:lvl w:ilvl="7" w:tplc="08090003" w:tentative="1">
+      <w:start w:val="1"/>
+      <w:numFmt w:val="bullet"/>
+      <w:lvlText w:val="o"/>
+      <w:lvlJc w:val="left"/>
+      <w:pPr>
+        <w:ind w:left="5760" w:hanging="360"/>
+      </w:pPr>
+      <w:rPr>
+        <w:rFonts w:ascii="Courier New" w:hAnsi="Courier New" w:cs="Courier New" w:hint="default"/>
+      </w:rPr>
+    </w:lvl>
+    <w:lvl w:ilvl="8" w:tplc="08090005" w:tentative="1">
+      <w:start w:val="1"/>
+      <w:numFmt w:val="bullet"/>
+      <w:lvlText w:val=""/>
+      <w:lvlJc w:val="left"/>
+      <w:pPr>
+        <w:ind w:left="6480" w:hanging="360"/>
+      </w:pPr>
+      <w:rPr>
+        <w:rFonts w:ascii="Wingdings" w:hAnsi="Wingdings" w:hint="default"/>
+      </w:rPr>
+    </w:lvl>
+  </w:abstractNum>
   <w:num w:numId="1" w16cid:durableId="86998392">
     <w:abstractNumId w:val="0"/>
+  </w:num>
+  <w:num w:numId="2" w16cid:durableId="325986306">
+    <w:abstractNumId w:val="5"/>
+  </w:num>
+  <w:num w:numId="3" w16cid:durableId="268701480">
+    <w:abstractNumId w:val="2"/>
+  </w:num>
+  <w:num w:numId="4" w16cid:durableId="1338002465">
+    <w:abstractNumId w:val="3"/>
+  </w:num>
+  <w:num w:numId="5" w16cid:durableId="112752658">
+    <w:abstractNumId w:val="1"/>
+  </w:num>
+  <w:num w:numId="6" w16cid:durableId="38668913">
+    <w:abstractNumId w:val="4"/>
   </w:num>
 </w:numbering>
 </file>

</xml_diff>

<commit_message>
Updated Remaining Test Names + Finished The Report Document
- Updated the remaining test names to fit the JUnit naming style better

- Finished writing the report document
</commit_message>
<xml_diff>
--- a/report.docx
+++ b/report.docx
@@ -51,37 +51,50 @@
     <w:p>
       <w:pPr>
         <w:rPr>
-          <w:sz w:val="22"/>
-          <w:szCs w:val="22"/>
-        </w:rPr>
-      </w:pPr>
-      <w:r>
-        <w:rPr>
-          <w:sz w:val="22"/>
-          <w:szCs w:val="22"/>
-        </w:rPr>
-        <w:t>[</w:t>
-      </w:r>
-      <w:r>
-        <w:rPr>
-          <w:sz w:val="22"/>
-          <w:szCs w:val="22"/>
-        </w:rPr>
-        <w:t>Design rationale and critical report</w:t>
-      </w:r>
-      <w:r>
-        <w:rPr>
-          <w:sz w:val="22"/>
-          <w:szCs w:val="22"/>
-        </w:rPr>
-        <w:t xml:space="preserve"> – rationale and evaluation</w:t>
-      </w:r>
-      <w:r>
-        <w:rPr>
-          <w:sz w:val="22"/>
-          <w:szCs w:val="22"/>
-        </w:rPr>
-        <w:t>]</w:t>
+          <w:sz w:val="28"/>
+          <w:szCs w:val="28"/>
+          <w:u w:val="single"/>
+        </w:rPr>
+      </w:pPr>
+      <w:r>
+        <w:rPr>
+          <w:sz w:val="28"/>
+          <w:szCs w:val="28"/>
+          <w:u w:val="single"/>
+        </w:rPr>
+        <w:t>Architecture</w:t>
+      </w:r>
+      <w:r>
+        <w:rPr>
+          <w:sz w:val="28"/>
+          <w:szCs w:val="28"/>
+          <w:u w:val="single"/>
+        </w:rPr>
+        <w:t xml:space="preserve">, </w:t>
+      </w:r>
+      <w:r>
+        <w:rPr>
+          <w:sz w:val="28"/>
+          <w:szCs w:val="28"/>
+          <w:u w:val="single"/>
+        </w:rPr>
+        <w:t>Key Object Oriented</w:t>
+      </w:r>
+      <w:r>
+        <w:rPr>
+          <w:sz w:val="28"/>
+          <w:szCs w:val="28"/>
+          <w:u w:val="single"/>
+        </w:rPr>
+        <w:t xml:space="preserve"> and Concurrency </w:t>
+      </w:r>
+      <w:r>
+        <w:rPr>
+          <w:sz w:val="28"/>
+          <w:szCs w:val="28"/>
+          <w:u w:val="single"/>
+        </w:rPr>
+        <w:t>Decisions</w:t>
       </w:r>
     </w:p>
     <w:p>
@@ -91,32 +104,1019 @@
           <w:szCs w:val="22"/>
         </w:rPr>
       </w:pPr>
-      <w:r>
-        <w:rPr>
-          <w:sz w:val="22"/>
-          <w:szCs w:val="22"/>
-        </w:rPr>
-        <w:t xml:space="preserve">e.g. why we chose synchronize over </w:t>
-      </w:r>
-      <w:r>
-        <w:rPr>
-          <w:sz w:val="22"/>
-          <w:szCs w:val="22"/>
-        </w:rPr>
-        <w:t>atomic</w:t>
-      </w:r>
     </w:p>
     <w:p>
       <w:pPr>
         <w:rPr>
-          <w:sz w:val="22"/>
-          <w:szCs w:val="22"/>
-        </w:rPr>
-      </w:pPr>
+          <w:b/>
+          <w:bCs/>
+          <w:sz w:val="22"/>
+          <w:szCs w:val="22"/>
+        </w:rPr>
+      </w:pPr>
+      <w:r>
+        <w:rPr>
+          <w:b/>
+          <w:bCs/>
+          <w:sz w:val="22"/>
+          <w:szCs w:val="22"/>
+        </w:rPr>
+        <w:t>CardGame Class</w:t>
+      </w:r>
     </w:p>
     <w:p>
       <w:pPr>
         <w:rPr>
+          <w:sz w:val="22"/>
+          <w:szCs w:val="22"/>
+        </w:rPr>
+      </w:pPr>
+      <w:r>
+        <w:rPr>
+          <w:sz w:val="22"/>
+          <w:szCs w:val="22"/>
+        </w:rPr>
+        <w:t xml:space="preserve">The CardGame class acts as the </w:t>
+      </w:r>
+      <w:r>
+        <w:rPr>
+          <w:sz w:val="22"/>
+          <w:szCs w:val="22"/>
+        </w:rPr>
+        <w:t xml:space="preserve">central </w:t>
+      </w:r>
+      <w:r>
+        <w:rPr>
+          <w:sz w:val="22"/>
+          <w:szCs w:val="22"/>
+        </w:rPr>
+        <w:t xml:space="preserve">manager for running the whole game </w:t>
+      </w:r>
+      <w:r>
+        <w:rPr>
+          <w:sz w:val="22"/>
+          <w:szCs w:val="22"/>
+        </w:rPr>
+        <w:t xml:space="preserve">by </w:t>
+      </w:r>
+      <w:r>
+        <w:rPr>
+          <w:sz w:val="22"/>
+          <w:szCs w:val="22"/>
+        </w:rPr>
+        <w:t>containing and managing the players and card decks</w:t>
+      </w:r>
+      <w:r>
+        <w:rPr>
+          <w:sz w:val="22"/>
+          <w:szCs w:val="22"/>
+        </w:rPr>
+        <w:t>.</w:t>
+      </w:r>
+      <w:r>
+        <w:rPr>
+          <w:sz w:val="22"/>
+          <w:szCs w:val="22"/>
+        </w:rPr>
+        <w:t xml:space="preserve"> It is responsible for accepting and validating the user input for the number of players and corresponding card pack file</w:t>
+      </w:r>
+      <w:r>
+        <w:rPr>
+          <w:sz w:val="22"/>
+          <w:szCs w:val="22"/>
+        </w:rPr>
+        <w:t xml:space="preserve"> which it then uses to create and distribute the cards </w:t>
+      </w:r>
+      <w:r>
+        <w:rPr>
+          <w:sz w:val="22"/>
+          <w:szCs w:val="22"/>
+        </w:rPr>
+        <w:t>among the</w:t>
+      </w:r>
+      <w:r>
+        <w:rPr>
+          <w:sz w:val="22"/>
+          <w:szCs w:val="22"/>
+        </w:rPr>
+        <w:t xml:space="preserve"> players and decks</w:t>
+      </w:r>
+      <w:r>
+        <w:rPr>
+          <w:sz w:val="22"/>
+          <w:szCs w:val="22"/>
+        </w:rPr>
+        <w:t xml:space="preserve"> before starting each player thread.</w:t>
+      </w:r>
+      <w:r>
+        <w:rPr>
+          <w:sz w:val="22"/>
+          <w:szCs w:val="22"/>
+        </w:rPr>
+        <w:t xml:space="preserve"> Once a player wins, it alerts the CardGame class of this which then takes the responsibility of alerting and stopping all the other player threads</w:t>
+      </w:r>
+      <w:r>
+        <w:rPr>
+          <w:sz w:val="22"/>
+          <w:szCs w:val="22"/>
+        </w:rPr>
+        <w:t xml:space="preserve"> as well as telling the CardDecks that the game has ended.</w:t>
+      </w:r>
+    </w:p>
+    <w:p>
+      <w:pPr>
+        <w:rPr>
+          <w:sz w:val="22"/>
+          <w:szCs w:val="22"/>
+        </w:rPr>
+      </w:pPr>
+    </w:p>
+    <w:p>
+      <w:pPr>
+        <w:rPr>
+          <w:b/>
+          <w:bCs/>
+          <w:sz w:val="22"/>
+          <w:szCs w:val="22"/>
+        </w:rPr>
+      </w:pPr>
+      <w:r>
+        <w:rPr>
+          <w:b/>
+          <w:bCs/>
+          <w:sz w:val="22"/>
+          <w:szCs w:val="22"/>
+        </w:rPr>
+        <w:t>Player Class</w:t>
+      </w:r>
+    </w:p>
+    <w:p>
+      <w:pPr>
+        <w:rPr>
+          <w:sz w:val="22"/>
+          <w:szCs w:val="22"/>
+        </w:rPr>
+      </w:pPr>
+      <w:r>
+        <w:rPr>
+          <w:sz w:val="22"/>
+          <w:szCs w:val="22"/>
+        </w:rPr>
+        <w:t xml:space="preserve">The </w:t>
+      </w:r>
+      <w:r>
+        <w:rPr>
+          <w:sz w:val="22"/>
+          <w:szCs w:val="22"/>
+        </w:rPr>
+        <w:t>P</w:t>
+      </w:r>
+      <w:r>
+        <w:rPr>
+          <w:sz w:val="22"/>
+          <w:szCs w:val="22"/>
+        </w:rPr>
+        <w:t xml:space="preserve">layer class acts as a standalone threaded player, </w:t>
+      </w:r>
+      <w:r>
+        <w:rPr>
+          <w:sz w:val="22"/>
+          <w:szCs w:val="22"/>
+        </w:rPr>
+        <w:t xml:space="preserve">once CardGame creates an instance of it and starts its thread the player </w:t>
+      </w:r>
+      <w:r>
+        <w:rPr>
+          <w:sz w:val="22"/>
+          <w:szCs w:val="22"/>
+        </w:rPr>
+        <w:t xml:space="preserve">plays the game until CardGame eventually alerts it that the game is over. </w:t>
+      </w:r>
+      <w:r>
+        <w:rPr>
+          <w:sz w:val="22"/>
+          <w:szCs w:val="22"/>
+        </w:rPr>
+        <w:t xml:space="preserve">During a player’s turn it interacts with </w:t>
+      </w:r>
+      <w:r>
+        <w:rPr>
+          <w:sz w:val="22"/>
+          <w:szCs w:val="22"/>
+        </w:rPr>
+        <w:t>two</w:t>
+      </w:r>
+      <w:r>
+        <w:rPr>
+          <w:sz w:val="22"/>
+          <w:szCs w:val="22"/>
+        </w:rPr>
+        <w:t xml:space="preserve"> different card decks (both instances of the</w:t>
+      </w:r>
+      <w:r>
+        <w:rPr>
+          <w:sz w:val="22"/>
+          <w:szCs w:val="22"/>
+        </w:rPr>
+        <w:t xml:space="preserve"> </w:t>
+      </w:r>
+      <w:r>
+        <w:rPr>
+          <w:sz w:val="22"/>
+          <w:szCs w:val="22"/>
+        </w:rPr>
+        <w:t xml:space="preserve">CardDeck class) </w:t>
+      </w:r>
+      <w:r>
+        <w:rPr>
+          <w:sz w:val="22"/>
+          <w:szCs w:val="22"/>
+        </w:rPr>
+        <w:t>drawing a card from the previous deck and discarding to the next</w:t>
+      </w:r>
+      <w:r>
+        <w:rPr>
+          <w:sz w:val="22"/>
+          <w:szCs w:val="22"/>
+        </w:rPr>
+        <w:t xml:space="preserve"> (as stated in the specification)</w:t>
+      </w:r>
+      <w:r>
+        <w:rPr>
+          <w:sz w:val="22"/>
+          <w:szCs w:val="22"/>
+        </w:rPr>
+        <w:t xml:space="preserve"> or waiting if another player thread is interacting with the needed deck</w:t>
+      </w:r>
+      <w:r>
+        <w:rPr>
+          <w:sz w:val="22"/>
+          <w:szCs w:val="22"/>
+        </w:rPr>
+        <w:t>.</w:t>
+      </w:r>
+      <w:r>
+        <w:rPr>
+          <w:sz w:val="22"/>
+          <w:szCs w:val="22"/>
+        </w:rPr>
+        <w:t xml:space="preserve"> When</w:t>
+      </w:r>
+      <w:r>
+        <w:rPr>
+          <w:sz w:val="22"/>
+          <w:szCs w:val="22"/>
+        </w:rPr>
+        <w:t xml:space="preserve"> picking a random card to</w:t>
+      </w:r>
+      <w:r>
+        <w:rPr>
+          <w:sz w:val="22"/>
+          <w:szCs w:val="22"/>
+        </w:rPr>
+        <w:t xml:space="preserve"> discard, the Player class also checks and prevent its preferred card denomination from </w:t>
+      </w:r>
+      <w:r>
+        <w:rPr>
+          <w:sz w:val="22"/>
+          <w:szCs w:val="22"/>
+        </w:rPr>
+        <w:t xml:space="preserve">being picked </w:t>
+      </w:r>
+      <w:r>
+        <w:rPr>
+          <w:sz w:val="22"/>
+          <w:szCs w:val="22"/>
+        </w:rPr>
+        <w:t>as stated in the specification</w:t>
+      </w:r>
+      <w:r>
+        <w:rPr>
+          <w:sz w:val="22"/>
+          <w:szCs w:val="22"/>
+        </w:rPr>
+        <w:t>.</w:t>
+      </w:r>
+    </w:p>
+    <w:p>
+      <w:pPr>
+        <w:rPr>
+          <w:sz w:val="22"/>
+          <w:szCs w:val="22"/>
+        </w:rPr>
+      </w:pPr>
+    </w:p>
+    <w:p>
+      <w:pPr>
+        <w:rPr>
+          <w:b/>
+          <w:bCs/>
+          <w:sz w:val="22"/>
+          <w:szCs w:val="22"/>
+        </w:rPr>
+      </w:pPr>
+      <w:r>
+        <w:rPr>
+          <w:b/>
+          <w:bCs/>
+          <w:sz w:val="22"/>
+          <w:szCs w:val="22"/>
+        </w:rPr>
+        <w:t>CardDeck Class</w:t>
+      </w:r>
+    </w:p>
+    <w:p>
+      <w:pPr>
+        <w:rPr>
+          <w:sz w:val="22"/>
+          <w:szCs w:val="22"/>
+        </w:rPr>
+      </w:pPr>
+      <w:r>
+        <w:rPr>
+          <w:sz w:val="22"/>
+          <w:szCs w:val="22"/>
+        </w:rPr>
+        <w:t>The CardDeck class acts as a non-threaded barrier between players by accepting cards from the previous</w:t>
+      </w:r>
+      <w:r>
+        <w:rPr>
+          <w:sz w:val="22"/>
+          <w:szCs w:val="22"/>
+        </w:rPr>
+        <w:t xml:space="preserve"> threaded</w:t>
+      </w:r>
+      <w:r>
+        <w:rPr>
+          <w:sz w:val="22"/>
+          <w:szCs w:val="22"/>
+        </w:rPr>
+        <w:t xml:space="preserve"> player</w:t>
+      </w:r>
+      <w:r>
+        <w:rPr>
+          <w:sz w:val="22"/>
+          <w:szCs w:val="22"/>
+        </w:rPr>
+        <w:t xml:space="preserve"> and providing cards to the next threaded player</w:t>
+      </w:r>
+      <w:r>
+        <w:rPr>
+          <w:sz w:val="22"/>
+          <w:szCs w:val="22"/>
+        </w:rPr>
+        <w:t>.</w:t>
+      </w:r>
+      <w:r>
+        <w:rPr>
+          <w:sz w:val="22"/>
+          <w:szCs w:val="22"/>
+        </w:rPr>
+        <w:t xml:space="preserve"> This behaviour allows the threaded player classes to avoid any direct interaction</w:t>
+      </w:r>
+      <w:r>
+        <w:rPr>
+          <w:sz w:val="22"/>
+          <w:szCs w:val="22"/>
+        </w:rPr>
+        <w:t xml:space="preserve"> (which could be dangerous due to the </w:t>
+      </w:r>
+      <w:r>
+        <w:rPr>
+          <w:sz w:val="22"/>
+          <w:szCs w:val="22"/>
+        </w:rPr>
+        <w:t>non-</w:t>
+      </w:r>
+      <w:r>
+        <w:rPr>
+          <w:sz w:val="22"/>
+          <w:szCs w:val="22"/>
+        </w:rPr>
+        <w:t>deterministic</w:t>
+      </w:r>
+      <w:r>
+        <w:rPr>
+          <w:sz w:val="22"/>
+          <w:szCs w:val="22"/>
+        </w:rPr>
+        <w:t xml:space="preserve"> runtime of threads)</w:t>
+      </w:r>
+      <w:r>
+        <w:rPr>
+          <w:sz w:val="22"/>
+          <w:szCs w:val="22"/>
+        </w:rPr>
+        <w:t xml:space="preserve"> which is the </w:t>
+      </w:r>
+      <w:r>
+        <w:rPr>
+          <w:sz w:val="22"/>
+          <w:szCs w:val="22"/>
+        </w:rPr>
+        <w:t>one</w:t>
+      </w:r>
+      <w:r>
+        <w:rPr>
+          <w:sz w:val="22"/>
+          <w:szCs w:val="22"/>
+        </w:rPr>
+        <w:t xml:space="preserve"> of the main</w:t>
+      </w:r>
+      <w:r>
+        <w:rPr>
+          <w:sz w:val="22"/>
+          <w:szCs w:val="22"/>
+        </w:rPr>
+        <w:t xml:space="preserve"> reason</w:t>
+      </w:r>
+      <w:r>
+        <w:rPr>
+          <w:sz w:val="22"/>
+          <w:szCs w:val="22"/>
+        </w:rPr>
+        <w:t>s</w:t>
+      </w:r>
+      <w:r>
+        <w:rPr>
+          <w:sz w:val="22"/>
+          <w:szCs w:val="22"/>
+        </w:rPr>
+        <w:t xml:space="preserve"> why we decided on having a separate non-threaded CardDeck class</w:t>
+      </w:r>
+      <w:r>
+        <w:rPr>
+          <w:sz w:val="22"/>
+          <w:szCs w:val="22"/>
+        </w:rPr>
+        <w:t xml:space="preserve">. Additionally, </w:t>
+      </w:r>
+      <w:r>
+        <w:rPr>
+          <w:sz w:val="22"/>
+          <w:szCs w:val="22"/>
+        </w:rPr>
+        <w:t xml:space="preserve">the alternative of allowing players themselves to have their own deck storage would </w:t>
+      </w:r>
+      <w:r>
+        <w:rPr>
+          <w:sz w:val="22"/>
+          <w:szCs w:val="22"/>
+        </w:rPr>
+        <w:t xml:space="preserve">quickly </w:t>
+      </w:r>
+      <w:r>
+        <w:rPr>
+          <w:sz w:val="22"/>
+          <w:szCs w:val="22"/>
+        </w:rPr>
+        <w:t>become messy</w:t>
+      </w:r>
+      <w:r>
+        <w:rPr>
+          <w:sz w:val="22"/>
+          <w:szCs w:val="22"/>
+        </w:rPr>
+        <w:t xml:space="preserve"> so splitting them up allows a much </w:t>
+      </w:r>
+      <w:r>
+        <w:rPr>
+          <w:sz w:val="22"/>
+          <w:szCs w:val="22"/>
+        </w:rPr>
+        <w:t>cleaner</w:t>
+      </w:r>
+      <w:r>
+        <w:rPr>
+          <w:sz w:val="22"/>
+          <w:szCs w:val="22"/>
+        </w:rPr>
+        <w:t xml:space="preserve"> </w:t>
+      </w:r>
+      <w:r>
+        <w:rPr>
+          <w:sz w:val="22"/>
+          <w:szCs w:val="22"/>
+        </w:rPr>
+        <w:t>object-oriented</w:t>
+      </w:r>
+      <w:r>
+        <w:rPr>
+          <w:sz w:val="22"/>
+          <w:szCs w:val="22"/>
+        </w:rPr>
+        <w:t xml:space="preserve"> structure for the code</w:t>
+      </w:r>
+      <w:r>
+        <w:rPr>
+          <w:sz w:val="22"/>
+          <w:szCs w:val="22"/>
+        </w:rPr>
+        <w:t xml:space="preserve"> making debugging and testing significantly easier.</w:t>
+      </w:r>
+      <w:r>
+        <w:rPr>
+          <w:sz w:val="22"/>
+          <w:szCs w:val="22"/>
+        </w:rPr>
+        <w:t xml:space="preserve"> Another design decision was choosing between using synchronize</w:t>
+      </w:r>
+      <w:r>
+        <w:rPr>
+          <w:sz w:val="22"/>
+          <w:szCs w:val="22"/>
+        </w:rPr>
+        <w:t>d methods</w:t>
+      </w:r>
+      <w:r>
+        <w:rPr>
+          <w:sz w:val="22"/>
+          <w:szCs w:val="22"/>
+        </w:rPr>
+        <w:t xml:space="preserve"> or </w:t>
+      </w:r>
+      <w:r>
+        <w:rPr>
+          <w:sz w:val="22"/>
+          <w:szCs w:val="22"/>
+        </w:rPr>
+        <w:t>A</w:t>
+      </w:r>
+      <w:r>
+        <w:rPr>
+          <w:sz w:val="22"/>
+          <w:szCs w:val="22"/>
+        </w:rPr>
+        <w:t>tomic</w:t>
+      </w:r>
+      <w:r>
+        <w:rPr>
+          <w:sz w:val="22"/>
+          <w:szCs w:val="22"/>
+        </w:rPr>
+        <w:t>Integer</w:t>
+      </w:r>
+      <w:r>
+        <w:rPr>
+          <w:sz w:val="22"/>
+          <w:szCs w:val="22"/>
+        </w:rPr>
+        <w:t xml:space="preserve"> for card drawing and discarding</w:t>
+      </w:r>
+      <w:r>
+        <w:rPr>
+          <w:sz w:val="22"/>
+          <w:szCs w:val="22"/>
+        </w:rPr>
+        <w:t>. W</w:t>
+      </w:r>
+      <w:r>
+        <w:rPr>
+          <w:sz w:val="22"/>
+          <w:szCs w:val="22"/>
+        </w:rPr>
+        <w:t>e decided to use synchronize</w:t>
+      </w:r>
+      <w:r>
+        <w:rPr>
+          <w:sz w:val="22"/>
+          <w:szCs w:val="22"/>
+        </w:rPr>
+        <w:t>d</w:t>
+      </w:r>
+      <w:r>
+        <w:rPr>
+          <w:sz w:val="22"/>
+          <w:szCs w:val="22"/>
+        </w:rPr>
+        <w:t xml:space="preserve"> </w:t>
+      </w:r>
+      <w:r>
+        <w:rPr>
+          <w:sz w:val="22"/>
+          <w:szCs w:val="22"/>
+        </w:rPr>
+        <w:t xml:space="preserve">methods </w:t>
+      </w:r>
+      <w:r>
+        <w:rPr>
+          <w:sz w:val="22"/>
+          <w:szCs w:val="22"/>
+        </w:rPr>
+        <w:t xml:space="preserve">as while using an </w:t>
+      </w:r>
+      <w:r>
+        <w:rPr>
+          <w:sz w:val="22"/>
+          <w:szCs w:val="22"/>
+        </w:rPr>
+        <w:t>A</w:t>
+      </w:r>
+      <w:r>
+        <w:rPr>
+          <w:sz w:val="22"/>
+          <w:szCs w:val="22"/>
+        </w:rPr>
+        <w:t>tomicInteger</w:t>
+      </w:r>
+      <w:r>
+        <w:rPr>
+          <w:sz w:val="22"/>
+          <w:szCs w:val="22"/>
+        </w:rPr>
+        <w:t xml:space="preserve"> would allow for a faster program</w:t>
+      </w:r>
+      <w:r>
+        <w:rPr>
+          <w:sz w:val="22"/>
+          <w:szCs w:val="22"/>
+        </w:rPr>
+        <w:t xml:space="preserve"> with less overhead when calling the </w:t>
+      </w:r>
+      <w:r>
+        <w:rPr>
+          <w:i/>
+          <w:iCs/>
+          <w:sz w:val="22"/>
+          <w:szCs w:val="22"/>
+          <w:u w:val="single"/>
+        </w:rPr>
+        <w:t>drawCard</w:t>
+      </w:r>
+      <w:r>
+        <w:rPr>
+          <w:sz w:val="22"/>
+          <w:szCs w:val="22"/>
+        </w:rPr>
+        <w:t xml:space="preserve"> and </w:t>
+      </w:r>
+      <w:r>
+        <w:rPr>
+          <w:i/>
+          <w:iCs/>
+          <w:sz w:val="22"/>
+          <w:szCs w:val="22"/>
+          <w:u w:val="single"/>
+        </w:rPr>
+        <w:t>addCard</w:t>
+      </w:r>
+      <w:r>
+        <w:rPr>
+          <w:sz w:val="22"/>
+          <w:szCs w:val="22"/>
+        </w:rPr>
+        <w:t xml:space="preserve"> methods</w:t>
+      </w:r>
+      <w:r>
+        <w:rPr>
+          <w:sz w:val="22"/>
+          <w:szCs w:val="22"/>
+        </w:rPr>
+        <w:t xml:space="preserve"> as it avoids Java from needing to set and release locks</w:t>
+      </w:r>
+      <w:r>
+        <w:rPr>
+          <w:sz w:val="22"/>
+          <w:szCs w:val="22"/>
+        </w:rPr>
+        <w:t>, synchronize</w:t>
+      </w:r>
+      <w:r>
+        <w:rPr>
+          <w:sz w:val="22"/>
+          <w:szCs w:val="22"/>
+        </w:rPr>
+        <w:t>d</w:t>
+      </w:r>
+      <w:r>
+        <w:rPr>
+          <w:sz w:val="22"/>
+          <w:szCs w:val="22"/>
+        </w:rPr>
+        <w:t xml:space="preserve"> </w:t>
+      </w:r>
+      <w:r>
+        <w:rPr>
+          <w:sz w:val="22"/>
+          <w:szCs w:val="22"/>
+        </w:rPr>
+        <w:t xml:space="preserve">allowed the use of the </w:t>
+      </w:r>
+      <w:r>
+        <w:rPr>
+          <w:sz w:val="22"/>
+          <w:szCs w:val="22"/>
+        </w:rPr>
+        <w:t>Card</w:t>
+      </w:r>
+      <w:r>
+        <w:rPr>
+          <w:sz w:val="22"/>
+          <w:szCs w:val="22"/>
+        </w:rPr>
+        <w:t xml:space="preserve"> class within the </w:t>
+      </w:r>
+      <w:r>
+        <w:rPr>
+          <w:i/>
+          <w:iCs/>
+          <w:sz w:val="22"/>
+          <w:szCs w:val="22"/>
+          <w:u w:val="single"/>
+        </w:rPr>
+        <w:t>drawCard</w:t>
+      </w:r>
+      <w:r>
+        <w:rPr>
+          <w:sz w:val="22"/>
+          <w:szCs w:val="22"/>
+        </w:rPr>
+        <w:t xml:space="preserve"> </w:t>
+      </w:r>
+      <w:r>
+        <w:rPr>
+          <w:sz w:val="22"/>
+          <w:szCs w:val="22"/>
+        </w:rPr>
+        <w:lastRenderedPageBreak/>
+        <w:t xml:space="preserve">and </w:t>
+      </w:r>
+      <w:r>
+        <w:rPr>
+          <w:i/>
+          <w:iCs/>
+          <w:sz w:val="22"/>
+          <w:szCs w:val="22"/>
+          <w:u w:val="single"/>
+        </w:rPr>
+        <w:t>addCard</w:t>
+      </w:r>
+      <w:r>
+        <w:rPr>
+          <w:sz w:val="22"/>
+          <w:szCs w:val="22"/>
+        </w:rPr>
+        <w:t xml:space="preserve"> </w:t>
+      </w:r>
+      <w:r>
+        <w:rPr>
+          <w:sz w:val="22"/>
+          <w:szCs w:val="22"/>
+        </w:rPr>
+        <w:t>methods</w:t>
+      </w:r>
+      <w:r>
+        <w:rPr>
+          <w:sz w:val="22"/>
+          <w:szCs w:val="22"/>
+        </w:rPr>
+        <w:t xml:space="preserve"> preventing the risk of card values being</w:t>
+      </w:r>
+      <w:r>
+        <w:rPr>
+          <w:sz w:val="22"/>
+          <w:szCs w:val="22"/>
+        </w:rPr>
+        <w:t xml:space="preserve"> </w:t>
+      </w:r>
+      <w:r>
+        <w:rPr>
+          <w:sz w:val="22"/>
+          <w:szCs w:val="22"/>
+        </w:rPr>
+        <w:t>altered</w:t>
+      </w:r>
+      <w:r>
+        <w:rPr>
+          <w:sz w:val="22"/>
+          <w:szCs w:val="22"/>
+        </w:rPr>
+        <w:t xml:space="preserve"> by only allowing 1 player to either draw or discard at a time</w:t>
+      </w:r>
+      <w:r>
+        <w:rPr>
+          <w:sz w:val="22"/>
+          <w:szCs w:val="22"/>
+        </w:rPr>
+        <w:t>. Additionally, the synchronize</w:t>
+      </w:r>
+      <w:r>
+        <w:rPr>
+          <w:sz w:val="22"/>
+          <w:szCs w:val="22"/>
+        </w:rPr>
+        <w:t>d</w:t>
+      </w:r>
+      <w:r>
+        <w:rPr>
+          <w:sz w:val="22"/>
+          <w:szCs w:val="22"/>
+        </w:rPr>
+        <w:t xml:space="preserve"> statement also allowed the first-in first-out ordering, as stated in the specification, </w:t>
+      </w:r>
+      <w:r>
+        <w:rPr>
+          <w:sz w:val="22"/>
+          <w:szCs w:val="22"/>
+        </w:rPr>
+        <w:t>to always be enforced</w:t>
+      </w:r>
+      <w:r>
+        <w:rPr>
+          <w:sz w:val="22"/>
+          <w:szCs w:val="22"/>
+        </w:rPr>
+        <w:t xml:space="preserve"> by the CardDeck class</w:t>
+      </w:r>
+      <w:r>
+        <w:rPr>
+          <w:sz w:val="22"/>
+          <w:szCs w:val="22"/>
+        </w:rPr>
+        <w:t xml:space="preserve"> </w:t>
+      </w:r>
+      <w:r>
+        <w:rPr>
+          <w:i/>
+          <w:iCs/>
+          <w:sz w:val="22"/>
+          <w:szCs w:val="22"/>
+        </w:rPr>
+        <w:t>deckCards</w:t>
+      </w:r>
+      <w:r>
+        <w:rPr>
+          <w:sz w:val="22"/>
+          <w:szCs w:val="22"/>
+        </w:rPr>
+        <w:t xml:space="preserve"> array which was designed to act </w:t>
+      </w:r>
+      <w:r>
+        <w:rPr>
+          <w:sz w:val="22"/>
+          <w:szCs w:val="22"/>
+        </w:rPr>
+        <w:t>as a queue.</w:t>
+      </w:r>
+    </w:p>
+    <w:p>
+      <w:pPr>
+        <w:rPr>
+          <w:sz w:val="22"/>
+          <w:szCs w:val="22"/>
+        </w:rPr>
+      </w:pPr>
+    </w:p>
+    <w:p>
+      <w:pPr>
+        <w:rPr>
+          <w:b/>
+          <w:bCs/>
+          <w:sz w:val="22"/>
+          <w:szCs w:val="22"/>
+        </w:rPr>
+      </w:pPr>
+      <w:r>
+        <w:rPr>
+          <w:b/>
+          <w:bCs/>
+          <w:sz w:val="22"/>
+          <w:szCs w:val="22"/>
+        </w:rPr>
+        <w:t>Card Class</w:t>
+      </w:r>
+    </w:p>
+    <w:p>
+      <w:pPr>
+        <w:rPr>
+          <w:sz w:val="22"/>
+          <w:szCs w:val="22"/>
+        </w:rPr>
+      </w:pPr>
+      <w:r>
+        <w:rPr>
+          <w:sz w:val="22"/>
+          <w:szCs w:val="22"/>
+        </w:rPr>
+        <w:t>The Card class</w:t>
+      </w:r>
+      <w:r>
+        <w:rPr>
+          <w:sz w:val="22"/>
+          <w:szCs w:val="22"/>
+        </w:rPr>
+        <w:t>’</w:t>
+      </w:r>
+      <w:r>
+        <w:rPr>
+          <w:sz w:val="22"/>
+          <w:szCs w:val="22"/>
+        </w:rPr>
+        <w:t>s only job is to store</w:t>
+      </w:r>
+      <w:r>
+        <w:rPr>
+          <w:sz w:val="22"/>
+          <w:szCs w:val="22"/>
+        </w:rPr>
+        <w:t xml:space="preserve"> and protect</w:t>
+      </w:r>
+      <w:r>
+        <w:rPr>
+          <w:sz w:val="22"/>
+          <w:szCs w:val="22"/>
+        </w:rPr>
+        <w:t xml:space="preserve"> its specific </w:t>
+      </w:r>
+      <w:r>
+        <w:rPr>
+          <w:sz w:val="22"/>
+          <w:szCs w:val="22"/>
+        </w:rPr>
+        <w:t>value</w:t>
+      </w:r>
+      <w:r>
+        <w:rPr>
+          <w:sz w:val="22"/>
+          <w:szCs w:val="22"/>
+        </w:rPr>
+        <w:t xml:space="preserve"> while i</w:t>
+      </w:r>
+      <w:r>
+        <w:rPr>
+          <w:sz w:val="22"/>
+          <w:szCs w:val="22"/>
+        </w:rPr>
+        <w:t>t is passed between players and card decks throughout the game</w:t>
+      </w:r>
+      <w:r>
+        <w:rPr>
+          <w:sz w:val="22"/>
+          <w:szCs w:val="22"/>
+        </w:rPr>
+        <w:t>. This is why it only has a get method and its value is constant (final)</w:t>
+      </w:r>
+      <w:r>
+        <w:rPr>
+          <w:sz w:val="22"/>
+          <w:szCs w:val="22"/>
+        </w:rPr>
+        <w:t xml:space="preserve"> so that unwanted card value changes </w:t>
+      </w:r>
+      <w:r>
+        <w:rPr>
+          <w:sz w:val="22"/>
+          <w:szCs w:val="22"/>
+        </w:rPr>
+        <w:t>are not</w:t>
+      </w:r>
+      <w:r>
+        <w:rPr>
+          <w:sz w:val="22"/>
+          <w:szCs w:val="22"/>
+        </w:rPr>
+        <w:t xml:space="preserve"> possible</w:t>
+      </w:r>
+      <w:r>
+        <w:rPr>
+          <w:sz w:val="22"/>
+          <w:szCs w:val="22"/>
+        </w:rPr>
+        <w:t xml:space="preserve"> making it safer th</w:t>
+      </w:r>
+      <w:r>
+        <w:rPr>
+          <w:sz w:val="22"/>
+          <w:szCs w:val="22"/>
+        </w:rPr>
+        <w:t xml:space="preserve">an simply passing the raw card values between </w:t>
+      </w:r>
+      <w:r>
+        <w:rPr>
+          <w:sz w:val="22"/>
+          <w:szCs w:val="22"/>
+        </w:rPr>
+        <w:t>the player threads and card decks</w:t>
+      </w:r>
+      <w:r>
+        <w:rPr>
+          <w:sz w:val="22"/>
+          <w:szCs w:val="22"/>
+        </w:rPr>
+        <w:t>.</w:t>
+      </w:r>
+    </w:p>
+    <w:p>
+      <w:pPr>
+        <w:rPr>
+          <w:sz w:val="22"/>
+          <w:szCs w:val="22"/>
+        </w:rPr>
+      </w:pPr>
+    </w:p>
+    <w:p>
+      <w:pPr>
+        <w:rPr>
           <w:sz w:val="28"/>
           <w:szCs w:val="28"/>
           <w:u w:val="single"/>
@@ -167,7 +1167,7 @@
           <w:sz w:val="22"/>
           <w:szCs w:val="22"/>
         </w:rPr>
-        <w:t>u</w:t>
+        <w:t>U</w:t>
       </w:r>
       <w:r>
         <w:rPr>
@@ -254,21 +1254,159 @@
           <w:sz w:val="22"/>
           <w:szCs w:val="22"/>
         </w:rPr>
-        <w:t xml:space="preserve">expected </w:t>
-      </w:r>
-      <w:r>
-        <w:rPr>
-          <w:sz w:val="22"/>
-          <w:szCs w:val="22"/>
-        </w:rPr>
-        <w:t xml:space="preserve">scenarios as well as </w:t>
-      </w:r>
-      <w:r>
-        <w:rPr>
-          <w:sz w:val="22"/>
-          <w:szCs w:val="22"/>
-        </w:rPr>
-        <w:t>how different functions deal with invalid input [rewrite]</w:t>
+        <w:t xml:space="preserve">scenarios including invalid input, </w:t>
+      </w:r>
+      <w:r>
+        <w:rPr>
+          <w:sz w:val="22"/>
+          <w:szCs w:val="22"/>
+        </w:rPr>
+        <w:t>thread behaviour and</w:t>
+      </w:r>
+      <w:r>
+        <w:rPr>
+          <w:sz w:val="22"/>
+          <w:szCs w:val="22"/>
+        </w:rPr>
+        <w:t xml:space="preserve"> </w:t>
+      </w:r>
+      <w:r>
+        <w:rPr>
+          <w:sz w:val="22"/>
+          <w:szCs w:val="22"/>
+        </w:rPr>
+        <w:t xml:space="preserve">overall </w:t>
+      </w:r>
+      <w:r>
+        <w:rPr>
+          <w:sz w:val="22"/>
+          <w:szCs w:val="22"/>
+        </w:rPr>
+        <w:t>game</w:t>
+      </w:r>
+      <w:r>
+        <w:rPr>
+          <w:sz w:val="22"/>
+          <w:szCs w:val="22"/>
+        </w:rPr>
+        <w:t xml:space="preserve"> stability </w:t>
+      </w:r>
+      <w:r>
+        <w:rPr>
+          <w:sz w:val="22"/>
+          <w:szCs w:val="22"/>
+        </w:rPr>
+        <w:t>as well as</w:t>
+      </w:r>
+      <w:r>
+        <w:rPr>
+          <w:sz w:val="22"/>
+          <w:szCs w:val="22"/>
+        </w:rPr>
+        <w:t xml:space="preserve"> running and</w:t>
+      </w:r>
+      <w:r>
+        <w:rPr>
+          <w:sz w:val="22"/>
+          <w:szCs w:val="22"/>
+        </w:rPr>
+        <w:t xml:space="preserve"> </w:t>
+      </w:r>
+      <w:r>
+        <w:rPr>
+          <w:sz w:val="22"/>
+          <w:szCs w:val="22"/>
+        </w:rPr>
+        <w:t xml:space="preserve">inspecting entire games by analysing and checking </w:t>
+      </w:r>
+      <w:r>
+        <w:rPr>
+          <w:sz w:val="22"/>
+          <w:szCs w:val="22"/>
+        </w:rPr>
+        <w:t>the outputted logs.</w:t>
+      </w:r>
+      <w:r>
+        <w:rPr>
+          <w:sz w:val="22"/>
+          <w:szCs w:val="22"/>
+        </w:rPr>
+        <w:t xml:space="preserve"> After each test the </w:t>
+      </w:r>
+      <w:r>
+        <w:rPr>
+          <w:i/>
+          <w:iCs/>
+          <w:sz w:val="22"/>
+          <w:szCs w:val="22"/>
+          <w:u w:val="single"/>
+        </w:rPr>
+        <w:t>clearGame</w:t>
+      </w:r>
+      <w:r>
+        <w:rPr>
+          <w:sz w:val="22"/>
+          <w:szCs w:val="22"/>
+        </w:rPr>
+        <w:t xml:space="preserve"> method is run</w:t>
+      </w:r>
+      <w:r>
+        <w:rPr>
+          <w:sz w:val="22"/>
+          <w:szCs w:val="22"/>
+        </w:rPr>
+        <w:t xml:space="preserve"> by JUnit (as it is marked with </w:t>
+      </w:r>
+      <w:r>
+        <w:rPr>
+          <w:sz w:val="22"/>
+          <w:szCs w:val="22"/>
+        </w:rPr>
+        <w:t>@</w:t>
+      </w:r>
+      <w:r>
+        <w:rPr>
+          <w:i/>
+          <w:iCs/>
+          <w:sz w:val="22"/>
+          <w:szCs w:val="22"/>
+        </w:rPr>
+        <w:t>AfterEach</w:t>
+      </w:r>
+      <w:r>
+        <w:rPr>
+          <w:sz w:val="22"/>
+          <w:szCs w:val="22"/>
+        </w:rPr>
+        <w:t>)</w:t>
+      </w:r>
+      <w:r>
+        <w:rPr>
+          <w:sz w:val="22"/>
+          <w:szCs w:val="22"/>
+        </w:rPr>
+        <w:t xml:space="preserve"> which cleans up any leftover </w:t>
+      </w:r>
+      <w:r>
+        <w:rPr>
+          <w:sz w:val="22"/>
+          <w:szCs w:val="22"/>
+        </w:rPr>
+        <w:t xml:space="preserve">player </w:t>
+      </w:r>
+      <w:r>
+        <w:rPr>
+          <w:sz w:val="22"/>
+          <w:szCs w:val="22"/>
+        </w:rPr>
+        <w:t>threads</w:t>
+      </w:r>
+      <w:r>
+        <w:rPr>
+          <w:sz w:val="22"/>
+          <w:szCs w:val="22"/>
+        </w:rPr>
+        <w:t xml:space="preserve"> ready for the next test.</w:t>
       </w:r>
     </w:p>
     <w:p>
@@ -312,6 +1450,7 @@
         <w:rPr>
           <w:sz w:val="22"/>
           <w:szCs w:val="22"/>
+          <w:u w:val="single"/>
         </w:rPr>
       </w:pPr>
       <w:r>
@@ -333,26 +1472,103 @@
       </w:r>
       <w:r>
         <w:rPr>
+          <w:sz w:val="22"/>
+          <w:szCs w:val="22"/>
+        </w:rPr>
+        <w:t xml:space="preserve"> </w:t>
+      </w:r>
+      <w:r>
+        <w:rPr>
+          <w:sz w:val="22"/>
+          <w:szCs w:val="22"/>
+        </w:rPr>
+        <w:t>t</w:t>
+      </w:r>
+      <w:r>
+        <w:rPr>
+          <w:sz w:val="22"/>
+          <w:szCs w:val="22"/>
+        </w:rPr>
+        <w:t>est</w:t>
+      </w:r>
+      <w:r>
+        <w:rPr>
+          <w:sz w:val="22"/>
+          <w:szCs w:val="22"/>
+        </w:rPr>
+        <w:t xml:space="preserve"> is designed to check</w:t>
+      </w:r>
+      <w:r>
+        <w:rPr>
+          <w:sz w:val="22"/>
+          <w:szCs w:val="22"/>
+        </w:rPr>
+        <w:t xml:space="preserve"> the behaviour of the </w:t>
+      </w:r>
+      <w:r>
+        <w:rPr>
           <w:i/>
           <w:iCs/>
           <w:sz w:val="22"/>
           <w:szCs w:val="22"/>
         </w:rPr>
-        <w:t xml:space="preserve"> </w:t>
-      </w:r>
-      <w:r>
-        <w:rPr>
-          <w:sz w:val="22"/>
-          <w:szCs w:val="22"/>
-        </w:rPr>
-        <w:t>t</w:t>
-      </w:r>
-      <w:r>
-        <w:rPr>
-          <w:sz w:val="22"/>
-          <w:szCs w:val="22"/>
-        </w:rPr>
-        <w:t>est is designed to check</w:t>
+        <w:t>readPack</w:t>
+      </w:r>
+      <w:r>
+        <w:rPr>
+          <w:sz w:val="22"/>
+          <w:szCs w:val="22"/>
+        </w:rPr>
+        <w:t xml:space="preserve"> function</w:t>
+      </w:r>
+      <w:r>
+        <w:rPr>
+          <w:sz w:val="22"/>
+          <w:szCs w:val="22"/>
+        </w:rPr>
+        <w:t xml:space="preserve"> in </w:t>
+      </w:r>
+      <w:r>
+        <w:rPr>
+          <w:sz w:val="22"/>
+          <w:szCs w:val="22"/>
+        </w:rPr>
+        <w:t xml:space="preserve">the </w:t>
+      </w:r>
+      <w:r>
+        <w:rPr>
+          <w:sz w:val="22"/>
+          <w:szCs w:val="22"/>
+        </w:rPr>
+        <w:t>CardGame</w:t>
+      </w:r>
+      <w:r>
+        <w:rPr>
+          <w:sz w:val="22"/>
+          <w:szCs w:val="22"/>
+        </w:rPr>
+        <w:t xml:space="preserve"> class</w:t>
+      </w:r>
+      <w:r>
+        <w:rPr>
+          <w:sz w:val="22"/>
+          <w:szCs w:val="22"/>
+        </w:rPr>
+        <w:t xml:space="preserve"> when provided with a non-existent</w:t>
+      </w:r>
+      <w:r>
+        <w:rPr>
+          <w:sz w:val="22"/>
+          <w:szCs w:val="22"/>
+        </w:rPr>
+        <w:t>, negative integer, non-integer and improperly formatted pack file</w:t>
+      </w:r>
+      <w:r>
+        <w:rPr>
+          <w:sz w:val="22"/>
+          <w:szCs w:val="22"/>
+        </w:rPr>
+        <w:t xml:space="preserve"> and whether it outputs either the expected card values or null.</w:t>
       </w:r>
     </w:p>
     <w:p>
@@ -403,26 +1619,19 @@
     <w:p>
       <w:pPr>
         <w:rPr>
-          <w:sz w:val="22"/>
-          <w:szCs w:val="22"/>
-        </w:rPr>
-      </w:pPr>
-      <w:r>
-        <w:rPr>
-          <w:sz w:val="22"/>
-          <w:szCs w:val="22"/>
-        </w:rPr>
-        <w:t xml:space="preserve">The tests for the functionality of the Player class are </w:t>
-      </w:r>
-      <w:r>
-        <w:rPr>
           <w:i/>
           <w:iCs/>
           <w:sz w:val="22"/>
           <w:szCs w:val="22"/>
           <w:u w:val="single"/>
         </w:rPr>
-        <w:t>playerInitialisedCheck</w:t>
+      </w:pPr>
+      <w:r>
+        <w:rPr>
+          <w:sz w:val="22"/>
+          <w:szCs w:val="22"/>
+        </w:rPr>
+        <w:t xml:space="preserve">The tests for the functionality of the Player class are </w:t>
       </w:r>
       <w:r>
         <w:rPr>
@@ -430,6 +1639,14 @@
           <w:iCs/>
           <w:sz w:val="22"/>
           <w:szCs w:val="22"/>
+          <w:u w:val="single"/>
+        </w:rPr>
+        <w:t>testPlayerInitialisation</w:t>
+      </w:r>
+      <w:r>
+        <w:rPr>
+          <w:sz w:val="22"/>
+          <w:szCs w:val="22"/>
         </w:rPr>
         <w:t xml:space="preserve"> </w:t>
       </w:r>
@@ -438,7 +1655,14 @@
           <w:sz w:val="22"/>
           <w:szCs w:val="22"/>
         </w:rPr>
-        <w:t xml:space="preserve">and </w:t>
+        <w:t>and</w:t>
+      </w:r>
+      <w:r>
+        <w:rPr>
+          <w:sz w:val="22"/>
+          <w:szCs w:val="22"/>
+        </w:rPr>
+        <w:t xml:space="preserve"> </w:t>
       </w:r>
       <w:r>
         <w:rPr>
@@ -471,7 +1695,35 @@
           <w:sz w:val="22"/>
           <w:szCs w:val="22"/>
         </w:rPr>
-        <w:t xml:space="preserve"> are both designed</w:t>
+        <w:t xml:space="preserve"> are </w:t>
+      </w:r>
+      <w:r>
+        <w:rPr>
+          <w:sz w:val="22"/>
+          <w:szCs w:val="22"/>
+        </w:rPr>
+        <w:t>designed to test the initial creation</w:t>
+      </w:r>
+      <w:r>
+        <w:rPr>
+          <w:sz w:val="22"/>
+          <w:szCs w:val="22"/>
+        </w:rPr>
+        <w:t xml:space="preserve"> of a player and whether they are distributed the correct cards following the expected round</w:t>
+      </w:r>
+      <w:r>
+        <w:rPr>
+          <w:sz w:val="22"/>
+          <w:szCs w:val="22"/>
+        </w:rPr>
+        <w:t>-</w:t>
+      </w:r>
+      <w:r>
+        <w:rPr>
+          <w:sz w:val="22"/>
+          <w:szCs w:val="22"/>
+        </w:rPr>
+        <w:t>robin dealing respectively.</w:t>
       </w:r>
     </w:p>
     <w:p>
@@ -522,127 +1774,238 @@
     <w:p>
       <w:pPr>
         <w:rPr>
-          <w:sz w:val="22"/>
-          <w:szCs w:val="22"/>
-        </w:rPr>
-      </w:pPr>
-      <w:r>
-        <w:rPr>
-          <w:sz w:val="22"/>
-          <w:szCs w:val="22"/>
-        </w:rPr>
-        <w:t xml:space="preserve">The tests for the behaviour of the CardDeck class are </w:t>
-      </w:r>
-      <w:proofErr w:type="spellStart"/>
-      <w:r>
-        <w:rPr>
           <w:i/>
           <w:iCs/>
-          <w:color w:val="000000" w:themeColor="text1"/>
-          <w:sz w:val="22"/>
-          <w:szCs w:val="22"/>
-          <w:u w:val="single"/>
-        </w:rPr>
-        <w:t>deckInitialisedCheck</w:t>
-      </w:r>
-      <w:proofErr w:type="spellEnd"/>
+          <w:sz w:val="22"/>
+          <w:szCs w:val="22"/>
+          <w:u w:val="single"/>
+        </w:rPr>
+      </w:pPr>
+      <w:r>
+        <w:rPr>
+          <w:sz w:val="22"/>
+          <w:szCs w:val="22"/>
+        </w:rPr>
+        <w:t xml:space="preserve">The tests for the behaviour of the CardDeck class are </w:t>
+      </w:r>
       <w:r>
         <w:rPr>
           <w:i/>
           <w:iCs/>
           <w:sz w:val="22"/>
           <w:szCs w:val="22"/>
-        </w:rPr>
-        <w:t xml:space="preserve">, </w:t>
-      </w:r>
-      <w:proofErr w:type="spellStart"/>
+          <w:u w:val="single"/>
+        </w:rPr>
+        <w:t>testDeckInitialisation</w:t>
+      </w:r>
       <w:r>
         <w:rPr>
           <w:i/>
           <w:iCs/>
           <w:sz w:val="22"/>
           <w:szCs w:val="22"/>
-          <w:u w:val="single"/>
-        </w:rPr>
-        <w:t>testDistributeCardsDeckContents</w:t>
-      </w:r>
-      <w:proofErr w:type="spellEnd"/>
+        </w:rPr>
+        <w:t xml:space="preserve">, </w:t>
+      </w:r>
       <w:r>
         <w:rPr>
           <w:i/>
           <w:iCs/>
           <w:sz w:val="22"/>
           <w:szCs w:val="22"/>
-        </w:rPr>
-        <w:t xml:space="preserve">, </w:t>
-      </w:r>
-      <w:proofErr w:type="spellStart"/>
+          <w:u w:val="single"/>
+        </w:rPr>
+        <w:t>testDistributeCardsDeckContents</w:t>
+      </w:r>
       <w:r>
         <w:rPr>
           <w:i/>
           <w:iCs/>
           <w:sz w:val="22"/>
           <w:szCs w:val="22"/>
-          <w:u w:val="single"/>
-        </w:rPr>
-        <w:t>testCardDeckDrawCard</w:t>
-      </w:r>
-      <w:proofErr w:type="spellEnd"/>
+        </w:rPr>
+        <w:t xml:space="preserve">, </w:t>
+      </w:r>
       <w:r>
         <w:rPr>
           <w:i/>
           <w:iCs/>
           <w:sz w:val="22"/>
           <w:szCs w:val="22"/>
-        </w:rPr>
-        <w:t xml:space="preserve">, </w:t>
-      </w:r>
-      <w:proofErr w:type="spellStart"/>
+          <w:u w:val="single"/>
+        </w:rPr>
+        <w:t>testCardDeckDrawCard</w:t>
+      </w:r>
       <w:r>
         <w:rPr>
           <w:i/>
           <w:iCs/>
           <w:sz w:val="22"/>
           <w:szCs w:val="22"/>
-          <w:u w:val="single"/>
-        </w:rPr>
-        <w:t>testCardDeckAddCard</w:t>
-      </w:r>
-      <w:proofErr w:type="spellEnd"/>
+        </w:rPr>
+        <w:t xml:space="preserve">, </w:t>
+      </w:r>
       <w:r>
         <w:rPr>
           <w:i/>
           <w:iCs/>
           <w:sz w:val="22"/>
           <w:szCs w:val="22"/>
-        </w:rPr>
-        <w:t xml:space="preserve">, </w:t>
-      </w:r>
-      <w:proofErr w:type="spellStart"/>
+          <w:u w:val="single"/>
+        </w:rPr>
+        <w:t>testCardDeckAddCard</w:t>
+      </w:r>
       <w:r>
         <w:rPr>
           <w:i/>
           <w:iCs/>
           <w:sz w:val="22"/>
           <w:szCs w:val="22"/>
-          <w:u w:val="single"/>
-        </w:rPr>
-        <w:t>cardDeckFIFOOrderingCheck</w:t>
-      </w:r>
-      <w:proofErr w:type="spellEnd"/>
-      <w:r>
-        <w:rPr>
-          <w:sz w:val="22"/>
-          <w:szCs w:val="22"/>
-        </w:rPr>
-        <w:t xml:space="preserve"> which</w:t>
-      </w:r>
-      <w:r>
-        <w:rPr>
-          <w:sz w:val="22"/>
-          <w:szCs w:val="22"/>
-        </w:rPr>
-        <w:t xml:space="preserve"> are designed around</w:t>
+        </w:rPr>
+        <w:t xml:space="preserve">, </w:t>
+      </w:r>
+      <w:r>
+        <w:rPr>
+          <w:i/>
+          <w:iCs/>
+          <w:sz w:val="22"/>
+          <w:szCs w:val="22"/>
+          <w:u w:val="single"/>
+        </w:rPr>
+        <w:t>testC</w:t>
+      </w:r>
+      <w:r>
+        <w:rPr>
+          <w:i/>
+          <w:iCs/>
+          <w:sz w:val="22"/>
+          <w:szCs w:val="22"/>
+          <w:u w:val="single"/>
+        </w:rPr>
+        <w:t>ardDeckFIFOOrderin</w:t>
+      </w:r>
+      <w:r>
+        <w:rPr>
+          <w:i/>
+          <w:iCs/>
+          <w:sz w:val="22"/>
+          <w:szCs w:val="22"/>
+          <w:u w:val="single"/>
+        </w:rPr>
+        <w:t>g</w:t>
+      </w:r>
+      <w:r>
+        <w:rPr>
+          <w:sz w:val="22"/>
+          <w:szCs w:val="22"/>
+        </w:rPr>
+        <w:t xml:space="preserve"> </w:t>
+      </w:r>
+      <w:r>
+        <w:rPr>
+          <w:sz w:val="22"/>
+          <w:szCs w:val="22"/>
+        </w:rPr>
+        <w:t>which</w:t>
+      </w:r>
+      <w:r>
+        <w:rPr>
+          <w:sz w:val="22"/>
+          <w:szCs w:val="22"/>
+        </w:rPr>
+        <w:t xml:space="preserve"> are designed</w:t>
+      </w:r>
+      <w:r>
+        <w:rPr>
+          <w:sz w:val="22"/>
+          <w:szCs w:val="22"/>
+        </w:rPr>
+        <w:t xml:space="preserve"> to test </w:t>
+      </w:r>
+      <w:r>
+        <w:rPr>
+          <w:sz w:val="22"/>
+          <w:szCs w:val="22"/>
+        </w:rPr>
+        <w:t xml:space="preserve">deck creation, </w:t>
+      </w:r>
+      <w:r>
+        <w:rPr>
+          <w:sz w:val="22"/>
+          <w:szCs w:val="22"/>
+        </w:rPr>
+        <w:t xml:space="preserve">deck card distribution </w:t>
+      </w:r>
+      <w:r>
+        <w:rPr>
+          <w:sz w:val="22"/>
+          <w:szCs w:val="22"/>
+        </w:rPr>
+        <w:lastRenderedPageBreak/>
+        <w:t>(once again in the expected round</w:t>
+      </w:r>
+      <w:r>
+        <w:rPr>
+          <w:sz w:val="22"/>
+          <w:szCs w:val="22"/>
+        </w:rPr>
+        <w:t>-</w:t>
+      </w:r>
+      <w:r>
+        <w:rPr>
+          <w:sz w:val="22"/>
+          <w:szCs w:val="22"/>
+        </w:rPr>
+        <w:t xml:space="preserve">robin version after the players), </w:t>
+      </w:r>
+      <w:r>
+        <w:rPr>
+          <w:sz w:val="22"/>
+          <w:szCs w:val="22"/>
+        </w:rPr>
+        <w:t>draw and discard correctness functionality including the</w:t>
+      </w:r>
+      <w:r>
+        <w:rPr>
+          <w:sz w:val="22"/>
+          <w:szCs w:val="22"/>
+        </w:rPr>
+        <w:t xml:space="preserve"> strict following of a</w:t>
+      </w:r>
+      <w:r>
+        <w:rPr>
+          <w:sz w:val="22"/>
+          <w:szCs w:val="22"/>
+        </w:rPr>
+        <w:t xml:space="preserve"> </w:t>
+      </w:r>
+      <w:r>
+        <w:rPr>
+          <w:sz w:val="22"/>
+          <w:szCs w:val="22"/>
+        </w:rPr>
+        <w:t xml:space="preserve">first-in first-out </w:t>
+      </w:r>
+      <w:r>
+        <w:rPr>
+          <w:sz w:val="22"/>
+          <w:szCs w:val="22"/>
+        </w:rPr>
+        <w:t xml:space="preserve">card </w:t>
+      </w:r>
+      <w:r>
+        <w:rPr>
+          <w:sz w:val="22"/>
+          <w:szCs w:val="22"/>
+        </w:rPr>
+        <w:t>ordering</w:t>
+      </w:r>
+      <w:r>
+        <w:rPr>
+          <w:sz w:val="22"/>
+          <w:szCs w:val="22"/>
+        </w:rPr>
+        <w:t>.</w:t>
       </w:r>
     </w:p>
     <w:p>
@@ -702,100 +2065,77 @@
     <w:p>
       <w:pPr>
         <w:rPr>
-          <w:sz w:val="22"/>
-          <w:szCs w:val="22"/>
-        </w:rPr>
-      </w:pPr>
-      <w:r>
-        <w:rPr>
-          <w:sz w:val="22"/>
-          <w:szCs w:val="22"/>
-        </w:rPr>
-        <w:t xml:space="preserve">The system wide tests are </w:t>
-      </w:r>
-      <w:proofErr w:type="spellStart"/>
-      <w:r>
-        <w:rPr>
           <w:i/>
           <w:iCs/>
           <w:sz w:val="22"/>
           <w:szCs w:val="22"/>
           <w:u w:val="single"/>
         </w:rPr>
-        <w:t>winningPlayerEndingHandCheck</w:t>
-      </w:r>
-      <w:proofErr w:type="spellEnd"/>
+      </w:pPr>
+      <w:r>
+        <w:rPr>
+          <w:sz w:val="22"/>
+          <w:szCs w:val="22"/>
+        </w:rPr>
+        <w:t xml:space="preserve">The system wide tests are </w:t>
+      </w:r>
       <w:r>
         <w:rPr>
           <w:i/>
           <w:iCs/>
           <w:sz w:val="22"/>
           <w:szCs w:val="22"/>
-        </w:rPr>
-        <w:t xml:space="preserve">, </w:t>
-      </w:r>
-      <w:proofErr w:type="spellStart"/>
+          <w:u w:val="single"/>
+        </w:rPr>
+        <w:t>testWinningPlayerEndingHand</w:t>
+      </w:r>
       <w:r>
         <w:rPr>
           <w:i/>
           <w:iCs/>
           <w:sz w:val="22"/>
           <w:szCs w:val="22"/>
-          <w:u w:val="single"/>
-        </w:rPr>
-        <w:t>cardStabilityCheck</w:t>
-      </w:r>
-      <w:proofErr w:type="spellEnd"/>
+        </w:rPr>
+        <w:t xml:space="preserve">, </w:t>
+      </w:r>
       <w:r>
         <w:rPr>
           <w:i/>
           <w:iCs/>
           <w:sz w:val="22"/>
           <w:szCs w:val="22"/>
-        </w:rPr>
-        <w:t xml:space="preserve">, </w:t>
-      </w:r>
-      <w:proofErr w:type="spellStart"/>
+          <w:u w:val="single"/>
+        </w:rPr>
+        <w:t>testCardStability</w:t>
+      </w:r>
       <w:r>
         <w:rPr>
           <w:i/>
           <w:iCs/>
           <w:sz w:val="22"/>
           <w:szCs w:val="22"/>
-          <w:u w:val="single"/>
-        </w:rPr>
-        <w:t>playerThreadsTerminatedCheck</w:t>
-      </w:r>
-      <w:proofErr w:type="spellEnd"/>
+        </w:rPr>
+        <w:t xml:space="preserve">, </w:t>
+      </w:r>
       <w:r>
         <w:rPr>
           <w:i/>
           <w:iCs/>
           <w:sz w:val="22"/>
           <w:szCs w:val="22"/>
-        </w:rPr>
-        <w:t xml:space="preserve">, </w:t>
-      </w:r>
-      <w:proofErr w:type="spellStart"/>
+          <w:u w:val="single"/>
+        </w:rPr>
+        <w:t>testPlayerThreadsTerminate</w:t>
+      </w:r>
       <w:r>
         <w:rPr>
           <w:i/>
           <w:iCs/>
           <w:sz w:val="22"/>
           <w:szCs w:val="22"/>
-          <w:u w:val="single"/>
-        </w:rPr>
-        <w:t>playerOutputFileContentsCheck</w:t>
-      </w:r>
-      <w:proofErr w:type="spellEnd"/>
-      <w:r>
-        <w:rPr>
-          <w:sz w:val="22"/>
-          <w:szCs w:val="22"/>
-        </w:rPr>
-        <w:t xml:space="preserve"> and </w:t>
-      </w:r>
-      <w:proofErr w:type="spellStart"/>
+        </w:rPr>
+        <w:t xml:space="preserve">, </w:t>
+      </w:r>
       <w:r>
         <w:rPr>
           <w:i/>
@@ -804,15 +2144,52 @@
           <w:szCs w:val="22"/>
           <w:u w:val="single"/>
         </w:rPr>
-        <w:t>playerDiscardDenominationCheck</w:t>
-      </w:r>
-      <w:proofErr w:type="spellEnd"/>
-      <w:r>
-        <w:rPr>
-          <w:sz w:val="22"/>
-          <w:szCs w:val="22"/>
-        </w:rPr>
-        <w:t xml:space="preserve"> which</w:t>
+        <w:t>testPlayerOutputFileContents</w:t>
+      </w:r>
+      <w:r>
+        <w:rPr>
+          <w:sz w:val="22"/>
+          <w:szCs w:val="22"/>
+        </w:rPr>
+        <w:t xml:space="preserve"> </w:t>
+      </w:r>
+      <w:r>
+        <w:rPr>
+          <w:sz w:val="22"/>
+          <w:szCs w:val="22"/>
+        </w:rPr>
+        <w:t>and</w:t>
+      </w:r>
+      <w:r>
+        <w:rPr>
+          <w:sz w:val="22"/>
+          <w:szCs w:val="22"/>
+        </w:rPr>
+        <w:t xml:space="preserve"> </w:t>
+      </w:r>
+      <w:r>
+        <w:rPr>
+          <w:i/>
+          <w:iCs/>
+          <w:sz w:val="22"/>
+          <w:szCs w:val="22"/>
+          <w:u w:val="single"/>
+        </w:rPr>
+        <w:t>testPlayerDiscardDenomination</w:t>
+      </w:r>
+      <w:r>
+        <w:rPr>
+          <w:sz w:val="22"/>
+          <w:szCs w:val="22"/>
+        </w:rPr>
+        <w:t xml:space="preserve"> </w:t>
+      </w:r>
+      <w:r>
+        <w:rPr>
+          <w:sz w:val="22"/>
+          <w:szCs w:val="22"/>
+        </w:rPr>
+        <w:t>which</w:t>
       </w:r>
       <w:r>
         <w:rPr>
@@ -820,6 +2197,97 @@
           <w:szCs w:val="22"/>
         </w:rPr>
         <w:t xml:space="preserve"> are all designed around</w:t>
+      </w:r>
+      <w:r>
+        <w:rPr>
+          <w:sz w:val="22"/>
+          <w:szCs w:val="22"/>
+        </w:rPr>
+        <w:t xml:space="preserve"> allowing a full game to run (with a </w:t>
+      </w:r>
+      <w:r>
+        <w:rPr>
+          <w:sz w:val="22"/>
+          <w:szCs w:val="22"/>
+        </w:rPr>
+        <w:t>pre-determined</w:t>
+      </w:r>
+      <w:r>
+        <w:rPr>
+          <w:sz w:val="22"/>
+          <w:szCs w:val="22"/>
+        </w:rPr>
+        <w:t xml:space="preserve"> winner)</w:t>
+      </w:r>
+      <w:r>
+        <w:rPr>
+          <w:sz w:val="22"/>
+          <w:szCs w:val="22"/>
+        </w:rPr>
+        <w:t xml:space="preserve"> and then checking </w:t>
+      </w:r>
+      <w:r>
+        <w:rPr>
+          <w:sz w:val="22"/>
+          <w:szCs w:val="22"/>
+        </w:rPr>
+        <w:t xml:space="preserve">the winning player’s end hand consists of only their preferred card </w:t>
+      </w:r>
+      <w:r>
+        <w:rPr>
+          <w:sz w:val="22"/>
+          <w:szCs w:val="22"/>
+        </w:rPr>
+        <w:t>denomination</w:t>
+      </w:r>
+      <w:r>
+        <w:rPr>
+          <w:sz w:val="22"/>
+          <w:szCs w:val="22"/>
+        </w:rPr>
+        <w:t xml:space="preserve">, </w:t>
+      </w:r>
+      <w:r>
+        <w:rPr>
+          <w:sz w:val="22"/>
+          <w:szCs w:val="22"/>
+        </w:rPr>
+        <w:t xml:space="preserve">whether the total number of cards in play has remained constant (e.g. no cards have been duplicated or lost during the game), </w:t>
+      </w:r>
+      <w:r>
+        <w:rPr>
+          <w:sz w:val="22"/>
+          <w:szCs w:val="22"/>
+        </w:rPr>
+        <w:t xml:space="preserve">all the player threads successfully terminate at the end of a game, </w:t>
+      </w:r>
+      <w:r>
+        <w:rPr>
+          <w:sz w:val="22"/>
+          <w:szCs w:val="22"/>
+        </w:rPr>
+        <w:t xml:space="preserve">the log files are correct for both the winning and losing player and finally that throughout the whole game a player never discards their preferred card </w:t>
+      </w:r>
+      <w:r>
+        <w:rPr>
+          <w:sz w:val="22"/>
+          <w:szCs w:val="22"/>
+        </w:rPr>
+        <w:t>denomination</w:t>
+      </w:r>
+      <w:r>
+        <w:rPr>
+          <w:sz w:val="22"/>
+          <w:szCs w:val="22"/>
+        </w:rPr>
+        <w:t xml:space="preserve"> respectively</w:t>
+      </w:r>
+      <w:r>
+        <w:rPr>
+          <w:sz w:val="22"/>
+          <w:szCs w:val="22"/>
+        </w:rPr>
+        <w:t>.</w:t>
       </w:r>
     </w:p>
     <w:p>
@@ -879,40 +2347,316 @@
           <w:sz w:val="22"/>
           <w:szCs w:val="22"/>
         </w:rPr>
-        <w:lastRenderedPageBreak/>
-        <w:t>The</w:t>
-      </w:r>
-    </w:p>
-    <w:p>
-      <w:pPr>
-        <w:rPr>
-          <w:sz w:val="22"/>
-          <w:szCs w:val="22"/>
-        </w:rPr>
-      </w:pPr>
-    </w:p>
-    <w:p>
-      <w:pPr>
-        <w:rPr>
-          <w:sz w:val="22"/>
-          <w:szCs w:val="22"/>
-        </w:rPr>
-      </w:pPr>
-      <w:r>
-        <w:rPr>
-          <w:sz w:val="22"/>
-          <w:szCs w:val="22"/>
-        </w:rPr>
-        <w:t>Tests of entire game time out after 5 seconds</w:t>
-      </w:r>
-    </w:p>
-    <w:p>
-      <w:pPr>
-        <w:rPr>
-          <w:sz w:val="22"/>
-          <w:szCs w:val="22"/>
-        </w:rPr>
-      </w:pPr>
+        <w:t xml:space="preserve">While the current testing suite covers </w:t>
+      </w:r>
+      <w:r>
+        <w:rPr>
+          <w:sz w:val="22"/>
+          <w:szCs w:val="22"/>
+        </w:rPr>
+        <w:t>a considerable portion</w:t>
+      </w:r>
+      <w:r>
+        <w:rPr>
+          <w:sz w:val="22"/>
+          <w:szCs w:val="22"/>
+        </w:rPr>
+        <w:t xml:space="preserve"> of</w:t>
+      </w:r>
+      <w:r>
+        <w:rPr>
+          <w:sz w:val="22"/>
+          <w:szCs w:val="22"/>
+        </w:rPr>
+        <w:t xml:space="preserve"> the CardGame, CardDeck, Player and Card </w:t>
+      </w:r>
+      <w:r>
+        <w:rPr>
+          <w:sz w:val="22"/>
+          <w:szCs w:val="22"/>
+        </w:rPr>
+        <w:t>class</w:t>
+      </w:r>
+      <w:r>
+        <w:rPr>
+          <w:sz w:val="22"/>
+          <w:szCs w:val="22"/>
+        </w:rPr>
+        <w:t xml:space="preserve"> functionality</w:t>
+      </w:r>
+      <w:r>
+        <w:rPr>
+          <w:sz w:val="22"/>
+          <w:szCs w:val="22"/>
+        </w:rPr>
+        <w:t xml:space="preserve"> </w:t>
+      </w:r>
+      <w:r>
+        <w:rPr>
+          <w:sz w:val="22"/>
+          <w:szCs w:val="22"/>
+        </w:rPr>
+        <w:t xml:space="preserve">it </w:t>
+      </w:r>
+      <w:r>
+        <w:rPr>
+          <w:sz w:val="22"/>
+          <w:szCs w:val="22"/>
+        </w:rPr>
+        <w:t>still has its limitations</w:t>
+      </w:r>
+      <w:r>
+        <w:rPr>
+          <w:sz w:val="22"/>
+          <w:szCs w:val="22"/>
+        </w:rPr>
+        <w:t xml:space="preserve">. </w:t>
+      </w:r>
+      <w:r>
+        <w:rPr>
+          <w:sz w:val="22"/>
+          <w:szCs w:val="22"/>
+        </w:rPr>
+        <w:t>For example</w:t>
+      </w:r>
+      <w:r>
+        <w:rPr>
+          <w:sz w:val="22"/>
+          <w:szCs w:val="22"/>
+        </w:rPr>
+        <w:t xml:space="preserve">, reading player hands directly as the game runs is almost impossible as </w:t>
+      </w:r>
+      <w:r>
+        <w:rPr>
+          <w:sz w:val="22"/>
+          <w:szCs w:val="22"/>
+        </w:rPr>
+        <w:t xml:space="preserve">each </w:t>
+      </w:r>
+      <w:r>
+        <w:rPr>
+          <w:sz w:val="22"/>
+          <w:szCs w:val="22"/>
+        </w:rPr>
+        <w:t>player thread run</w:t>
+      </w:r>
+      <w:r>
+        <w:rPr>
+          <w:sz w:val="22"/>
+          <w:szCs w:val="22"/>
+        </w:rPr>
+        <w:t>s</w:t>
+      </w:r>
+      <w:r>
+        <w:rPr>
+          <w:sz w:val="22"/>
+          <w:szCs w:val="22"/>
+        </w:rPr>
+        <w:t xml:space="preserve"> </w:t>
+      </w:r>
+      <w:r>
+        <w:rPr>
+          <w:sz w:val="22"/>
+          <w:szCs w:val="22"/>
+        </w:rPr>
+        <w:t>unpredictably</w:t>
+      </w:r>
+      <w:r>
+        <w:rPr>
+          <w:sz w:val="22"/>
+          <w:szCs w:val="22"/>
+        </w:rPr>
+        <w:t xml:space="preserve"> meaning the current test suite has to use the player logs to check move </w:t>
+      </w:r>
+      <w:r>
+        <w:rPr>
+          <w:sz w:val="22"/>
+          <w:szCs w:val="22"/>
+        </w:rPr>
+        <w:t>correctness</w:t>
+      </w:r>
+      <w:r>
+        <w:rPr>
+          <w:sz w:val="22"/>
+          <w:szCs w:val="22"/>
+        </w:rPr>
+        <w:t xml:space="preserve"> </w:t>
+      </w:r>
+      <w:r>
+        <w:rPr>
+          <w:sz w:val="22"/>
+          <w:szCs w:val="22"/>
+        </w:rPr>
+        <w:t>indirectly</w:t>
+      </w:r>
+      <w:r>
+        <w:rPr>
+          <w:sz w:val="22"/>
+          <w:szCs w:val="22"/>
+        </w:rPr>
+        <w:t>.</w:t>
+      </w:r>
+      <w:r>
+        <w:rPr>
+          <w:sz w:val="22"/>
+          <w:szCs w:val="22"/>
+        </w:rPr>
+        <w:t xml:space="preserve"> </w:t>
+      </w:r>
+      <w:r>
+        <w:rPr>
+          <w:sz w:val="22"/>
+          <w:szCs w:val="22"/>
+        </w:rPr>
+        <w:t>Additionally</w:t>
+      </w:r>
+      <w:r>
+        <w:rPr>
+          <w:sz w:val="22"/>
+          <w:szCs w:val="22"/>
+        </w:rPr>
+        <w:t xml:space="preserve">, </w:t>
+      </w:r>
+      <w:r>
+        <w:rPr>
+          <w:sz w:val="22"/>
+          <w:szCs w:val="22"/>
+        </w:rPr>
+        <w:t xml:space="preserve">due to the </w:t>
+      </w:r>
+      <w:r>
+        <w:rPr>
+          <w:sz w:val="22"/>
+          <w:szCs w:val="22"/>
+        </w:rPr>
+        <w:t>non-deterministic</w:t>
+      </w:r>
+      <w:r>
+        <w:rPr>
+          <w:sz w:val="22"/>
+          <w:szCs w:val="22"/>
+        </w:rPr>
+        <w:t xml:space="preserve"> nature</w:t>
+      </w:r>
+      <w:r>
+        <w:rPr>
+          <w:sz w:val="22"/>
+          <w:szCs w:val="22"/>
+        </w:rPr>
+        <w:t xml:space="preserve"> of the player threads calling </w:t>
+      </w:r>
+      <w:r>
+        <w:rPr>
+          <w:sz w:val="22"/>
+          <w:szCs w:val="22"/>
+        </w:rPr>
+        <w:t>discard and pickup</w:t>
+      </w:r>
+      <w:r>
+        <w:rPr>
+          <w:sz w:val="22"/>
+          <w:szCs w:val="22"/>
+        </w:rPr>
+        <w:t>,</w:t>
+      </w:r>
+      <w:r>
+        <w:rPr>
+          <w:sz w:val="22"/>
+          <w:szCs w:val="22"/>
+        </w:rPr>
+        <w:t xml:space="preserve"> </w:t>
+      </w:r>
+      <w:r>
+        <w:rPr>
+          <w:sz w:val="22"/>
+          <w:szCs w:val="22"/>
+        </w:rPr>
+        <w:t xml:space="preserve">it is impossible to predict the runtime of a given game meaning the tests are set to allow a maximum time </w:t>
+      </w:r>
+      <w:r>
+        <w:rPr>
+          <w:sz w:val="22"/>
+          <w:szCs w:val="22"/>
+        </w:rPr>
+        <w:t>of 5 seconds before they automatically fail.</w:t>
+      </w:r>
+      <w:r>
+        <w:rPr>
+          <w:sz w:val="22"/>
+          <w:szCs w:val="22"/>
+        </w:rPr>
+        <w:t xml:space="preserve"> </w:t>
+      </w:r>
+      <w:r>
+        <w:rPr>
+          <w:sz w:val="22"/>
+          <w:szCs w:val="22"/>
+        </w:rPr>
+        <w:t>On top of this, a</w:t>
+      </w:r>
+      <w:r>
+        <w:rPr>
+          <w:sz w:val="22"/>
+          <w:szCs w:val="22"/>
+        </w:rPr>
+        <w:t xml:space="preserve">nother limitation is that </w:t>
+      </w:r>
+      <w:r>
+        <w:rPr>
+          <w:sz w:val="22"/>
+          <w:szCs w:val="22"/>
+        </w:rPr>
+        <w:t>the tests are designed in a way that works well with a small number of players</w:t>
+      </w:r>
+      <w:r>
+        <w:rPr>
+          <w:sz w:val="22"/>
+          <w:szCs w:val="22"/>
+        </w:rPr>
+        <w:t xml:space="preserve"> meaning trying to run a test for a large number of players would make</w:t>
+      </w:r>
+      <w:r>
+        <w:rPr>
+          <w:sz w:val="22"/>
+          <w:szCs w:val="22"/>
+        </w:rPr>
+        <w:t xml:space="preserve"> setting up variables</w:t>
+      </w:r>
+      <w:r>
+        <w:rPr>
+          <w:sz w:val="22"/>
+          <w:szCs w:val="22"/>
+        </w:rPr>
+        <w:t xml:space="preserve"> and</w:t>
+      </w:r>
+      <w:r>
+        <w:rPr>
+          <w:sz w:val="22"/>
+          <w:szCs w:val="22"/>
+        </w:rPr>
+        <w:t xml:space="preserve"> checking outputs and player hand contents incredibly difficult</w:t>
+      </w:r>
+      <w:r>
+        <w:rPr>
+          <w:sz w:val="22"/>
+          <w:szCs w:val="22"/>
+        </w:rPr>
+        <w:t xml:space="preserve"> with the current setup</w:t>
+      </w:r>
+      <w:r>
+        <w:rPr>
+          <w:sz w:val="22"/>
+          <w:szCs w:val="22"/>
+        </w:rPr>
+        <w:t xml:space="preserve"> as it would all need to be added manually</w:t>
+      </w:r>
+      <w:r>
+        <w:rPr>
+          <w:sz w:val="22"/>
+          <w:szCs w:val="22"/>
+        </w:rPr>
+        <w:t>.</w:t>
+      </w:r>
       <w:r>
         <w:rPr>
           <w:sz w:val="22"/>
@@ -920,29 +2664,13 @@
         </w:rPr>
         <w:br w:type="page"/>
       </w:r>
-    </w:p>
-    <w:p>
-      <w:pPr>
-        <w:rPr>
-          <w:sz w:val="22"/>
-          <w:szCs w:val="22"/>
-        </w:rPr>
-      </w:pPr>
-    </w:p>
-    <w:p>
-      <w:pPr>
+      <w:r>
         <w:rPr>
           <w:sz w:val="28"/>
           <w:szCs w:val="28"/>
           <w:u w:val="single"/>
         </w:rPr>
-      </w:pPr>
-      <w:r>
-        <w:rPr>
-          <w:sz w:val="28"/>
-          <w:szCs w:val="28"/>
-          <w:u w:val="single"/>
-        </w:rPr>
+        <w:lastRenderedPageBreak/>
         <w:t>De</w:t>
       </w:r>
       <w:r>
@@ -1216,7 +2944,14 @@
           <w:sz w:val="22"/>
           <w:szCs w:val="22"/>
         </w:rPr>
-        <w:t xml:space="preserve"> and reading card packs</w:t>
+        <w:t xml:space="preserve"> and reading card </w:t>
+      </w:r>
+      <w:r>
+        <w:rPr>
+          <w:sz w:val="22"/>
+          <w:szCs w:val="22"/>
+        </w:rPr>
+        <w:t>packs.</w:t>
       </w:r>
     </w:p>
     <w:p>
@@ -1323,7 +3058,28 @@
           <w:sz w:val="22"/>
           <w:szCs w:val="22"/>
         </w:rPr>
-        <w:t xml:space="preserve"> were not being distributed in a round robin fashion</w:t>
+        <w:t xml:space="preserve"> were not being distributed in a round</w:t>
+      </w:r>
+      <w:r>
+        <w:rPr>
+          <w:sz w:val="22"/>
+          <w:szCs w:val="22"/>
+        </w:rPr>
+        <w:t>-</w:t>
+      </w:r>
+      <w:r>
+        <w:rPr>
+          <w:sz w:val="22"/>
+          <w:szCs w:val="22"/>
+        </w:rPr>
+        <w:t xml:space="preserve">robin </w:t>
+      </w:r>
+      <w:r>
+        <w:rPr>
+          <w:sz w:val="22"/>
+          <w:szCs w:val="22"/>
+        </w:rPr>
+        <w:t>fashion.</w:t>
       </w:r>
     </w:p>
     <w:p>
@@ -1462,6 +3218,13 @@
         </w:rPr>
         <w:t xml:space="preserve"> as well as deck and player initialisation and winning hand checks</w:t>
       </w:r>
+      <w:r>
+        <w:rPr>
+          <w:sz w:val="22"/>
+          <w:szCs w:val="22"/>
+        </w:rPr>
+        <w:t>.</w:t>
+      </w:r>
     </w:p>
     <w:p>
       <w:pPr>
@@ -1560,7 +3323,21 @@
           <w:sz w:val="22"/>
           <w:szCs w:val="22"/>
         </w:rPr>
-        <w:t xml:space="preserve">console logging and began and implemented the </w:t>
+        <w:t xml:space="preserve">console logging and </w:t>
+      </w:r>
+      <w:r>
+        <w:rPr>
+          <w:sz w:val="22"/>
+          <w:szCs w:val="22"/>
+        </w:rPr>
+        <w:t xml:space="preserve">fully </w:t>
+      </w:r>
+      <w:r>
+        <w:rPr>
+          <w:sz w:val="22"/>
+          <w:szCs w:val="22"/>
+        </w:rPr>
+        <w:t xml:space="preserve">implemented the </w:t>
       </w:r>
       <w:r>
         <w:rPr>
@@ -1812,7 +3589,14 @@
           <w:sz w:val="22"/>
           <w:szCs w:val="22"/>
         </w:rPr>
-        <w:t xml:space="preserve"> pickup and discard card logic</w:t>
+        <w:t xml:space="preserve"> pickup and discard card </w:t>
+      </w:r>
+      <w:r>
+        <w:rPr>
+          <w:sz w:val="22"/>
+          <w:szCs w:val="22"/>
+        </w:rPr>
+        <w:t>logic.</w:t>
       </w:r>
     </w:p>
     <w:p>
@@ -1859,7 +3643,49 @@
           <w:sz w:val="22"/>
           <w:szCs w:val="22"/>
         </w:rPr>
-        <w:t>005b133</w:t>
+        <w:t xml:space="preserve">005b133 </w:t>
+      </w:r>
+      <w:r>
+        <w:rPr>
+          <w:sz w:val="22"/>
+          <w:szCs w:val="22"/>
+        </w:rPr>
+        <w:t>(</w:t>
+      </w:r>
+      <w:r>
+        <w:rPr>
+          <w:sz w:val="22"/>
+          <w:szCs w:val="22"/>
+        </w:rPr>
+        <w:t>4</w:t>
+      </w:r>
+      <w:r>
+        <w:rPr>
+          <w:sz w:val="22"/>
+          <w:szCs w:val="22"/>
+        </w:rPr>
+        <w:t xml:space="preserve">/10/26): </w:t>
+      </w:r>
+      <w:r>
+        <w:rPr>
+          <w:sz w:val="22"/>
+          <w:szCs w:val="22"/>
+        </w:rPr>
+        <w:t>Implemented the start of game player and card pack location</w:t>
+      </w:r>
+      <w:r>
+        <w:rPr>
+          <w:sz w:val="22"/>
+          <w:szCs w:val="22"/>
+        </w:rPr>
+        <w:t xml:space="preserve"> and reading logic and improved the thread safety of </w:t>
+      </w:r>
+      <w:r>
+        <w:rPr>
+          <w:sz w:val="22"/>
+          <w:szCs w:val="22"/>
+        </w:rPr>
+        <w:t xml:space="preserve">the </w:t>
       </w:r>
       <w:r>
         <w:rPr>
@@ -1868,49 +3694,14 @@
           <w:sz w:val="22"/>
           <w:szCs w:val="22"/>
         </w:rPr>
-        <w:t xml:space="preserve"> </w:t>
-      </w:r>
-      <w:r>
-        <w:rPr>
-          <w:sz w:val="22"/>
-          <w:szCs w:val="22"/>
-        </w:rPr>
-        <w:t>(</w:t>
-      </w:r>
-      <w:r>
-        <w:rPr>
-          <w:sz w:val="22"/>
-          <w:szCs w:val="22"/>
-        </w:rPr>
-        <w:t>4</w:t>
-      </w:r>
-      <w:r>
-        <w:rPr>
-          <w:sz w:val="22"/>
-          <w:szCs w:val="22"/>
-        </w:rPr>
-        <w:t xml:space="preserve">/10/26): </w:t>
-      </w:r>
-      <w:r>
-        <w:rPr>
-          <w:sz w:val="22"/>
-          <w:szCs w:val="22"/>
-        </w:rPr>
-        <w:t>Implemented the start of game player and card pack location</w:t>
-      </w:r>
-      <w:r>
-        <w:rPr>
-          <w:sz w:val="22"/>
-          <w:szCs w:val="22"/>
-        </w:rPr>
-        <w:t xml:space="preserve"> and reading logic and improved the thread safety of </w:t>
-      </w:r>
-      <w:r>
-        <w:rPr>
-          <w:sz w:val="22"/>
-          <w:szCs w:val="22"/>
-        </w:rPr>
-        <w:t xml:space="preserve">the </w:t>
+        <w:t>drawCard</w:t>
+      </w:r>
+      <w:r>
+        <w:rPr>
+          <w:sz w:val="22"/>
+          <w:szCs w:val="22"/>
+        </w:rPr>
+        <w:t xml:space="preserve"> and </w:t>
       </w:r>
       <w:r>
         <w:rPr>
@@ -1919,22 +3710,6 @@
           <w:sz w:val="22"/>
           <w:szCs w:val="22"/>
         </w:rPr>
-        <w:t>drawCard</w:t>
-      </w:r>
-      <w:r>
-        <w:rPr>
-          <w:sz w:val="22"/>
-          <w:szCs w:val="22"/>
-        </w:rPr>
-        <w:t xml:space="preserve"> and </w:t>
-      </w:r>
-      <w:r>
-        <w:rPr>
-          <w:i/>
-          <w:iCs/>
-          <w:sz w:val="22"/>
-          <w:szCs w:val="22"/>
-        </w:rPr>
         <w:t>addCard</w:t>
       </w:r>
       <w:r>
@@ -1949,7 +3724,7 @@
           <w:sz w:val="22"/>
           <w:szCs w:val="22"/>
         </w:rPr>
-        <w:t>functions</w:t>
+        <w:t>functions.</w:t>
       </w:r>
     </w:p>
     <w:p>
@@ -1996,12 +3771,80 @@
           <w:sz w:val="22"/>
           <w:szCs w:val="22"/>
         </w:rPr>
-        <w:t>d911cfe</w:t>
-      </w:r>
-      <w:r>
-        <w:rPr>
-          <w:i/>
-          <w:iCs/>
+        <w:t xml:space="preserve">d911cfe </w:t>
+      </w:r>
+      <w:r>
+        <w:rPr>
+          <w:sz w:val="22"/>
+          <w:szCs w:val="22"/>
+        </w:rPr>
+        <w:t>(</w:t>
+      </w:r>
+      <w:r>
+        <w:rPr>
+          <w:sz w:val="22"/>
+          <w:szCs w:val="22"/>
+        </w:rPr>
+        <w:t>6</w:t>
+      </w:r>
+      <w:r>
+        <w:rPr>
+          <w:sz w:val="22"/>
+          <w:szCs w:val="22"/>
+        </w:rPr>
+        <w:t xml:space="preserve">/10/26): </w:t>
+      </w:r>
+      <w:r>
+        <w:rPr>
+          <w:sz w:val="22"/>
+          <w:szCs w:val="22"/>
+        </w:rPr>
+        <w:t>Got JUnit 5 working with the project</w:t>
+      </w:r>
+      <w:r>
+        <w:rPr>
+          <w:sz w:val="22"/>
+          <w:szCs w:val="22"/>
+        </w:rPr>
+        <w:t xml:space="preserve"> after </w:t>
+      </w:r>
+      <w:r>
+        <w:rPr>
+          <w:sz w:val="22"/>
+          <w:szCs w:val="22"/>
+        </w:rPr>
+        <w:t>restructuring</w:t>
+      </w:r>
+      <w:r>
+        <w:rPr>
+          <w:sz w:val="22"/>
+          <w:szCs w:val="22"/>
+        </w:rPr>
+        <w:t xml:space="preserve"> the layout</w:t>
+      </w:r>
+      <w:r>
+        <w:rPr>
+          <w:sz w:val="22"/>
+          <w:szCs w:val="22"/>
+        </w:rPr>
+        <w:t xml:space="preserve"> and added </w:t>
+      </w:r>
+      <w:r>
+        <w:rPr>
+          <w:sz w:val="22"/>
+          <w:szCs w:val="22"/>
+        </w:rPr>
+        <w:t>first player hand and card deck</w:t>
+      </w:r>
+      <w:r>
+        <w:rPr>
+          <w:sz w:val="22"/>
+          <w:szCs w:val="22"/>
+        </w:rPr>
+        <w:t xml:space="preserve"> contents</w:t>
+      </w:r>
+      <w:r>
+        <w:rPr>
           <w:sz w:val="22"/>
           <w:szCs w:val="22"/>
         </w:rPr>
@@ -2012,77 +3855,7 @@
           <w:sz w:val="22"/>
           <w:szCs w:val="22"/>
         </w:rPr>
-        <w:t>(</w:t>
-      </w:r>
-      <w:r>
-        <w:rPr>
-          <w:sz w:val="22"/>
-          <w:szCs w:val="22"/>
-        </w:rPr>
-        <w:t>6</w:t>
-      </w:r>
-      <w:r>
-        <w:rPr>
-          <w:sz w:val="22"/>
-          <w:szCs w:val="22"/>
-        </w:rPr>
-        <w:t xml:space="preserve">/10/26): </w:t>
-      </w:r>
-      <w:r>
-        <w:rPr>
-          <w:sz w:val="22"/>
-          <w:szCs w:val="22"/>
-        </w:rPr>
-        <w:t>Got JUnit 5 working with the project</w:t>
-      </w:r>
-      <w:r>
-        <w:rPr>
-          <w:sz w:val="22"/>
-          <w:szCs w:val="22"/>
-        </w:rPr>
-        <w:t xml:space="preserve"> after </w:t>
-      </w:r>
-      <w:r>
-        <w:rPr>
-          <w:sz w:val="22"/>
-          <w:szCs w:val="22"/>
-        </w:rPr>
-        <w:t>restructuring</w:t>
-      </w:r>
-      <w:r>
-        <w:rPr>
-          <w:sz w:val="22"/>
-          <w:szCs w:val="22"/>
-        </w:rPr>
-        <w:t xml:space="preserve"> the layout</w:t>
-      </w:r>
-      <w:r>
-        <w:rPr>
-          <w:sz w:val="22"/>
-          <w:szCs w:val="22"/>
-        </w:rPr>
-        <w:t xml:space="preserve"> and added </w:t>
-      </w:r>
-      <w:r>
-        <w:rPr>
-          <w:sz w:val="22"/>
-          <w:szCs w:val="22"/>
-        </w:rPr>
-        <w:t>first player hand and card deck</w:t>
-      </w:r>
-      <w:r>
-        <w:rPr>
-          <w:sz w:val="22"/>
-          <w:szCs w:val="22"/>
-        </w:rPr>
-        <w:t xml:space="preserve"> contents</w:t>
-      </w:r>
-      <w:r>
-        <w:rPr>
-          <w:sz w:val="22"/>
-          <w:szCs w:val="22"/>
-        </w:rPr>
-        <w:t xml:space="preserve"> tests</w:t>
+        <w:t>tests.</w:t>
       </w:r>
     </w:p>
     <w:p>
@@ -2129,16 +3902,7 @@
           <w:sz w:val="22"/>
           <w:szCs w:val="22"/>
         </w:rPr>
-        <w:t>0b1f470</w:t>
-      </w:r>
-      <w:r>
-        <w:rPr>
-          <w:i/>
-          <w:iCs/>
-          <w:sz w:val="22"/>
-          <w:szCs w:val="22"/>
-        </w:rPr>
-        <w:t xml:space="preserve"> </w:t>
+        <w:t xml:space="preserve">0b1f470 </w:t>
       </w:r>
       <w:r>
         <w:rPr>
@@ -2187,14 +3951,7 @@
           <w:sz w:val="22"/>
           <w:szCs w:val="22"/>
         </w:rPr>
-        <w:t>foundations for the</w:t>
-      </w:r>
-      <w:r>
-        <w:rPr>
-          <w:sz w:val="22"/>
-          <w:szCs w:val="22"/>
-        </w:rPr>
-        <w:t xml:space="preserve"> </w:t>
+        <w:t xml:space="preserve">foundations for </w:t>
       </w:r>
       <w:r>
         <w:rPr>
@@ -2243,7 +4000,14 @@
           <w:sz w:val="22"/>
           <w:szCs w:val="22"/>
         </w:rPr>
-        <w:t xml:space="preserve"> an issue with the file writer overwriting old logs</w:t>
+        <w:t xml:space="preserve"> an issue with the file writer overwriting old </w:t>
+      </w:r>
+      <w:r>
+        <w:rPr>
+          <w:sz w:val="22"/>
+          <w:szCs w:val="22"/>
+        </w:rPr>
+        <w:t>logs.</w:t>
       </w:r>
     </w:p>
     <w:p>

</xml_diff>

<commit_message>
Updated testCardStability Test + Added Link To GitHub Repo In Report
- The testCardStability test now checks that all the end card values match the starting card values as well as the number of cards remaining constant

- Made the repo public and added a link to it in the report document
</commit_message>
<xml_diff>
--- a/report.docx
+++ b/report.docx
@@ -50,27 +50,63 @@
     </w:p>
     <w:p>
       <w:pPr>
+        <w:jc w:val="center"/>
+        <w:rPr>
+          <w:sz w:val="22"/>
+          <w:szCs w:val="22"/>
+        </w:rPr>
+      </w:pPr>
+      <w:r>
+        <w:rPr>
+          <w:sz w:val="22"/>
+          <w:szCs w:val="22"/>
+        </w:rPr>
+        <w:t>All code and commits can be found at the project’s public repository on GitHub:</w:t>
+      </w:r>
+    </w:p>
+    <w:p>
+      <w:pPr>
+        <w:jc w:val="center"/>
+        <w:rPr>
+          <w:sz w:val="22"/>
+          <w:szCs w:val="22"/>
+        </w:rPr>
+      </w:pPr>
+      <w:hyperlink r:id="rId5" w:history="1">
+        <w:r>
+          <w:rPr>
+            <w:rStyle w:val="Hyperlink"/>
+            <w:sz w:val="22"/>
+            <w:szCs w:val="22"/>
+          </w:rPr>
+          <w:t>https://github.com/OliverJPearce/ECM2414_Software_Dev_Coursework</w:t>
+        </w:r>
+      </w:hyperlink>
+    </w:p>
+    <w:p>
+      <w:pPr>
         <w:rPr>
           <w:sz w:val="28"/>
           <w:szCs w:val="28"/>
           <w:u w:val="single"/>
         </w:rPr>
       </w:pPr>
-      <w:r>
+    </w:p>
+    <w:p>
+      <w:pPr>
         <w:rPr>
           <w:sz w:val="28"/>
           <w:szCs w:val="28"/>
           <w:u w:val="single"/>
         </w:rPr>
-        <w:t>Architecture</w:t>
-      </w:r>
+      </w:pPr>
       <w:r>
         <w:rPr>
           <w:sz w:val="28"/>
           <w:szCs w:val="28"/>
           <w:u w:val="single"/>
         </w:rPr>
-        <w:t xml:space="preserve">, </w:t>
+        <w:t>Architecture</w:t>
       </w:r>
       <w:r>
         <w:rPr>
@@ -78,7 +114,7 @@
           <w:szCs w:val="28"/>
           <w:u w:val="single"/>
         </w:rPr>
-        <w:t>Key Object Oriented</w:t>
+        <w:t xml:space="preserve">, </w:t>
       </w:r>
       <w:r>
         <w:rPr>
@@ -86,7 +122,7 @@
           <w:szCs w:val="28"/>
           <w:u w:val="single"/>
         </w:rPr>
-        <w:t xml:space="preserve"> and Concurrency </w:t>
+        <w:t>Key Object Oriented</w:t>
       </w:r>
       <w:r>
         <w:rPr>
@@ -94,6 +130,14 @@
           <w:szCs w:val="28"/>
           <w:u w:val="single"/>
         </w:rPr>
+        <w:t xml:space="preserve"> and Concurrency </w:t>
+      </w:r>
+      <w:r>
+        <w:rPr>
+          <w:sz w:val="28"/>
+          <w:szCs w:val="28"/>
+          <w:u w:val="single"/>
+        </w:rPr>
         <w:t>Decisions</w:t>
       </w:r>
     </w:p>
@@ -114,6 +158,7 @@
           <w:szCs w:val="22"/>
         </w:rPr>
       </w:pPr>
+      <w:proofErr w:type="spellStart"/>
       <w:r>
         <w:rPr>
           <w:b/>
@@ -121,7 +166,17 @@
           <w:sz w:val="22"/>
           <w:szCs w:val="22"/>
         </w:rPr>
-        <w:t>CardGame Class</w:t>
+        <w:t>CardGame</w:t>
+      </w:r>
+      <w:proofErr w:type="spellEnd"/>
+      <w:r>
+        <w:rPr>
+          <w:b/>
+          <w:bCs/>
+          <w:sz w:val="22"/>
+          <w:szCs w:val="22"/>
+        </w:rPr>
+        <w:t xml:space="preserve"> Class</w:t>
       </w:r>
     </w:p>
     <w:p>
@@ -136,7 +191,23 @@
           <w:sz w:val="22"/>
           <w:szCs w:val="22"/>
         </w:rPr>
-        <w:t xml:space="preserve">The CardGame class acts as the </w:t>
+        <w:t xml:space="preserve">The </w:t>
+      </w:r>
+      <w:proofErr w:type="spellStart"/>
+      <w:r>
+        <w:rPr>
+          <w:sz w:val="22"/>
+          <w:szCs w:val="22"/>
+        </w:rPr>
+        <w:t>CardGame</w:t>
+      </w:r>
+      <w:proofErr w:type="spellEnd"/>
+      <w:r>
+        <w:rPr>
+          <w:sz w:val="22"/>
+          <w:szCs w:val="22"/>
+        </w:rPr>
+        <w:t xml:space="preserve"> class acts as the </w:t>
       </w:r>
       <w:r>
         <w:rPr>
@@ -213,14 +284,46 @@
           <w:sz w:val="22"/>
           <w:szCs w:val="22"/>
         </w:rPr>
-        <w:t xml:space="preserve"> Once a player wins, it alerts the CardGame class of this which then takes the responsibility of alerting and stopping all the other player threads</w:t>
-      </w:r>
-      <w:r>
-        <w:rPr>
-          <w:sz w:val="22"/>
-          <w:szCs w:val="22"/>
-        </w:rPr>
-        <w:t xml:space="preserve"> as well as telling the CardDecks that the game has ended.</w:t>
+        <w:t xml:space="preserve"> Once a player wins, it alerts the </w:t>
+      </w:r>
+      <w:proofErr w:type="spellStart"/>
+      <w:r>
+        <w:rPr>
+          <w:sz w:val="22"/>
+          <w:szCs w:val="22"/>
+        </w:rPr>
+        <w:t>CardGame</w:t>
+      </w:r>
+      <w:proofErr w:type="spellEnd"/>
+      <w:r>
+        <w:rPr>
+          <w:sz w:val="22"/>
+          <w:szCs w:val="22"/>
+        </w:rPr>
+        <w:t xml:space="preserve"> class of this which then takes the responsibility of alerting and stopping all the other player threads</w:t>
+      </w:r>
+      <w:r>
+        <w:rPr>
+          <w:sz w:val="22"/>
+          <w:szCs w:val="22"/>
+        </w:rPr>
+        <w:t xml:space="preserve"> as well as telling the </w:t>
+      </w:r>
+      <w:proofErr w:type="spellStart"/>
+      <w:r>
+        <w:rPr>
+          <w:sz w:val="22"/>
+          <w:szCs w:val="22"/>
+        </w:rPr>
+        <w:t>CardDecks</w:t>
+      </w:r>
+      <w:proofErr w:type="spellEnd"/>
+      <w:r>
+        <w:rPr>
+          <w:sz w:val="22"/>
+          <w:szCs w:val="22"/>
+        </w:rPr>
+        <w:t xml:space="preserve"> that the game has ended.</w:t>
       </w:r>
     </w:p>
     <w:p>
@@ -283,14 +386,46 @@
           <w:sz w:val="22"/>
           <w:szCs w:val="22"/>
         </w:rPr>
-        <w:t xml:space="preserve">once CardGame creates an instance of it and starts its thread the player </w:t>
-      </w:r>
-      <w:r>
-        <w:rPr>
-          <w:sz w:val="22"/>
-          <w:szCs w:val="22"/>
-        </w:rPr>
-        <w:t xml:space="preserve">plays the game until CardGame eventually alerts it that the game is over. </w:t>
+        <w:t xml:space="preserve">once </w:t>
+      </w:r>
+      <w:proofErr w:type="spellStart"/>
+      <w:r>
+        <w:rPr>
+          <w:sz w:val="22"/>
+          <w:szCs w:val="22"/>
+        </w:rPr>
+        <w:t>CardGame</w:t>
+      </w:r>
+      <w:proofErr w:type="spellEnd"/>
+      <w:r>
+        <w:rPr>
+          <w:sz w:val="22"/>
+          <w:szCs w:val="22"/>
+        </w:rPr>
+        <w:t xml:space="preserve"> creates an instance of it and starts its thread the player </w:t>
+      </w:r>
+      <w:r>
+        <w:rPr>
+          <w:sz w:val="22"/>
+          <w:szCs w:val="22"/>
+        </w:rPr>
+        <w:t xml:space="preserve">plays the game until </w:t>
+      </w:r>
+      <w:proofErr w:type="spellStart"/>
+      <w:r>
+        <w:rPr>
+          <w:sz w:val="22"/>
+          <w:szCs w:val="22"/>
+        </w:rPr>
+        <w:t>CardGame</w:t>
+      </w:r>
+      <w:proofErr w:type="spellEnd"/>
+      <w:r>
+        <w:rPr>
+          <w:sz w:val="22"/>
+          <w:szCs w:val="22"/>
+        </w:rPr>
+        <w:t xml:space="preserve"> eventually alerts it that the game is over. </w:t>
       </w:r>
       <w:r>
         <w:rPr>
@@ -320,12 +455,21 @@
         </w:rPr>
         <w:t xml:space="preserve"> </w:t>
       </w:r>
-      <w:r>
-        <w:rPr>
-          <w:sz w:val="22"/>
-          <w:szCs w:val="22"/>
-        </w:rPr>
-        <w:t xml:space="preserve">CardDeck class) </w:t>
+      <w:proofErr w:type="spellStart"/>
+      <w:r>
+        <w:rPr>
+          <w:sz w:val="22"/>
+          <w:szCs w:val="22"/>
+        </w:rPr>
+        <w:t>CardDeck</w:t>
+      </w:r>
+      <w:proofErr w:type="spellEnd"/>
+      <w:r>
+        <w:rPr>
+          <w:sz w:val="22"/>
+          <w:szCs w:val="22"/>
+        </w:rPr>
+        <w:t xml:space="preserve"> class) </w:t>
       </w:r>
       <w:r>
         <w:rPr>
@@ -415,6 +559,7 @@
           <w:szCs w:val="22"/>
         </w:rPr>
       </w:pPr>
+      <w:proofErr w:type="spellStart"/>
       <w:r>
         <w:rPr>
           <w:b/>
@@ -422,7 +567,17 @@
           <w:sz w:val="22"/>
           <w:szCs w:val="22"/>
         </w:rPr>
-        <w:t>CardDeck Class</w:t>
+        <w:t>CardDeck</w:t>
+      </w:r>
+      <w:proofErr w:type="spellEnd"/>
+      <w:r>
+        <w:rPr>
+          <w:b/>
+          <w:bCs/>
+          <w:sz w:val="22"/>
+          <w:szCs w:val="22"/>
+        </w:rPr>
+        <w:t xml:space="preserve"> Class</w:t>
       </w:r>
     </w:p>
     <w:p>
@@ -437,7 +592,23 @@
           <w:sz w:val="22"/>
           <w:szCs w:val="22"/>
         </w:rPr>
-        <w:t>The CardDeck class acts as a non-threaded barrier between players by accepting cards from the previous</w:t>
+        <w:t xml:space="preserve">The </w:t>
+      </w:r>
+      <w:proofErr w:type="spellStart"/>
+      <w:r>
+        <w:rPr>
+          <w:sz w:val="22"/>
+          <w:szCs w:val="22"/>
+        </w:rPr>
+        <w:t>CardDeck</w:t>
+      </w:r>
+      <w:proofErr w:type="spellEnd"/>
+      <w:r>
+        <w:rPr>
+          <w:sz w:val="22"/>
+          <w:szCs w:val="22"/>
+        </w:rPr>
+        <w:t xml:space="preserve"> class acts as a non-threaded barrier between players by accepting cards from the previous</w:t>
       </w:r>
       <w:r>
         <w:rPr>
@@ -542,7 +713,23 @@
           <w:sz w:val="22"/>
           <w:szCs w:val="22"/>
         </w:rPr>
-        <w:t xml:space="preserve"> why we decided on having a separate non-threaded CardDeck class</w:t>
+        <w:t xml:space="preserve"> why we decided on having a separate non-threaded </w:t>
+      </w:r>
+      <w:proofErr w:type="spellStart"/>
+      <w:r>
+        <w:rPr>
+          <w:sz w:val="22"/>
+          <w:szCs w:val="22"/>
+        </w:rPr>
+        <w:t>CardDeck</w:t>
+      </w:r>
+      <w:proofErr w:type="spellEnd"/>
+      <w:r>
+        <w:rPr>
+          <w:sz w:val="22"/>
+          <w:szCs w:val="22"/>
+        </w:rPr>
+        <w:t xml:space="preserve"> class</w:t>
       </w:r>
       <w:r>
         <w:rPr>
@@ -612,7 +799,15 @@
           <w:sz w:val="22"/>
           <w:szCs w:val="22"/>
         </w:rPr>
-        <w:t xml:space="preserve"> making debugging and testing significantly easier.</w:t>
+        <w:t xml:space="preserve"> making </w:t>
+      </w:r>
+      <w:r>
+        <w:rPr>
+          <w:sz w:val="22"/>
+          <w:szCs w:val="22"/>
+        </w:rPr>
+        <w:lastRenderedPageBreak/>
+        <w:t>debugging and testing significantly easier.</w:t>
       </w:r>
       <w:r>
         <w:rPr>
@@ -635,6 +830,7 @@
         </w:rPr>
         <w:t xml:space="preserve"> or </w:t>
       </w:r>
+      <w:proofErr w:type="spellStart"/>
       <w:r>
         <w:rPr>
           <w:sz w:val="22"/>
@@ -656,6 +852,7 @@
         </w:rPr>
         <w:t>Integer</w:t>
       </w:r>
+      <w:proofErr w:type="spellEnd"/>
       <w:r>
         <w:rPr>
           <w:sz w:val="22"/>
@@ -705,6 +902,7 @@
         </w:rPr>
         <w:t xml:space="preserve">as while using an </w:t>
       </w:r>
+      <w:proofErr w:type="spellStart"/>
       <w:r>
         <w:rPr>
           <w:sz w:val="22"/>
@@ -719,6 +917,7 @@
         </w:rPr>
         <w:t>tomicInteger</w:t>
       </w:r>
+      <w:proofErr w:type="spellEnd"/>
       <w:r>
         <w:rPr>
           <w:sz w:val="22"/>
@@ -733,6 +932,7 @@
         </w:rPr>
         <w:t xml:space="preserve"> with less overhead when calling the </w:t>
       </w:r>
+      <w:proofErr w:type="spellStart"/>
       <w:r>
         <w:rPr>
           <w:i/>
@@ -743,6 +943,7 @@
         </w:rPr>
         <w:t>drawCard</w:t>
       </w:r>
+      <w:proofErr w:type="spellEnd"/>
       <w:r>
         <w:rPr>
           <w:sz w:val="22"/>
@@ -750,6 +951,7 @@
         </w:rPr>
         <w:t xml:space="preserve"> and </w:t>
       </w:r>
+      <w:proofErr w:type="spellStart"/>
       <w:r>
         <w:rPr>
           <w:i/>
@@ -760,6 +962,7 @@
         </w:rPr>
         <w:t>addCard</w:t>
       </w:r>
+      <w:proofErr w:type="spellEnd"/>
       <w:r>
         <w:rPr>
           <w:sz w:val="22"/>
@@ -816,6 +1019,7 @@
         </w:rPr>
         <w:t xml:space="preserve"> class within the </w:t>
       </w:r>
+      <w:proofErr w:type="spellStart"/>
       <w:r>
         <w:rPr>
           <w:i/>
@@ -826,6 +1030,7 @@
         </w:rPr>
         <w:t>drawCard</w:t>
       </w:r>
+      <w:proofErr w:type="spellEnd"/>
       <w:r>
         <w:rPr>
           <w:sz w:val="22"/>
@@ -838,9 +1043,9 @@
           <w:sz w:val="22"/>
           <w:szCs w:val="22"/>
         </w:rPr>
-        <w:lastRenderedPageBreak/>
         <w:t xml:space="preserve">and </w:t>
       </w:r>
+      <w:proofErr w:type="spellStart"/>
       <w:r>
         <w:rPr>
           <w:i/>
@@ -851,6 +1056,7 @@
         </w:rPr>
         <w:t>addCard</w:t>
       </w:r>
+      <w:proofErr w:type="spellEnd"/>
       <w:r>
         <w:rPr>
           <w:sz w:val="22"/>
@@ -926,7 +1132,23 @@
           <w:sz w:val="22"/>
           <w:szCs w:val="22"/>
         </w:rPr>
-        <w:t xml:space="preserve"> by the CardDeck class</w:t>
+        <w:t xml:space="preserve"> by the </w:t>
+      </w:r>
+      <w:proofErr w:type="spellStart"/>
+      <w:r>
+        <w:rPr>
+          <w:sz w:val="22"/>
+          <w:szCs w:val="22"/>
+        </w:rPr>
+        <w:t>CardDeck</w:t>
+      </w:r>
+      <w:proofErr w:type="spellEnd"/>
+      <w:r>
+        <w:rPr>
+          <w:sz w:val="22"/>
+          <w:szCs w:val="22"/>
+        </w:rPr>
+        <w:t xml:space="preserve"> class</w:t>
       </w:r>
       <w:r>
         <w:rPr>
@@ -935,6 +1157,7 @@
         </w:rPr>
         <w:t xml:space="preserve"> </w:t>
       </w:r>
+      <w:proofErr w:type="spellStart"/>
       <w:r>
         <w:rPr>
           <w:i/>
@@ -944,6 +1167,7 @@
         </w:rPr>
         <w:t>deckCards</w:t>
       </w:r>
+      <w:proofErr w:type="spellEnd"/>
       <w:r>
         <w:rPr>
           <w:sz w:val="22"/>
@@ -1333,6 +1557,7 @@
         </w:rPr>
         <w:t xml:space="preserve"> After each test the </w:t>
       </w:r>
+      <w:proofErr w:type="spellStart"/>
       <w:r>
         <w:rPr>
           <w:i/>
@@ -1343,6 +1568,7 @@
         </w:rPr>
         <w:t>clearGame</w:t>
       </w:r>
+      <w:proofErr w:type="spellEnd"/>
       <w:r>
         <w:rPr>
           <w:sz w:val="22"/>
@@ -1426,6 +1652,7 @@
           <w:szCs w:val="22"/>
         </w:rPr>
       </w:pPr>
+      <w:proofErr w:type="spellStart"/>
       <w:r>
         <w:rPr>
           <w:b/>
@@ -1433,8 +1660,9 @@
           <w:sz w:val="22"/>
           <w:szCs w:val="22"/>
         </w:rPr>
-        <w:t xml:space="preserve">CardGame Class </w:t>
-      </w:r>
+        <w:t>CardGame</w:t>
+      </w:r>
+      <w:proofErr w:type="spellEnd"/>
       <w:r>
         <w:rPr>
           <w:b/>
@@ -1442,6 +1670,15 @@
           <w:sz w:val="22"/>
           <w:szCs w:val="22"/>
         </w:rPr>
+        <w:t xml:space="preserve"> Class </w:t>
+      </w:r>
+      <w:r>
+        <w:rPr>
+          <w:b/>
+          <w:bCs/>
+          <w:sz w:val="22"/>
+          <w:szCs w:val="22"/>
+        </w:rPr>
         <w:t>Input Tests</w:t>
       </w:r>
     </w:p>
@@ -1460,6 +1697,7 @@
         </w:rPr>
         <w:t xml:space="preserve">The </w:t>
       </w:r>
+      <w:proofErr w:type="spellStart"/>
       <w:r>
         <w:rPr>
           <w:i/>
@@ -1470,6 +1708,7 @@
         </w:rPr>
         <w:t>testCardGameReadPack</w:t>
       </w:r>
+      <w:proofErr w:type="spellEnd"/>
       <w:r>
         <w:rPr>
           <w:sz w:val="22"/>
@@ -1505,6 +1744,7 @@
         </w:rPr>
         <w:t xml:space="preserve"> the behaviour of the </w:t>
       </w:r>
+      <w:proofErr w:type="spellStart"/>
       <w:r>
         <w:rPr>
           <w:i/>
@@ -1514,6 +1754,7 @@
         </w:rPr>
         <w:t>readPack</w:t>
       </w:r>
+      <w:proofErr w:type="spellEnd"/>
       <w:r>
         <w:rPr>
           <w:sz w:val="22"/>
@@ -1535,6 +1776,7 @@
         </w:rPr>
         <w:t xml:space="preserve">the </w:t>
       </w:r>
+      <w:proofErr w:type="spellStart"/>
       <w:r>
         <w:rPr>
           <w:sz w:val="22"/>
@@ -1542,6 +1784,7 @@
         </w:rPr>
         <w:t>CardGame</w:t>
       </w:r>
+      <w:proofErr w:type="spellEnd"/>
       <w:r>
         <w:rPr>
           <w:sz w:val="22"/>
@@ -1633,6 +1876,7 @@
         </w:rPr>
         <w:t xml:space="preserve">The tests for the functionality of the Player class are </w:t>
       </w:r>
+      <w:proofErr w:type="spellStart"/>
       <w:r>
         <w:rPr>
           <w:i/>
@@ -1643,6 +1887,7 @@
         </w:rPr>
         <w:t>testPlayerInitialisation</w:t>
       </w:r>
+      <w:proofErr w:type="spellEnd"/>
       <w:r>
         <w:rPr>
           <w:sz w:val="22"/>
@@ -1664,6 +1909,7 @@
         </w:rPr>
         <w:t xml:space="preserve"> </w:t>
       </w:r>
+      <w:proofErr w:type="spellStart"/>
       <w:r>
         <w:rPr>
           <w:i/>
@@ -1674,6 +1920,7 @@
         </w:rPr>
         <w:t>testDistributeCardsPlayerHands</w:t>
       </w:r>
+      <w:proofErr w:type="spellEnd"/>
       <w:r>
         <w:rPr>
           <w:i/>
@@ -1743,6 +1990,7 @@
           <w:szCs w:val="22"/>
         </w:rPr>
       </w:pPr>
+      <w:proofErr w:type="spellStart"/>
       <w:r>
         <w:rPr>
           <w:b/>
@@ -1750,8 +1998,10 @@
           <w:sz w:val="22"/>
           <w:szCs w:val="22"/>
         </w:rPr>
+        <w:lastRenderedPageBreak/>
         <w:t>CardDeck</w:t>
       </w:r>
+      <w:proofErr w:type="spellEnd"/>
       <w:r>
         <w:rPr>
           <w:b/>
@@ -1786,8 +2036,25 @@
           <w:sz w:val="22"/>
           <w:szCs w:val="22"/>
         </w:rPr>
-        <w:t xml:space="preserve">The tests for the behaviour of the CardDeck class are </w:t>
-      </w:r>
+        <w:t xml:space="preserve">The tests for the behaviour of the </w:t>
+      </w:r>
+      <w:proofErr w:type="spellStart"/>
+      <w:r>
+        <w:rPr>
+          <w:sz w:val="22"/>
+          <w:szCs w:val="22"/>
+        </w:rPr>
+        <w:t>CardDeck</w:t>
+      </w:r>
+      <w:proofErr w:type="spellEnd"/>
+      <w:r>
+        <w:rPr>
+          <w:sz w:val="22"/>
+          <w:szCs w:val="22"/>
+        </w:rPr>
+        <w:t xml:space="preserve"> class are </w:t>
+      </w:r>
+      <w:proofErr w:type="spellStart"/>
       <w:r>
         <w:rPr>
           <w:i/>
@@ -1798,6 +2065,7 @@
         </w:rPr>
         <w:t>testDeckInitialisation</w:t>
       </w:r>
+      <w:proofErr w:type="spellEnd"/>
       <w:r>
         <w:rPr>
           <w:i/>
@@ -1807,6 +2075,7 @@
         </w:rPr>
         <w:t xml:space="preserve">, </w:t>
       </w:r>
+      <w:proofErr w:type="spellStart"/>
       <w:r>
         <w:rPr>
           <w:i/>
@@ -1817,6 +2086,7 @@
         </w:rPr>
         <w:t>testDistributeCardsDeckContents</w:t>
       </w:r>
+      <w:proofErr w:type="spellEnd"/>
       <w:r>
         <w:rPr>
           <w:i/>
@@ -1826,6 +2096,7 @@
         </w:rPr>
         <w:t xml:space="preserve">, </w:t>
       </w:r>
+      <w:proofErr w:type="spellStart"/>
       <w:r>
         <w:rPr>
           <w:i/>
@@ -1836,6 +2107,7 @@
         </w:rPr>
         <w:t>testCardDeckDrawCard</w:t>
       </w:r>
+      <w:proofErr w:type="spellEnd"/>
       <w:r>
         <w:rPr>
           <w:i/>
@@ -1845,6 +2117,7 @@
         </w:rPr>
         <w:t xml:space="preserve">, </w:t>
       </w:r>
+      <w:proofErr w:type="spellStart"/>
       <w:r>
         <w:rPr>
           <w:i/>
@@ -1855,6 +2128,7 @@
         </w:rPr>
         <w:t>testCardDeckAddCard</w:t>
       </w:r>
+      <w:proofErr w:type="spellEnd"/>
       <w:r>
         <w:rPr>
           <w:i/>
@@ -1864,6 +2138,7 @@
         </w:rPr>
         <w:t xml:space="preserve">, </w:t>
       </w:r>
+      <w:proofErr w:type="spellStart"/>
       <w:r>
         <w:rPr>
           <w:i/>
@@ -1894,6 +2169,7 @@
         </w:rPr>
         <w:t>g</w:t>
       </w:r>
+      <w:proofErr w:type="spellEnd"/>
       <w:r>
         <w:rPr>
           <w:sz w:val="22"/>
@@ -1934,15 +2210,7 @@
           <w:sz w:val="22"/>
           <w:szCs w:val="22"/>
         </w:rPr>
-        <w:t xml:space="preserve">deck card distribution </w:t>
-      </w:r>
-      <w:r>
-        <w:rPr>
-          <w:sz w:val="22"/>
-          <w:szCs w:val="22"/>
-        </w:rPr>
-        <w:lastRenderedPageBreak/>
-        <w:t>(once again in the expected round</w:t>
+        <w:t>deck card distribution (once again in the expected round</w:t>
       </w:r>
       <w:r>
         <w:rPr>
@@ -2079,6 +2347,7 @@
         </w:rPr>
         <w:t xml:space="preserve">The system wide tests are </w:t>
       </w:r>
+      <w:proofErr w:type="spellStart"/>
       <w:r>
         <w:rPr>
           <w:i/>
@@ -2089,6 +2358,7 @@
         </w:rPr>
         <w:t>testWinningPlayerEndingHand</w:t>
       </w:r>
+      <w:proofErr w:type="spellEnd"/>
       <w:r>
         <w:rPr>
           <w:i/>
@@ -2098,6 +2368,7 @@
         </w:rPr>
         <w:t xml:space="preserve">, </w:t>
       </w:r>
+      <w:proofErr w:type="spellStart"/>
       <w:r>
         <w:rPr>
           <w:i/>
@@ -2108,6 +2379,7 @@
         </w:rPr>
         <w:t>testCardStability</w:t>
       </w:r>
+      <w:proofErr w:type="spellEnd"/>
       <w:r>
         <w:rPr>
           <w:i/>
@@ -2117,6 +2389,7 @@
         </w:rPr>
         <w:t xml:space="preserve">, </w:t>
       </w:r>
+      <w:proofErr w:type="spellStart"/>
       <w:r>
         <w:rPr>
           <w:i/>
@@ -2127,6 +2400,7 @@
         </w:rPr>
         <w:t>testPlayerThreadsTerminate</w:t>
       </w:r>
+      <w:proofErr w:type="spellEnd"/>
       <w:r>
         <w:rPr>
           <w:i/>
@@ -2136,6 +2410,7 @@
         </w:rPr>
         <w:t xml:space="preserve">, </w:t>
       </w:r>
+      <w:proofErr w:type="spellStart"/>
       <w:r>
         <w:rPr>
           <w:i/>
@@ -2146,6 +2421,7 @@
         </w:rPr>
         <w:t>testPlayerOutputFileContents</w:t>
       </w:r>
+      <w:proofErr w:type="spellEnd"/>
       <w:r>
         <w:rPr>
           <w:sz w:val="22"/>
@@ -2167,6 +2443,7 @@
         </w:rPr>
         <w:t xml:space="preserve"> </w:t>
       </w:r>
+      <w:proofErr w:type="spellStart"/>
       <w:r>
         <w:rPr>
           <w:i/>
@@ -2177,6 +2454,7 @@
         </w:rPr>
         <w:t>testPlayerDiscardDenomination</w:t>
       </w:r>
+      <w:proofErr w:type="spellEnd"/>
       <w:r>
         <w:rPr>
           <w:sz w:val="22"/>
@@ -2252,7 +2530,28 @@
           <w:sz w:val="22"/>
           <w:szCs w:val="22"/>
         </w:rPr>
-        <w:t xml:space="preserve">whether the total number of cards in play has remained constant (e.g. no cards have been duplicated or lost during the game), </w:t>
+        <w:t>whether the total number of cards in play has remained constant (e.g. no cards have been duplicated or lost during the game)</w:t>
+      </w:r>
+      <w:r>
+        <w:rPr>
+          <w:sz w:val="22"/>
+          <w:szCs w:val="22"/>
+        </w:rPr>
+        <w:t xml:space="preserve"> and that those card’s values have not changed</w:t>
+      </w:r>
+      <w:r>
+        <w:rPr>
+          <w:sz w:val="22"/>
+          <w:szCs w:val="22"/>
+        </w:rPr>
+        <w:t xml:space="preserve"> either</w:t>
+      </w:r>
+      <w:r>
+        <w:rPr>
+          <w:sz w:val="22"/>
+          <w:szCs w:val="22"/>
+        </w:rPr>
+        <w:t xml:space="preserve">, </w:t>
       </w:r>
       <w:r>
         <w:rPr>
@@ -2368,7 +2667,39 @@
           <w:sz w:val="22"/>
           <w:szCs w:val="22"/>
         </w:rPr>
-        <w:t xml:space="preserve"> the CardGame, CardDeck, Player and Card </w:t>
+        <w:t xml:space="preserve"> the </w:t>
+      </w:r>
+      <w:proofErr w:type="spellStart"/>
+      <w:r>
+        <w:rPr>
+          <w:sz w:val="22"/>
+          <w:szCs w:val="22"/>
+        </w:rPr>
+        <w:t>CardGame</w:t>
+      </w:r>
+      <w:proofErr w:type="spellEnd"/>
+      <w:r>
+        <w:rPr>
+          <w:sz w:val="22"/>
+          <w:szCs w:val="22"/>
+        </w:rPr>
+        <w:t xml:space="preserve">, </w:t>
+      </w:r>
+      <w:proofErr w:type="spellStart"/>
+      <w:r>
+        <w:rPr>
+          <w:sz w:val="22"/>
+          <w:szCs w:val="22"/>
+        </w:rPr>
+        <w:t>CardDeck</w:t>
+      </w:r>
+      <w:proofErr w:type="spellEnd"/>
+      <w:r>
+        <w:rPr>
+          <w:sz w:val="22"/>
+          <w:szCs w:val="22"/>
+        </w:rPr>
+        <w:t xml:space="preserve">, Player and Card </w:t>
       </w:r>
       <w:r>
         <w:rPr>
@@ -2868,7 +3199,39 @@
           <w:sz w:val="22"/>
           <w:szCs w:val="22"/>
         </w:rPr>
-        <w:t>planning for the CardGame, CardDeck, Card and Player classes</w:t>
+        <w:t xml:space="preserve">planning for the </w:t>
+      </w:r>
+      <w:proofErr w:type="spellStart"/>
+      <w:r>
+        <w:rPr>
+          <w:sz w:val="22"/>
+          <w:szCs w:val="22"/>
+        </w:rPr>
+        <w:t>CardGame</w:t>
+      </w:r>
+      <w:proofErr w:type="spellEnd"/>
+      <w:r>
+        <w:rPr>
+          <w:sz w:val="22"/>
+          <w:szCs w:val="22"/>
+        </w:rPr>
+        <w:t xml:space="preserve">, </w:t>
+      </w:r>
+      <w:proofErr w:type="spellStart"/>
+      <w:r>
+        <w:rPr>
+          <w:sz w:val="22"/>
+          <w:szCs w:val="22"/>
+        </w:rPr>
+        <w:t>CardDeck</w:t>
+      </w:r>
+      <w:proofErr w:type="spellEnd"/>
+      <w:r>
+        <w:rPr>
+          <w:sz w:val="22"/>
+          <w:szCs w:val="22"/>
+        </w:rPr>
+        <w:t>, Card and Player classes</w:t>
       </w:r>
       <w:r>
         <w:rPr>
@@ -3202,8 +3565,17 @@
           <w:sz w:val="22"/>
           <w:szCs w:val="22"/>
         </w:rPr>
-        <w:t xml:space="preserve"> CardDeck</w:t>
-      </w:r>
+        <w:t xml:space="preserve"> </w:t>
+      </w:r>
+      <w:proofErr w:type="spellStart"/>
+      <w:r>
+        <w:rPr>
+          <w:sz w:val="22"/>
+          <w:szCs w:val="22"/>
+        </w:rPr>
+        <w:t>CardDeck</w:t>
+      </w:r>
+      <w:proofErr w:type="spellEnd"/>
       <w:r>
         <w:rPr>
           <w:sz w:val="22"/>
@@ -3582,8 +3954,17 @@
           <w:sz w:val="22"/>
           <w:szCs w:val="22"/>
         </w:rPr>
-        <w:t>: Added foundations of Player class turn logic and CardDeck</w:t>
-      </w:r>
+        <w:t xml:space="preserve">: Added foundations of Player class turn logic and </w:t>
+      </w:r>
+      <w:proofErr w:type="spellStart"/>
+      <w:r>
+        <w:rPr>
+          <w:sz w:val="22"/>
+          <w:szCs w:val="22"/>
+        </w:rPr>
+        <w:t>CardDeck</w:t>
+      </w:r>
+      <w:proofErr w:type="spellEnd"/>
       <w:r>
         <w:rPr>
           <w:sz w:val="22"/>
@@ -3687,6 +4068,7 @@
         </w:rPr>
         <w:t xml:space="preserve">the </w:t>
       </w:r>
+      <w:proofErr w:type="spellStart"/>
       <w:r>
         <w:rPr>
           <w:i/>
@@ -3696,6 +4078,7 @@
         </w:rPr>
         <w:t>drawCard</w:t>
       </w:r>
+      <w:proofErr w:type="spellEnd"/>
       <w:r>
         <w:rPr>
           <w:sz w:val="22"/>
@@ -3703,6 +4086,7 @@
         </w:rPr>
         <w:t xml:space="preserve"> and </w:t>
       </w:r>
+      <w:proofErr w:type="spellStart"/>
       <w:r>
         <w:rPr>
           <w:i/>
@@ -3712,6 +4096,7 @@
         </w:rPr>
         <w:t>addCard</w:t>
       </w:r>
+      <w:proofErr w:type="spellEnd"/>
       <w:r>
         <w:rPr>
           <w:sz w:val="22"/>
@@ -3974,6 +4359,7 @@
         </w:rPr>
         <w:t xml:space="preserve"> and </w:t>
       </w:r>
+      <w:proofErr w:type="spellStart"/>
       <w:r>
         <w:rPr>
           <w:sz w:val="22"/>
@@ -3981,6 +4367,7 @@
         </w:rPr>
         <w:t>CardDeck</w:t>
       </w:r>
+      <w:proofErr w:type="spellEnd"/>
       <w:r>
         <w:rPr>
           <w:sz w:val="22"/>
@@ -5326,6 +5713,7 @@
   <w:style w:type="character" w:default="1" w:styleId="DefaultParagraphFont">
     <w:name w:val="Default Paragraph Font"/>
     <w:uiPriority w:val="1"/>
+    <w:semiHidden/>
     <w:unhideWhenUsed/>
   </w:style>
   <w:style w:type="table" w:default="1" w:styleId="TableNormal">
@@ -5639,6 +6027,29 @@
       <w:spacing w:val="5"/>
     </w:rPr>
   </w:style>
+  <w:style w:type="character" w:styleId="Hyperlink">
+    <w:name w:val="Hyperlink"/>
+    <w:basedOn w:val="DefaultParagraphFont"/>
+    <w:uiPriority w:val="99"/>
+    <w:unhideWhenUsed/>
+    <w:rsid w:val="00FF7A99"/>
+    <w:rPr>
+      <w:color w:val="467886" w:themeColor="hyperlink"/>
+      <w:u w:val="single"/>
+    </w:rPr>
+  </w:style>
+  <w:style w:type="character" w:styleId="UnresolvedMention">
+    <w:name w:val="Unresolved Mention"/>
+    <w:basedOn w:val="DefaultParagraphFont"/>
+    <w:uiPriority w:val="99"/>
+    <w:semiHidden/>
+    <w:unhideWhenUsed/>
+    <w:rsid w:val="00FF7A99"/>
+    <w:rPr>
+      <w:color w:val="605E5C"/>
+      <w:shd w:val="clear" w:color="auto" w:fill="E1DFDD"/>
+    </w:rPr>
+  </w:style>
 </w:styles>
 </file>
 

</xml_diff>